<commit_message>
Fix feature-importance labels on Spark 4; show actual Spark version
Spark 4 orders the VectorAssembler attribute groups differently (binary
before numeric), so names were attached to the wrong importances.
Sort all attributes by vector index and assert the alignment. Report and
deck now take the Spark version from the run instead of hard-coding 3.5.

Co-Authored-By: Claude Opus 5.5 <noreply@anthropic.com>
Claude-Session: https://claude.ai/code/session_013cmZjtFTpWtFMxYtK982h3
</commit_message>
<xml_diff>
--- a/bdmla-flight-delay/report/BDMLA_CW2_Part2_Flight_Delay_Report.docx
+++ b/bdmla-flight-delay/report/BDMLA_CW2_Part2_Flight_Delay_Report.docx
@@ -169,7 +169,20 @@
         <w:rPr>
           <w:rFonts w:ascii="Calibri" w:cs="Calibri" w:eastAsia="Calibri" w:hAnsi="Calibri"/>
         </w:rPr>
-        <w:t xml:space="preserve"> BDMLA_Flight_Delay_Spark.ipynb (Google Colab, PySpark 3.5), submitted in the accompanying .zip file</w:t>
+        <w:t xml:space="preserve"> BDMLA_Flight_Delay_Spark.ipynb (Google Colab, PySpark </w:t>
+      </w:r>
+      <w:r>
+        <w:rPr>
+          <w:rFonts w:ascii="Calibri" w:cs="Calibri" w:eastAsia="Calibri" w:hAnsi="Calibri"/>
+          <w:highlight w:val="yellow"/>
+        </w:rPr>
+        <w:t xml:space="preserve">[SPARK_VERSION]</w:t>
+      </w:r>
+      <w:r>
+        <w:rPr>
+          <w:rFonts w:ascii="Calibri" w:cs="Calibri" w:eastAsia="Calibri" w:hAnsi="Calibri"/>
+        </w:rPr>
+        <w:t xml:space="preserve">), submitted in the accompanying .zip file</w:t>
       </w:r>
     </w:p>
     <w:p>
@@ -2216,7 +2229,20 @@
         <w:rPr>
           <w:rFonts w:ascii="Calibri" w:cs="Calibri" w:eastAsia="Calibri" w:hAnsi="Calibri"/>
         </w:rPr>
-        <w:t xml:space="preserve">Figure 4 shows the pipeline. Everything runs in Google Colab with PySpark 3.5, using the DataFrame/Spark SQL API for data processing and Spark MLlib for modelling.</w:t>
+        <w:t xml:space="preserve">Figure 4 shows the pipeline. Everything runs in Google Colab with PySpark </w:t>
+      </w:r>
+      <w:r>
+        <w:rPr>
+          <w:rFonts w:ascii="Calibri" w:cs="Calibri" w:eastAsia="Calibri" w:hAnsi="Calibri"/>
+          <w:highlight w:val="yellow"/>
+        </w:rPr>
+        <w:t xml:space="preserve">[SPARK_VERSION]</w:t>
+      </w:r>
+      <w:r>
+        <w:rPr>
+          <w:rFonts w:ascii="Calibri" w:cs="Calibri" w:eastAsia="Calibri" w:hAnsi="Calibri"/>
+        </w:rPr>
+        <w:t xml:space="preserve">, using the DataFrame/Spark SQL API for data processing and Spark MLlib for modelling.</w:t>
       </w:r>
     </w:p>
     <w:p>
@@ -7308,7 +7334,7 @@
                 <w:sz w:val="18"/>
                 <w:szCs w:val="18"/>
               </w:rPr>
-              <w:t xml:space="preserve">Environment (Java 17, PySpark 3.5), Drive mount, configuration, SparkSession tuning</w:t>
+              <w:t xml:space="preserve">Environment (Java, PySpark), Drive mount, configuration, SparkSession tuning</w:t>
             </w:r>
           </w:p>
         </w:tc>

</xml_diff>

<commit_message>
Add resume mode and save results incrementally
- RUN_BASELINE_MODELS / TUNED_PARAMS_OVERRIDE / CV_SCORES_OVERRIDE let a
  run reuse tuned parameters from an earlier CrossValidator run instead
  of repeating ~1 h of tuning on free Colab
- model results and CV grid are written after every model
- temporal hold-out now runs after the export and appends its values to
  report_placeholders.json, so a late disconnect can't lose the main results
- report: CV PR-AUC column in the tuning table

Co-Authored-By: Claude Opus 5.5 <noreply@anthropic.com>
Claude-Session: https://claude.ai/code/session_013cmZjtFTpWtFMxYtK982h3
</commit_message>
<xml_diff>
--- a/bdmla-flight-delay/report/BDMLA_CW2_Part2_Flight_Delay_Report.docx
+++ b/bdmla-flight-delay/report/BDMLA_CW2_Part2_Flight_Delay_Report.docx
@@ -3231,9 +3231,10 @@
         </w:tblBorders>
       </w:tblPr>
       <w:tblGrid>
-        <w:gridCol w:w="2300"/>
-        <w:gridCol w:w="4100"/>
-        <w:gridCol w:w="2500"/>
+        <w:gridCol w:w="2100"/>
+        <w:gridCol w:w="3700"/>
+        <w:gridCol w:w="2000"/>
+        <w:gridCol w:w="1100"/>
       </w:tblGrid>
       <w:tr>
         <w:trPr>
@@ -3242,7 +3243,7 @@
         </w:trPr>
         <w:tc>
           <w:tcPr>
-            <w:tcW w:type="dxa" w:w="2300"/>
+            <w:tcW w:type="dxa" w:w="2100"/>
             <w:tcBorders>
               <w:top w:val="single" w:color="BFBFBF" w:sz="4"/>
               <w:left w:val="single" w:color="BFBFBF" w:sz="4"/>
@@ -3277,7 +3278,7 @@
         </w:tc>
         <w:tc>
           <w:tcPr>
-            <w:tcW w:type="dxa" w:w="4100"/>
+            <w:tcW w:type="dxa" w:w="3700"/>
             <w:tcBorders>
               <w:top w:val="single" w:color="BFBFBF" w:sz="4"/>
               <w:left w:val="single" w:color="BFBFBF" w:sz="4"/>
@@ -3312,7 +3313,7 @@
         </w:tc>
         <w:tc>
           <w:tcPr>
-            <w:tcW w:type="dxa" w:w="2500"/>
+            <w:tcW w:type="dxa" w:w="2000"/>
             <w:tcBorders>
               <w:top w:val="single" w:color="BFBFBF" w:sz="4"/>
               <w:left w:val="single" w:color="BFBFBF" w:sz="4"/>
@@ -3342,6 +3343,41 @@
                 <w:szCs w:val="18"/>
               </w:rPr>
               <w:t xml:space="preserve">Selected</w:t>
+            </w:r>
+          </w:p>
+        </w:tc>
+        <w:tc>
+          <w:tcPr>
+            <w:tcW w:type="dxa" w:w="1100"/>
+            <w:tcBorders>
+              <w:top w:val="single" w:color="BFBFBF" w:sz="4"/>
+              <w:left w:val="single" w:color="BFBFBF" w:sz="4"/>
+              <w:bottom w:val="single" w:color="BFBFBF" w:sz="4"/>
+              <w:right w:val="single" w:color="BFBFBF" w:sz="4"/>
+            </w:tcBorders>
+            <w:shd w:fill="DCE6F2" w:color="auto" w:val="clear"/>
+            <w:tcMar>
+              <w:top w:type="dxa" w:w="60"/>
+              <w:left w:type="dxa" w:w="100"/>
+              <w:bottom w:type="dxa" w:w="60"/>
+              <w:right w:type="dxa" w:w="100"/>
+            </w:tcMar>
+          </w:tcPr>
+          <w:p>
+            <w:pPr>
+              <w:keepNext/>
+              <w:keepLines/>
+              <w:jc w:val="left"/>
+            </w:pPr>
+            <w:r>
+              <w:rPr>
+                <w:rFonts w:ascii="Calibri" w:cs="Calibri" w:eastAsia="Calibri" w:hAnsi="Calibri"/>
+                <w:b/>
+                <w:bCs/>
+                <w:sz w:val="18"/>
+                <w:szCs w:val="18"/>
+              </w:rPr>
+              <w:t xml:space="preserve">CV PR-AUC</w:t>
             </w:r>
           </w:p>
         </w:tc>
@@ -3352,7 +3388,7 @@
         </w:trPr>
         <w:tc>
           <w:tcPr>
-            <w:tcW w:type="dxa" w:w="2300"/>
+            <w:tcW w:type="dxa" w:w="2100"/>
             <w:tcBorders>
               <w:top w:val="single" w:color="BFBFBF" w:sz="4"/>
               <w:left w:val="single" w:color="BFBFBF" w:sz="4"/>
@@ -3386,7 +3422,7 @@
         </w:tc>
         <w:tc>
           <w:tcPr>
-            <w:tcW w:type="dxa" w:w="4100"/>
+            <w:tcW w:type="dxa" w:w="3700"/>
             <w:tcBorders>
               <w:top w:val="single" w:color="BFBFBF" w:sz="4"/>
               <w:left w:val="single" w:color="BFBFBF" w:sz="4"/>
@@ -3420,7 +3456,7 @@
         </w:tc>
         <w:tc>
           <w:tcPr>
-            <w:tcW w:type="dxa" w:w="2500"/>
+            <w:tcW w:type="dxa" w:w="2000"/>
             <w:tcBorders>
               <w:top w:val="single" w:color="BFBFBF" w:sz="4"/>
               <w:left w:val="single" w:color="BFBFBF" w:sz="4"/>
@@ -3450,6 +3486,41 @@
                 <w:highlight w:val="yellow"/>
               </w:rPr>
               <w:t xml:space="preserve">[LR_TUNED_PARAMS]</w:t>
+            </w:r>
+          </w:p>
+        </w:tc>
+        <w:tc>
+          <w:tcPr>
+            <w:tcW w:type="dxa" w:w="1100"/>
+            <w:tcBorders>
+              <w:top w:val="single" w:color="BFBFBF" w:sz="4"/>
+              <w:left w:val="single" w:color="BFBFBF" w:sz="4"/>
+              <w:bottom w:val="single" w:color="BFBFBF" w:sz="4"/>
+              <w:right w:val="single" w:color="BFBFBF" w:sz="4"/>
+            </w:tcBorders>
+            <w:tcMar>
+              <w:top w:type="dxa" w:w="60"/>
+              <w:left w:type="dxa" w:w="100"/>
+              <w:bottom w:type="dxa" w:w="60"/>
+              <w:right w:type="dxa" w:w="100"/>
+            </w:tcMar>
+          </w:tcPr>
+          <w:p>
+            <w:pPr>
+              <w:keepNext/>
+              <w:keepLines/>
+              <w:jc w:val="left"/>
+            </w:pPr>
+            <w:r>
+              <w:rPr>
+                <w:rFonts w:ascii="Calibri" w:cs="Calibri" w:eastAsia="Calibri" w:hAnsi="Calibri"/>
+                <w:b w:val="false"/>
+                <w:bCs w:val="false"/>
+                <w:sz w:val="18"/>
+                <w:szCs w:val="18"/>
+                <w:highlight w:val="yellow"/>
+              </w:rPr>
+              <w:t xml:space="preserve">[LR_CV_PR_AUC]</w:t>
             </w:r>
           </w:p>
         </w:tc>
@@ -3460,7 +3531,7 @@
         </w:trPr>
         <w:tc>
           <w:tcPr>
-            <w:tcW w:type="dxa" w:w="2300"/>
+            <w:tcW w:type="dxa" w:w="2100"/>
             <w:tcBorders>
               <w:top w:val="single" w:color="BFBFBF" w:sz="4"/>
               <w:left w:val="single" w:color="BFBFBF" w:sz="4"/>
@@ -3494,7 +3565,7 @@
         </w:tc>
         <w:tc>
           <w:tcPr>
-            <w:tcW w:type="dxa" w:w="4100"/>
+            <w:tcW w:type="dxa" w:w="3700"/>
             <w:tcBorders>
               <w:top w:val="single" w:color="BFBFBF" w:sz="4"/>
               <w:left w:val="single" w:color="BFBFBF" w:sz="4"/>
@@ -3528,7 +3599,7 @@
         </w:tc>
         <w:tc>
           <w:tcPr>
-            <w:tcW w:type="dxa" w:w="2500"/>
+            <w:tcW w:type="dxa" w:w="2000"/>
             <w:tcBorders>
               <w:top w:val="single" w:color="BFBFBF" w:sz="4"/>
               <w:left w:val="single" w:color="BFBFBF" w:sz="4"/>
@@ -3558,6 +3629,41 @@
                 <w:highlight w:val="yellow"/>
               </w:rPr>
               <w:t xml:space="preserve">[RF_TUNED_PARAMS]</w:t>
+            </w:r>
+          </w:p>
+        </w:tc>
+        <w:tc>
+          <w:tcPr>
+            <w:tcW w:type="dxa" w:w="1100"/>
+            <w:tcBorders>
+              <w:top w:val="single" w:color="BFBFBF" w:sz="4"/>
+              <w:left w:val="single" w:color="BFBFBF" w:sz="4"/>
+              <w:bottom w:val="single" w:color="BFBFBF" w:sz="4"/>
+              <w:right w:val="single" w:color="BFBFBF" w:sz="4"/>
+            </w:tcBorders>
+            <w:tcMar>
+              <w:top w:type="dxa" w:w="60"/>
+              <w:left w:type="dxa" w:w="100"/>
+              <w:bottom w:type="dxa" w:w="60"/>
+              <w:right w:type="dxa" w:w="100"/>
+            </w:tcMar>
+          </w:tcPr>
+          <w:p>
+            <w:pPr>
+              <w:keepNext/>
+              <w:keepLines/>
+              <w:jc w:val="left"/>
+            </w:pPr>
+            <w:r>
+              <w:rPr>
+                <w:rFonts w:ascii="Calibri" w:cs="Calibri" w:eastAsia="Calibri" w:hAnsi="Calibri"/>
+                <w:b w:val="false"/>
+                <w:bCs w:val="false"/>
+                <w:sz w:val="18"/>
+                <w:szCs w:val="18"/>
+                <w:highlight w:val="yellow"/>
+              </w:rPr>
+              <w:t xml:space="preserve">[RF_CV_PR_AUC]</w:t>
             </w:r>
           </w:p>
         </w:tc>
@@ -3568,7 +3674,7 @@
         </w:trPr>
         <w:tc>
           <w:tcPr>
-            <w:tcW w:type="dxa" w:w="2300"/>
+            <w:tcW w:type="dxa" w:w="2100"/>
             <w:tcBorders>
               <w:top w:val="single" w:color="BFBFBF" w:sz="4"/>
               <w:left w:val="single" w:color="BFBFBF" w:sz="4"/>
@@ -3602,7 +3708,7 @@
         </w:tc>
         <w:tc>
           <w:tcPr>
-            <w:tcW w:type="dxa" w:w="4100"/>
+            <w:tcW w:type="dxa" w:w="3700"/>
             <w:tcBorders>
               <w:top w:val="single" w:color="BFBFBF" w:sz="4"/>
               <w:left w:val="single" w:color="BFBFBF" w:sz="4"/>
@@ -3636,7 +3742,7 @@
         </w:tc>
         <w:tc>
           <w:tcPr>
-            <w:tcW w:type="dxa" w:w="2500"/>
+            <w:tcW w:type="dxa" w:w="2000"/>
             <w:tcBorders>
               <w:top w:val="single" w:color="BFBFBF" w:sz="4"/>
               <w:left w:val="single" w:color="BFBFBF" w:sz="4"/>
@@ -3666,6 +3772,41 @@
                 <w:highlight w:val="yellow"/>
               </w:rPr>
               <w:t xml:space="preserve">[GBT_TUNED_PARAMS]</w:t>
+            </w:r>
+          </w:p>
+        </w:tc>
+        <w:tc>
+          <w:tcPr>
+            <w:tcW w:type="dxa" w:w="1100"/>
+            <w:tcBorders>
+              <w:top w:val="single" w:color="BFBFBF" w:sz="4"/>
+              <w:left w:val="single" w:color="BFBFBF" w:sz="4"/>
+              <w:bottom w:val="single" w:color="BFBFBF" w:sz="4"/>
+              <w:right w:val="single" w:color="BFBFBF" w:sz="4"/>
+            </w:tcBorders>
+            <w:tcMar>
+              <w:top w:type="dxa" w:w="60"/>
+              <w:left w:type="dxa" w:w="100"/>
+              <w:bottom w:type="dxa" w:w="60"/>
+              <w:right w:type="dxa" w:w="100"/>
+            </w:tcMar>
+          </w:tcPr>
+          <w:p>
+            <w:pPr>
+              <w:keepNext/>
+              <w:keepLines/>
+              <w:jc w:val="left"/>
+            </w:pPr>
+            <w:r>
+              <w:rPr>
+                <w:rFonts w:ascii="Calibri" w:cs="Calibri" w:eastAsia="Calibri" w:hAnsi="Calibri"/>
+                <w:b w:val="false"/>
+                <w:bCs w:val="false"/>
+                <w:sz w:val="18"/>
+                <w:szCs w:val="18"/>
+                <w:highlight w:val="yellow"/>
+              </w:rPr>
+              <w:t xml:space="preserve">[GBT_CV_PR_AUC]</w:t>
             </w:r>
           </w:p>
         </w:tc>
@@ -3685,7 +3826,7 @@
           <w:sz w:val="18"/>
           <w:szCs w:val="18"/>
         </w:rPr>
-        <w:t xml:space="preserve">Table 2. Hyperparameter grids and selected values.</w:t>
+        <w:t xml:space="preserve">Table 2. Hyperparameter grids (searched on a 5% training sample), selected values and mean cross-validated PR-AUC.</w:t>
       </w:r>
     </w:p>
     <w:p>

</xml_diff>

<commit_message>
Fill report and deck with the full-run results
- results/: figures and report_placeholders.json extracted from the
  completed Colab run (7,001,619 flights; GBT best: F1 0.479, ROC-AUC 0.735)
- notebook/executed/: the full-run notebook with outputs
- report: CHECK notes replaced with interpretation of the real results
  (EDA patterns, model comparison, permutation importance, temporal drop,
  scaling), permutation-importance figure added, trimmed to ~2,190 words
- deck: real-result speaker notes, image fallbacks when CSV tables are
  absent, scale-out stat uses the aggregation speed-up

Co-Authored-By: Claude Opus 5.5 <noreply@anthropic.com>
Claude-Session: https://claude.ai/code/session_013cmZjtFTpWtFMxYtK982h3
</commit_message>
<xml_diff>
--- a/bdmla-flight-delay/report/BDMLA_CW2_Part2_Flight_Delay_Report.docx
+++ b/bdmla-flight-delay/report/BDMLA_CW2_Part2_Flight_Delay_Report.docx
@@ -143,7 +143,7 @@
         <w:rPr>
           <w:rFonts w:ascii="Calibri" w:cs="Calibri" w:eastAsia="Calibri" w:hAnsi="Calibri"/>
         </w:rPr>
-        <w:t xml:space="preserve">2,118</w:t>
+        <w:t xml:space="preserve">2,190</w:t>
       </w:r>
       <w:r>
         <w:rPr>
@@ -174,9 +174,8 @@
       <w:r>
         <w:rPr>
           <w:rFonts w:ascii="Calibri" w:cs="Calibri" w:eastAsia="Calibri" w:hAnsi="Calibri"/>
-          <w:highlight w:val="yellow"/>
-        </w:rPr>
-        <w:t xml:space="preserve">[SPARK_VERSION]</w:t>
+        </w:rPr>
+        <w:t xml:space="preserve">4.0.4</w:t>
       </w:r>
       <w:r>
         <w:rPr>
@@ -817,9 +816,8 @@
       <w:r>
         <w:rPr>
           <w:rFonts w:ascii="Calibri" w:cs="Calibri" w:eastAsia="Calibri" w:hAnsi="Calibri"/>
-          <w:highlight w:val="yellow"/>
-        </w:rPr>
-        <w:t xml:space="preserve">[RAW_ROWS]</w:t>
+        </w:rPr>
+        <w:t xml:space="preserve">7,001,619</w:t>
       </w:r>
       <w:r>
         <w:rPr>
@@ -830,9 +828,8 @@
       <w:r>
         <w:rPr>
           <w:rFonts w:ascii="Calibri" w:cs="Calibri" w:eastAsia="Calibri" w:hAnsi="Calibri"/>
-          <w:highlight w:val="yellow"/>
-        </w:rPr>
-        <w:t xml:space="preserve">[BEST_F1_MODEL]</w:t>
+        </w:rPr>
+        <w:t xml:space="preserve">Gradient-Boosted Trees</w:t>
       </w:r>
       <w:r>
         <w:rPr>
@@ -843,9 +840,8 @@
       <w:r>
         <w:rPr>
           <w:rFonts w:ascii="Calibri" w:cs="Calibri" w:eastAsia="Calibri" w:hAnsi="Calibri"/>
-          <w:highlight w:val="yellow"/>
-        </w:rPr>
-        <w:t xml:space="preserve">[BEST_F1_VALUE]</w:t>
+        </w:rPr>
+        <w:t xml:space="preserve">0.479</w:t>
       </w:r>
       <w:r>
         <w:rPr>
@@ -1060,7 +1056,7 @@
         <w:rPr>
           <w:rFonts w:ascii="Calibri" w:cs="Calibri" w:eastAsia="Calibri" w:hAnsi="Calibri"/>
         </w:rPr>
-        <w:t xml:space="preserve">Sternberg et al. (2017) found in their review that most delay studies use classification, with tree-based models and network congestion features appearing again and again. Rebollo and Balakrishnan (2014) showed with random forests that congestion elsewhere in the network helps predict delays at an airport, and Gui et al. (2020) also found random forests strong on aviation big data. Belcastro et al. (2016) built a scalable MapReduce pipeline joining flight and weather data. Random forests (Breiman, 2001) and gradient boosting (Friedman, 2001) are both in Spark MLlib (Meng et al., 2016). This project builds on that work with a strict pre-departure leakage policy, schedule-based congestion and aircraft-rotation features, and a comparison of accuracy against training cost on the latest full year.</w:t>
+        <w:t xml:space="preserve">Sternberg et al. (2017) found that most delay studies use classification, with tree models and congestion features recurring. Rebollo and Balakrishnan (2014) and Gui et al. (2020) both found random forests strong, and Belcastro et al. (2016) built a scalable MapReduce pipeline joining flight and weather data. Random forests (Breiman, 2001) and gradient boosting (Friedman, 2001) are both in Spark MLlib (Meng et al., 2016). This project builds on that work with a strict pre-departure leakage policy, schedule-based congestion and aircraft-rotation features, and a comparison of accuracy against training cost on the latest full year.</w:t>
       </w:r>
     </w:p>
     <w:p>
@@ -1117,9 +1113,8 @@
       <w:r>
         <w:rPr>
           <w:rFonts w:ascii="Calibri" w:cs="Calibri" w:eastAsia="Calibri" w:hAnsi="Calibri"/>
-          <w:highlight w:val="yellow"/>
-        </w:rPr>
-        <w:t xml:space="preserve">[RAW_ROWS]</w:t>
+        </w:rPr>
+        <w:t xml:space="preserve">7,001,619</w:t>
       </w:r>
       <w:r>
         <w:rPr>
@@ -1130,22 +1125,49 @@
     </w:p>
     <w:p>
       <w:pPr>
-        <w:pBdr>
-          <w:top w:val="single" w:color="BFBFBF" w:sz="4"/>
-          <w:left w:val="single" w:color="BFBFBF" w:sz="4"/>
-          <w:bottom w:val="single" w:color="BFBFBF" w:sz="4"/>
-          <w:right w:val="single" w:color="BFBFBF" w:sz="4"/>
-        </w:pBdr>
-        <w:shd w:fill="FFF9E6" w:color="auto" w:val="clear"/>
+        <w:keepNext/>
         <w:spacing w:before="120"/>
         <w:jc w:val="center"/>
       </w:pPr>
       <w:r>
-        <w:rPr>
-          <w:rFonts w:ascii="Calibri" w:cs="Calibri" w:eastAsia="Calibri" w:hAnsi="Calibri"/>
-          <w:highlight w:val="yellow"/>
-        </w:rPr>
-        <w:t xml:space="preserve">[Insert figure: outputs/figures/01_class_balance.png]</w:t>
+        <w:drawing>
+          <wp:inline distT="0" distB="0" distL="0" distR="0">
+            <wp:extent cx="4206240" cy="2238805"/>
+            <wp:effectExtent t="0" r="0" b="0" l="0"/>
+            <wp:docPr id="12" name="01_class_balance.png" descr="Figure 1. Class balance after cleaning (DELAYED = 1 when ARR_DELAY ≥ 15 minutes)." title="Figure 1. Class balance after cleaning (DELAYED = 1 when ARR_DELAY ≥ 15 minutes)."/>
+            <wp:cNvGraphicFramePr>
+              <a:graphicFrameLocks xmlns:a="http://schemas.openxmlformats.org/drawingml/2006/main" noChangeAspect="1"/>
+            </wp:cNvGraphicFramePr>
+            <a:graphic xmlns:a="http://schemas.openxmlformats.org/drawingml/2006/main">
+              <a:graphicData uri="http://schemas.openxmlformats.org/drawingml/2006/picture">
+                <pic:pic xmlns:pic="http://schemas.openxmlformats.org/drawingml/2006/picture">
+                  <pic:nvPicPr>
+                    <pic:cNvPr id="0" name="" descr=""/>
+                    <pic:cNvPicPr>
+                      <a:picLocks noChangeAspect="1" noChangeArrowheads="1"/>
+                    </pic:cNvPicPr>
+                  </pic:nvPicPr>
+                  <pic:blipFill>
+                    <a:blip r:embed="rId8" cstate="none"/>
+                    <a:srcRect/>
+                    <a:stretch>
+                      <a:fillRect/>
+                    </a:stretch>
+                  </pic:blipFill>
+                  <pic:spPr bwMode="auto">
+                    <a:xfrm>
+                      <a:off x="0" y="0"/>
+                      <a:ext cx="4206240" cy="2238805"/>
+                    </a:xfrm>
+                    <a:prstGeom prst="rect">
+                      <a:avLst/>
+                    </a:prstGeom>
+                  </pic:spPr>
+                </pic:pic>
+              </a:graphicData>
+            </a:graphic>
+          </wp:inline>
+        </w:drawing>
       </w:r>
     </w:p>
     <w:p>
@@ -1192,9 +1214,8 @@
       <w:r>
         <w:rPr>
           <w:rFonts w:ascii="Calibri" w:cs="Calibri" w:eastAsia="Calibri" w:hAnsi="Calibri"/>
-          <w:highlight w:val="yellow"/>
-        </w:rPr>
-        <w:t xml:space="preserve">[DELAY_RATE]</w:t>
+        </w:rPr>
+        <w:t xml:space="preserve">22.31%</w:t>
       </w:r>
       <w:r>
         <w:rPr>
@@ -1205,61 +1226,61 @@
       <w:r>
         <w:rPr>
           <w:rFonts w:ascii="Calibri" w:cs="Calibri" w:eastAsia="Calibri" w:hAnsi="Calibri"/>
-          <w:highlight w:val="yellow"/>
-        </w:rPr>
-        <w:t xml:space="preserve">[BASELINE_ACCURACY]</w:t>
-      </w:r>
-      <w:r>
-        <w:rPr>
-          <w:rFonts w:ascii="Calibri" w:cs="Calibri" w:eastAsia="Calibri" w:hAnsi="Calibri"/>
-        </w:rPr>
-        <w:t xml:space="preserve"> accuracy. Figure 2 breaks the delay rate down by month, day of week, scheduled departure hour and airline. </w:t>
-      </w:r>
-      <w:r>
-        <w:rPr>
-          <w:rFonts w:ascii="Calibri" w:cs="Calibri" w:eastAsia="Calibri" w:hAnsi="Calibri"/>
-          <w:i/>
-          <w:iCs/>
-          <w:color w:val="7F6000"/>
-          <w:highlight w:val="yellow"/>
-        </w:rPr>
-        <w:t xml:space="preserve">[CHECK: describe the peak months, the trend through the day, and the spread between airlines from Figure 2.]</w:t>
-      </w:r>
-      <w:r>
-        <w:rPr>
-          <w:rFonts w:ascii="Calibri" w:cs="Calibri" w:eastAsia="Calibri" w:hAnsi="Calibri"/>
-        </w:rPr>
-        <w:t xml:space="preserve"> The departure-hour pattern is consistent with how delays propagate: an aircraft that is late in the morning carries that delay into its later legs. That is why I built the aircraft-rotation features described in Section 5. Figure 3 shows the busiest airports and the effect of the scheduled turnaround and the leg of the day. </w:t>
-      </w:r>
-      <w:r>
-        <w:rPr>
-          <w:rFonts w:ascii="Calibri" w:cs="Calibri" w:eastAsia="Calibri" w:hAnsi="Calibri"/>
-          <w:i/>
-          <w:iCs/>
-          <w:color w:val="7F6000"/>
-          <w:highlight w:val="yellow"/>
-        </w:rPr>
-        <w:t xml:space="preserve">[CHECK: one sentence on what Figure 3 shows.]</w:t>
-      </w:r>
-    </w:p>
-    <w:p>
-      <w:pPr>
-        <w:pBdr>
-          <w:top w:val="single" w:color="BFBFBF" w:sz="4"/>
-          <w:left w:val="single" w:color="BFBFBF" w:sz="4"/>
-          <w:bottom w:val="single" w:color="BFBFBF" w:sz="4"/>
-          <w:right w:val="single" w:color="BFBFBF" w:sz="4"/>
-        </w:pBdr>
-        <w:shd w:fill="FFF9E6" w:color="auto" w:val="clear"/>
+        </w:rPr>
+        <w:t xml:space="preserve">77.70%</w:t>
+      </w:r>
+      <w:r>
+        <w:rPr>
+          <w:rFonts w:ascii="Calibri" w:cs="Calibri" w:eastAsia="Calibri" w:hAnsi="Calibri"/>
+        </w:rPr>
+        <w:t xml:space="preserve"> accuracy. Figure 2 breaks the delay rate down by month, day of week, scheduled departure hour and airline. Delays peak in the summer (about 29% in July) and in December, and are lowest in September (about 17%). Sundays are worst, and airlines range from about 17% (Hawaiian) to 28% (Frontier). The clearest pattern is by hour: about 9% of 5am departures arrive late, rising to about 33% at 7pm, which is how delays propagate as late aircraft carry delay into their next legs. Figure 3 supports this. An aircraft's first leg of the day is late about 15% of the time, its seventh about 34%, and a scheduled turnaround under 40 minutes gives a 38% delay rate against about 21% for 60 to 179 minutes. </w:t>
+      </w:r>
+    </w:p>
+    <w:p>
+      <w:pPr>
+        <w:keepNext/>
         <w:spacing w:before="120"/>
         <w:jc w:val="center"/>
       </w:pPr>
       <w:r>
-        <w:rPr>
-          <w:rFonts w:ascii="Calibri" w:cs="Calibri" w:eastAsia="Calibri" w:hAnsi="Calibri"/>
-          <w:highlight w:val="yellow"/>
-        </w:rPr>
-        <w:t xml:space="preserve">[Insert figure: outputs/figures/03_delay_rate_patterns.png]</w:t>
+        <w:drawing>
+          <wp:inline distT="0" distB="0" distL="0" distR="0">
+            <wp:extent cx="5669280" cy="3587074"/>
+            <wp:effectExtent t="0" r="0" b="0" l="0"/>
+            <wp:docPr id="13" name="03_delay_rate_patterns.png" descr="Figure 2. Delay rate by month, day of week, scheduled departure hour and reporting airline." title="Figure 2. Delay rate by month, day of week, scheduled departure hour and reporting airline."/>
+            <wp:cNvGraphicFramePr>
+              <a:graphicFrameLocks xmlns:a="http://schemas.openxmlformats.org/drawingml/2006/main" noChangeAspect="1"/>
+            </wp:cNvGraphicFramePr>
+            <a:graphic xmlns:a="http://schemas.openxmlformats.org/drawingml/2006/main">
+              <a:graphicData uri="http://schemas.openxmlformats.org/drawingml/2006/picture">
+                <pic:pic xmlns:pic="http://schemas.openxmlformats.org/drawingml/2006/picture">
+                  <pic:nvPicPr>
+                    <pic:cNvPr id="0" name="" descr=""/>
+                    <pic:cNvPicPr>
+                      <a:picLocks noChangeAspect="1" noChangeArrowheads="1"/>
+                    </pic:cNvPicPr>
+                  </pic:nvPicPr>
+                  <pic:blipFill>
+                    <a:blip r:embed="rId9" cstate="none"/>
+                    <a:srcRect/>
+                    <a:stretch>
+                      <a:fillRect/>
+                    </a:stretch>
+                  </pic:blipFill>
+                  <pic:spPr bwMode="auto">
+                    <a:xfrm>
+                      <a:off x="0" y="0"/>
+                      <a:ext cx="5669280" cy="3587074"/>
+                    </a:xfrm>
+                    <a:prstGeom prst="rect">
+                      <a:avLst/>
+                    </a:prstGeom>
+                  </pic:spPr>
+                </pic:pic>
+              </a:graphicData>
+            </a:graphic>
+          </wp:inline>
+        </w:drawing>
       </w:r>
     </w:p>
     <w:p>
@@ -1281,22 +1302,49 @@
     </w:p>
     <w:p>
       <w:pPr>
-        <w:pBdr>
-          <w:top w:val="single" w:color="BFBFBF" w:sz="4"/>
-          <w:left w:val="single" w:color="BFBFBF" w:sz="4"/>
-          <w:bottom w:val="single" w:color="BFBFBF" w:sz="4"/>
-          <w:right w:val="single" w:color="BFBFBF" w:sz="4"/>
-        </w:pBdr>
-        <w:shd w:fill="FFF9E6" w:color="auto" w:val="clear"/>
+        <w:keepNext/>
         <w:spacing w:before="120"/>
         <w:jc w:val="center"/>
       </w:pPr>
       <w:r>
-        <w:rPr>
-          <w:rFonts w:ascii="Calibri" w:cs="Calibri" w:eastAsia="Calibri" w:hAnsi="Calibri"/>
-          <w:highlight w:val="yellow"/>
-        </w:rPr>
-        <w:t xml:space="preserve">[Insert figure: outputs/figures/04_airport_and_rotation_patterns.png]</w:t>
+        <w:drawing>
+          <wp:inline distT="0" distB="0" distL="0" distR="0">
+            <wp:extent cx="5669280" cy="1832869"/>
+            <wp:effectExtent t="0" r="0" b="0" l="0"/>
+            <wp:docPr id="14" name="04_airport_and_rotation_patterns.png" descr="Figure 3. Delay rate at the 20 busiest origin airports, by scheduled turnaround, and by aircraft leg of the day." title="Figure 3. Delay rate at the 20 busiest origin airports, by scheduled turnaround, and by aircraft leg of the day."/>
+            <wp:cNvGraphicFramePr>
+              <a:graphicFrameLocks xmlns:a="http://schemas.openxmlformats.org/drawingml/2006/main" noChangeAspect="1"/>
+            </wp:cNvGraphicFramePr>
+            <a:graphic xmlns:a="http://schemas.openxmlformats.org/drawingml/2006/main">
+              <a:graphicData uri="http://schemas.openxmlformats.org/drawingml/2006/picture">
+                <pic:pic xmlns:pic="http://schemas.openxmlformats.org/drawingml/2006/picture">
+                  <pic:nvPicPr>
+                    <pic:cNvPr id="0" name="" descr=""/>
+                    <pic:cNvPicPr>
+                      <a:picLocks noChangeAspect="1" noChangeArrowheads="1"/>
+                    </pic:cNvPicPr>
+                  </pic:nvPicPr>
+                  <pic:blipFill>
+                    <a:blip r:embed="rId10" cstate="none"/>
+                    <a:srcRect/>
+                    <a:stretch>
+                      <a:fillRect/>
+                    </a:stretch>
+                  </pic:blipFill>
+                  <pic:spPr bwMode="auto">
+                    <a:xfrm>
+                      <a:off x="0" y="0"/>
+                      <a:ext cx="5669280" cy="1832869"/>
+                    </a:xfrm>
+                    <a:prstGeom prst="rect">
+                      <a:avLst/>
+                    </a:prstGeom>
+                  </pic:spPr>
+                </pic:pic>
+              </a:graphicData>
+            </a:graphic>
+          </wp:inline>
+        </w:drawing>
       </w:r>
     </w:p>
     <w:p>
@@ -1338,7 +1386,7 @@
         <w:rPr>
           <w:rFonts w:ascii="Calibri" w:cs="Calibri" w:eastAsia="Calibri" w:hAnsi="Calibri"/>
         </w:rPr>
-        <w:t xml:space="preserve">The cleaning rules followed the project specification. Cancelled and diverted flights were removed because they never arrived at the scheduled destination, so they have no arrival-delay label. Rows with a null ARR_DELAY were then removed, followed by duplicate records and rows with impossible schedule values (non-positive scheduled duration or distance). Table 1 shows how many rows each step removed. Missing tail numbers were kept: the rotation features for those flights were filled with a neutral value and a HAS_PREV_LEG indicator.</w:t>
+        <w:t xml:space="preserve">Cancelled and diverted flights were removed because they have no arrival-delay label, then null ARR_DELAY rows, duplicates and impossible schedule values (Table 1). Almost all missing ARR_DELAY values belonged to cancelled or diverted flights. Missing tail numbers were kept: the rotation features for those flights were filled with a neutral value and a HAS_PREV_LEG indicator.</w:t>
       </w:r>
     </w:p>
     <w:tbl>
@@ -1536,9 +1584,8 @@
                 <w:bCs w:val="false"/>
                 <w:sz w:val="18"/>
                 <w:szCs w:val="18"/>
-                <w:highlight w:val="yellow"/>
-              </w:rPr>
-              <w:t xml:space="preserve">[FUNNEL_0_ROWS]</w:t>
+              </w:rPr>
+              <w:t xml:space="preserve">7,001,619</w:t>
             </w:r>
           </w:p>
         </w:tc>
@@ -1644,9 +1691,8 @@
                 <w:bCs w:val="false"/>
                 <w:sz w:val="18"/>
                 <w:szCs w:val="18"/>
-                <w:highlight w:val="yellow"/>
-              </w:rPr>
-              <w:t xml:space="preserve">[FUNNEL_1_ROWS]</w:t>
+              </w:rPr>
+              <w:t xml:space="preserve">6,898,743</w:t>
             </w:r>
           </w:p>
         </w:tc>
@@ -1679,9 +1725,8 @@
                 <w:bCs w:val="false"/>
                 <w:sz w:val="18"/>
                 <w:szCs w:val="18"/>
-                <w:highlight w:val="yellow"/>
-              </w:rPr>
-              <w:t xml:space="preserve">[FUNNEL_1_REMOVED]</w:t>
+              </w:rPr>
+              <w:t xml:space="preserve">102,876</w:t>
             </w:r>
           </w:p>
         </w:tc>
@@ -1753,9 +1798,8 @@
                 <w:bCs w:val="false"/>
                 <w:sz w:val="18"/>
                 <w:szCs w:val="18"/>
-                <w:highlight w:val="yellow"/>
-              </w:rPr>
-              <w:t xml:space="preserve">[FUNNEL_2_ROWS]</w:t>
+              </w:rPr>
+              <w:t xml:space="preserve">6,879,485</w:t>
             </w:r>
           </w:p>
         </w:tc>
@@ -1788,9 +1832,8 @@
                 <w:bCs w:val="false"/>
                 <w:sz w:val="18"/>
                 <w:szCs w:val="18"/>
-                <w:highlight w:val="yellow"/>
-              </w:rPr>
-              <w:t xml:space="preserve">[FUNNEL_2_REMOVED]</w:t>
+              </w:rPr>
+              <w:t xml:space="preserve">19,258</w:t>
             </w:r>
           </w:p>
         </w:tc>
@@ -1862,9 +1905,8 @@
                 <w:bCs w:val="false"/>
                 <w:sz w:val="18"/>
                 <w:szCs w:val="18"/>
-                <w:highlight w:val="yellow"/>
-              </w:rPr>
-              <w:t xml:space="preserve">[FUNNEL_3_ROWS]</w:t>
+              </w:rPr>
+              <w:t xml:space="preserve">6,879,484</w:t>
             </w:r>
           </w:p>
         </w:tc>
@@ -1897,9 +1939,8 @@
                 <w:bCs w:val="false"/>
                 <w:sz w:val="18"/>
                 <w:szCs w:val="18"/>
-                <w:highlight w:val="yellow"/>
-              </w:rPr>
-              <w:t xml:space="preserve">[FUNNEL_3_REMOVED]</w:t>
+              </w:rPr>
+              <w:t xml:space="preserve">1</w:t>
             </w:r>
           </w:p>
         </w:tc>
@@ -1971,9 +2012,8 @@
                 <w:bCs w:val="false"/>
                 <w:sz w:val="18"/>
                 <w:szCs w:val="18"/>
-                <w:highlight w:val="yellow"/>
-              </w:rPr>
-              <w:t xml:space="preserve">[FUNNEL_4_ROWS]</w:t>
+              </w:rPr>
+              <w:t xml:space="preserve">6,879,484</w:t>
             </w:r>
           </w:p>
         </w:tc>
@@ -2006,9 +2046,8 @@
                 <w:bCs w:val="false"/>
                 <w:sz w:val="18"/>
                 <w:szCs w:val="18"/>
-                <w:highlight w:val="yellow"/>
-              </w:rPr>
-              <w:t xml:space="preserve">[FUNNEL_4_REMOVED]</w:t>
+              </w:rPr>
+              <w:t xml:space="preserve">0</w:t>
             </w:r>
           </w:p>
         </w:tc>
@@ -2080,9 +2119,8 @@
                 <w:bCs w:val="false"/>
                 <w:sz w:val="18"/>
                 <w:szCs w:val="18"/>
-                <w:highlight w:val="yellow"/>
-              </w:rPr>
-              <w:t xml:space="preserve">[FUNNEL_5_ROWS]</w:t>
+              </w:rPr>
+              <w:t xml:space="preserve">6,879,483</w:t>
             </w:r>
           </w:p>
         </w:tc>
@@ -2115,9 +2153,8 @@
                 <w:bCs w:val="false"/>
                 <w:sz w:val="18"/>
                 <w:szCs w:val="18"/>
-                <w:highlight w:val="yellow"/>
-              </w:rPr>
-              <w:t xml:space="preserve">[FUNNEL_5_REMOVED]</w:t>
+              </w:rPr>
+              <w:t xml:space="preserve">1</w:t>
             </w:r>
           </w:p>
         </w:tc>
@@ -2176,7 +2213,7 @@
         <w:rPr>
           <w:rFonts w:ascii="Calibri" w:cs="Calibri" w:eastAsia="Calibri" w:hAnsi="Calibri"/>
         </w:rPr>
-        <w:t xml:space="preserve"> loads only 17 of the roughly 110 raw columns, so post-flight fields (ARR_TIME, AIR_TIME, WHEELS_ON/OFF, TAXI_IN, the delay-cause columns and so on) never enter the DataFrame. I also excluded </w:t>
+        <w:t xml:space="preserve"> loads only 17 of the 110 raw columns, so post-flight fields never enter the DataFrame. I also excluded </w:t>
       </w:r>
       <w:r>
         <w:rPr>
@@ -2234,9 +2271,8 @@
       <w:r>
         <w:rPr>
           <w:rFonts w:ascii="Calibri" w:cs="Calibri" w:eastAsia="Calibri" w:hAnsi="Calibri"/>
-          <w:highlight w:val="yellow"/>
-        </w:rPr>
-        <w:t xml:space="preserve">[SPARK_VERSION]</w:t>
+        </w:rPr>
+        <w:t xml:space="preserve">4.0.4</w:t>
       </w:r>
       <w:r>
         <w:rPr>
@@ -2256,7 +2292,7 @@
           <wp:inline distT="0" distB="0" distL="0" distR="0">
             <wp:extent cx="5669280" cy="2317370"/>
             <wp:effectExtent t="0" r="0" b="0" l="0"/>
-            <wp:docPr id="3" name="architecture_pipeline.png" descr="Figure 4. End-to-end architecture of the Spark pipeline." title="Figure 4. End-to-end architecture of the Spark pipeline."/>
+            <wp:docPr id="15" name="architecture_pipeline.png" descr="Figure 4. End-to-end architecture of the Spark pipeline." title="Figure 4. End-to-end architecture of the Spark pipeline."/>
             <wp:cNvGraphicFramePr>
               <a:graphicFrameLocks xmlns:a="http://schemas.openxmlformats.org/drawingml/2006/main" noChangeAspect="1"/>
             </wp:cNvGraphicFramePr>
@@ -2270,7 +2306,7 @@
                     </pic:cNvPicPr>
                   </pic:nvPicPr>
                   <pic:blipFill>
-                    <a:blip r:embed="rId8" cstate="none"/>
+                    <a:blip r:embed="rId11" cstate="none"/>
                     <a:srcRect/>
                     <a:stretch>
                       <a:fillRect/>
@@ -2323,9 +2359,8 @@
       <w:r>
         <w:rPr>
           <w:rFonts w:ascii="Calibri" w:cs="Calibri" w:eastAsia="Calibri" w:hAnsi="Calibri"/>
-          <w:highlight w:val="yellow"/>
-        </w:rPr>
-        <w:t xml:space="preserve">[N_CORES]</w:t>
+        </w:rPr>
+        <w:t xml:space="preserve">2</w:t>
       </w:r>
       <w:r>
         <w:rPr>
@@ -2359,7 +2394,7 @@
           <wp:inline distT="0" distB="0" distL="0" distR="0">
             <wp:extent cx="5120640" cy="2183010"/>
             <wp:effectExtent t="0" r="0" b="0" l="0"/>
-            <wp:docPr id="4" name="spark_architecture.png" descr="Figure 5. Spark execution model: in Colab the driver and executor share one VM; on a cluster, tasks are spread across executors." title="Figure 5. Spark execution model: in Colab the driver and executor share one VM; on a cluster, tasks are spread across executors."/>
+            <wp:docPr id="16" name="spark_architecture.png" descr="Figure 5. Spark execution model: in Colab the driver and executor share one VM; on a cluster, tasks are spread across executors." title="Figure 5. Spark execution model: in Colab the driver and executor share one VM; on a cluster, tasks are spread across executors."/>
             <wp:cNvGraphicFramePr>
               <a:graphicFrameLocks xmlns:a="http://schemas.openxmlformats.org/drawingml/2006/main" noChangeAspect="1"/>
             </wp:cNvGraphicFramePr>
@@ -2373,7 +2408,7 @@
                     </pic:cNvPicPr>
                   </pic:nvPicPr>
                   <pic:blipFill>
-                    <a:blip r:embed="rId9" cstate="none"/>
+                    <a:blip r:embed="rId12" cstate="none"/>
                     <a:srcRect/>
                     <a:stretch>
                       <a:fillRect/>
@@ -2450,9 +2485,8 @@
       <w:r>
         <w:rPr>
           <w:rFonts w:ascii="Calibri" w:cs="Calibri" w:eastAsia="Calibri" w:hAnsi="Calibri"/>
-          <w:highlight w:val="yellow"/>
-        </w:rPr>
-        <w:t xml:space="preserve">[CSV_SECONDS]</w:t>
+        </w:rPr>
+        <w:t xml:space="preserve">79.8</w:t>
       </w:r>
       <w:r>
         <w:rPr>
@@ -2463,9 +2497,8 @@
       <w:r>
         <w:rPr>
           <w:rFonts w:ascii="Calibri" w:cs="Calibri" w:eastAsia="Calibri" w:hAnsi="Calibri"/>
-          <w:highlight w:val="yellow"/>
-        </w:rPr>
-        <w:t xml:space="preserve">[PARQUET_SECONDS]</w:t>
+        </w:rPr>
+        <w:t xml:space="preserve">3.2</w:t>
       </w:r>
       <w:r>
         <w:rPr>
@@ -2476,9 +2509,8 @@
       <w:r>
         <w:rPr>
           <w:rFonts w:ascii="Calibri" w:cs="Calibri" w:eastAsia="Calibri" w:hAnsi="Calibri"/>
-          <w:highlight w:val="yellow"/>
-        </w:rPr>
-        <w:t xml:space="preserve">[PARQUET_SPEEDUP]</w:t>
+        </w:rPr>
+        <w:t xml:space="preserve">25.1x</w:t>
       </w:r>
       <w:r>
         <w:rPr>
@@ -2595,14 +2627,13 @@
         <w:rPr>
           <w:rFonts w:ascii="Calibri" w:cs="Calibri" w:eastAsia="Calibri" w:hAnsi="Calibri"/>
         </w:rPr>
-        <w:t xml:space="preserve">To show scale-out, the notebook restarts Spark with 1 core and with </w:t>
-      </w:r>
-      <w:r>
-        <w:rPr>
-          <w:rFonts w:ascii="Calibri" w:cs="Calibri" w:eastAsia="Calibri" w:hAnsi="Calibri"/>
-          <w:highlight w:val="yellow"/>
-        </w:rPr>
-        <w:t xml:space="preserve">[SCALE_MAX_CORES]</w:t>
+        <w:t xml:space="preserve">To test scale-out, the notebook restarts Spark with 1 and </w:t>
+      </w:r>
+      <w:r>
+        <w:rPr>
+          <w:rFonts w:ascii="Calibri" w:cs="Calibri" w:eastAsia="Calibri" w:hAnsi="Calibri"/>
+        </w:rPr>
+        <w:t xml:space="preserve">2</w:t>
       </w:r>
       <w:r>
         <w:rPr>
@@ -2613,9 +2644,8 @@
       <w:r>
         <w:rPr>
           <w:rFonts w:ascii="Calibri" w:cs="Calibri" w:eastAsia="Calibri" w:hAnsi="Calibri"/>
-          <w:highlight w:val="yellow"/>
-        </w:rPr>
-        <w:t xml:space="preserve">[SCALE_AGG_1CORE_S]</w:t>
+        </w:rPr>
+        <w:t xml:space="preserve">4.8</w:t>
       </w:r>
       <w:r>
         <w:rPr>
@@ -2626,9 +2656,8 @@
       <w:r>
         <w:rPr>
           <w:rFonts w:ascii="Calibri" w:cs="Calibri" w:eastAsia="Calibri" w:hAnsi="Calibri"/>
-          <w:highlight w:val="yellow"/>
-        </w:rPr>
-        <w:t xml:space="preserve">[SCALE_AGG_NCORE_S]</w:t>
+        </w:rPr>
+        <w:t xml:space="preserve">2.0</w:t>
       </w:r>
       <w:r>
         <w:rPr>
@@ -2639,70 +2668,26 @@
       <w:r>
         <w:rPr>
           <w:rFonts w:ascii="Calibri" w:cs="Calibri" w:eastAsia="Calibri" w:hAnsi="Calibri"/>
-          <w:highlight w:val="yellow"/>
-        </w:rPr>
-        <w:t xml:space="preserve">[SCALE_AGG_SPEEDUP]</w:t>
-      </w:r>
-      <w:r>
-        <w:rPr>
-          <w:rFonts w:ascii="Calibri" w:cs="Calibri" w:eastAsia="Calibri" w:hAnsi="Calibri"/>
-        </w:rPr>
-        <w:t xml:space="preserve">), and a Logistic Regression fit from </w:t>
-      </w:r>
-      <w:r>
-        <w:rPr>
-          <w:rFonts w:ascii="Calibri" w:cs="Calibri" w:eastAsia="Calibri" w:hAnsi="Calibri"/>
-          <w:highlight w:val="yellow"/>
-        </w:rPr>
-        <w:t xml:space="preserve">[SCALE_LR_1CORE_S]</w:t>
-      </w:r>
-      <w:r>
-        <w:rPr>
-          <w:rFonts w:ascii="Calibri" w:cs="Calibri" w:eastAsia="Calibri" w:hAnsi="Calibri"/>
-        </w:rPr>
-        <w:t xml:space="preserve"> s to </w:t>
-      </w:r>
-      <w:r>
-        <w:rPr>
-          <w:rFonts w:ascii="Calibri" w:cs="Calibri" w:eastAsia="Calibri" w:hAnsi="Calibri"/>
-          <w:highlight w:val="yellow"/>
-        </w:rPr>
-        <w:t xml:space="preserve">[SCALE_LR_NCORE_S]</w:t>
-      </w:r>
-      <w:r>
-        <w:rPr>
-          <w:rFonts w:ascii="Calibri" w:cs="Calibri" w:eastAsia="Calibri" w:hAnsi="Calibri"/>
-        </w:rPr>
-        <w:t xml:space="preserve"> s (</w:t>
-      </w:r>
-      <w:r>
-        <w:rPr>
-          <w:rFonts w:ascii="Calibri" w:cs="Calibri" w:eastAsia="Calibri" w:hAnsi="Calibri"/>
-          <w:highlight w:val="yellow"/>
-        </w:rPr>
-        <w:t xml:space="preserve">[SCALE_LR_SPEEDUP]</w:t>
-      </w:r>
-      <w:r>
-        <w:rPr>
-          <w:rFonts w:ascii="Calibri" w:cs="Calibri" w:eastAsia="Calibri" w:hAnsi="Calibri"/>
-        </w:rPr>
-        <w:t xml:space="preserve">). </w:t>
-      </w:r>
-      <w:r>
-        <w:rPr>
-          <w:rFonts w:ascii="Calibri" w:cs="Calibri" w:eastAsia="Calibri" w:hAnsi="Calibri"/>
-          <w:i/>
-          <w:iCs/>
-          <w:color w:val="7F6000"/>
-          <w:highlight w:val="yellow"/>
-        </w:rPr>
-        <w:t xml:space="preserve">[CHECK: comment on whether the speed-up is close to linear, and why not (fixed overheads, small data per task).]</w:t>
-      </w:r>
-      <w:r>
-        <w:rPr>
-          <w:rFonts w:ascii="Calibri" w:cs="Calibri" w:eastAsia="Calibri" w:hAnsi="Calibri"/>
-        </w:rPr>
-        <w:t xml:space="preserve"> The algorithms scale differently. Logistic Regression computes gradients per partition and sums them, so it scales almost linearly; Random Forest trees are independent; gradient boosting is sequential across iterations, so only the work inside each tree is parallel. On Dataproc or Databricks the notebook runs unchanged with more executors, and on GPUs the RAPIDS Accelerator for Apache Spark can offload SQL and Parquet work while XGBoost's Spark integration trains boosted trees (Chen &amp; Guestrin, 2016).</w:t>
+        </w:rPr>
+        <w:t xml:space="preserve">2.41x</w:t>
+      </w:r>
+      <w:r>
+        <w:rPr>
+          <w:rFonts w:ascii="Calibri" w:cs="Calibri" w:eastAsia="Calibri" w:hAnsi="Calibri"/>
+        </w:rPr>
+        <w:t xml:space="preserve">; above-linear partly because the first run warmed the caches), but a Logistic Regression fit on a cached 20% sample barely changed (</w:t>
+      </w:r>
+      <w:r>
+        <w:rPr>
+          <w:rFonts w:ascii="Calibri" w:cs="Calibri" w:eastAsia="Calibri" w:hAnsi="Calibri"/>
+        </w:rPr>
+        <w:t xml:space="preserve">1.03x</w:t>
+      </w:r>
+      <w:r>
+        <w:rPr>
+          <w:rFonts w:ascii="Calibri" w:cs="Calibri" w:eastAsia="Calibri" w:hAnsi="Calibri"/>
+        </w:rPr>
+        <w:t xml:space="preserve">). Each L-BFGS iteration is a short job dominated by driver work and scheduling, so its per-partition gradients only pay off with far more data per task, as on a cluster. Random Forest trees are independent, while boosting is sequential across iterations. On Dataproc or Databricks the notebook runs unchanged with more executors, and the RAPIDS Accelerator for Apache Spark and XGBoost's Spark integration add GPU acceleration (Chen &amp; Guestrin, 2016).</w:t>
       </w:r>
     </w:p>
     <w:p>
@@ -2745,9 +2730,8 @@
       <w:r>
         <w:rPr>
           <w:rFonts w:ascii="Calibri" w:cs="Calibri" w:eastAsia="Calibri" w:hAnsi="Calibri"/>
-          <w:highlight w:val="yellow"/>
-        </w:rPr>
-        <w:t xml:space="preserve">[N_FEATURES]</w:t>
+        </w:rPr>
+        <w:t xml:space="preserve">39</w:t>
       </w:r>
       <w:r>
         <w:rPr>
@@ -2970,9 +2954,8 @@
       <w:r>
         <w:rPr>
           <w:rFonts w:ascii="Calibri" w:cs="Calibri" w:eastAsia="Calibri" w:hAnsi="Calibri"/>
-          <w:highlight w:val="yellow"/>
-        </w:rPr>
-        <w:t xml:space="preserve">[TRAIN_SAMPLE_PCT]</w:t>
+        </w:rPr>
+        <w:t xml:space="preserve">30%</w:t>
       </w:r>
       <w:r>
         <w:rPr>
@@ -2983,9 +2966,8 @@
       <w:r>
         <w:rPr>
           <w:rFonts w:ascii="Calibri" w:cs="Calibri" w:eastAsia="Calibri" w:hAnsi="Calibri"/>
-          <w:highlight w:val="yellow"/>
-        </w:rPr>
-        <w:t xml:space="preserve">[TRAIN_ROWS_USED]</w:t>
+        </w:rPr>
+        <w:t xml:space="preserve">1,445,229</w:t>
       </w:r>
       <w:r>
         <w:rPr>
@@ -2996,9 +2978,8 @@
       <w:r>
         <w:rPr>
           <w:rFonts w:ascii="Calibri" w:cs="Calibri" w:eastAsia="Calibri" w:hAnsi="Calibri"/>
-          <w:highlight w:val="yellow"/>
-        </w:rPr>
-        <w:t xml:space="preserve">[VALID_ROWS]</w:t>
+        </w:rPr>
+        <w:t xml:space="preserve">687,108</w:t>
       </w:r>
       <w:r>
         <w:rPr>
@@ -3009,9 +2990,8 @@
       <w:r>
         <w:rPr>
           <w:rFonts w:ascii="Calibri" w:cs="Calibri" w:eastAsia="Calibri" w:hAnsi="Calibri"/>
-          <w:highlight w:val="yellow"/>
-        </w:rPr>
-        <w:t xml:space="preserve">[TEST_ROWS]</w:t>
+        </w:rPr>
+        <w:t xml:space="preserve">1,376,914</w:t>
       </w:r>
       <w:r>
         <w:rPr>
@@ -3070,9 +3050,8 @@
       <w:r>
         <w:rPr>
           <w:rFonts w:ascii="Calibri" w:cs="Calibri" w:eastAsia="Calibri" w:hAnsi="Calibri"/>
-          <w:highlight w:val="yellow"/>
-        </w:rPr>
-        <w:t xml:space="preserve">[BASELINE_ACCURACY]</w:t>
+        </w:rPr>
+        <w:t xml:space="preserve">77.70%</w:t>
       </w:r>
       <w:r>
         <w:rPr>
@@ -3483,9 +3462,8 @@
                 <w:bCs w:val="false"/>
                 <w:sz w:val="18"/>
                 <w:szCs w:val="18"/>
-                <w:highlight w:val="yellow"/>
-              </w:rPr>
-              <w:t xml:space="preserve">[LR_TUNED_PARAMS]</w:t>
+              </w:rPr>
+              <w:t xml:space="preserve">regParam=0.0001, elasticNetParam=0.0</w:t>
             </w:r>
           </w:p>
         </w:tc>
@@ -3518,9 +3496,8 @@
                 <w:bCs w:val="false"/>
                 <w:sz w:val="18"/>
                 <w:szCs w:val="18"/>
-                <w:highlight w:val="yellow"/>
-              </w:rPr>
-              <w:t xml:space="preserve">[LR_CV_PR_AUC]</w:t>
+              </w:rPr>
+              <w:t xml:space="preserve">0.369</w:t>
             </w:r>
           </w:p>
         </w:tc>
@@ -3626,9 +3603,8 @@
                 <w:bCs w:val="false"/>
                 <w:sz w:val="18"/>
                 <w:szCs w:val="18"/>
-                <w:highlight w:val="yellow"/>
-              </w:rPr>
-              <w:t xml:space="preserve">[RF_TUNED_PARAMS]</w:t>
+              </w:rPr>
+              <w:t xml:space="preserve">maxDepth=12, numTrees=120</w:t>
             </w:r>
           </w:p>
         </w:tc>
@@ -3661,9 +3637,8 @@
                 <w:bCs w:val="false"/>
                 <w:sz w:val="18"/>
                 <w:szCs w:val="18"/>
-                <w:highlight w:val="yellow"/>
-              </w:rPr>
-              <w:t xml:space="preserve">[RF_CV_PR_AUC]</w:t>
+              </w:rPr>
+              <w:t xml:space="preserve">0.444</w:t>
             </w:r>
           </w:p>
         </w:tc>
@@ -3769,9 +3744,8 @@
                 <w:bCs w:val="false"/>
                 <w:sz w:val="18"/>
                 <w:szCs w:val="18"/>
-                <w:highlight w:val="yellow"/>
-              </w:rPr>
-              <w:t xml:space="preserve">[GBT_TUNED_PARAMS]</w:t>
+              </w:rPr>
+              <w:t xml:space="preserve">maxDepth=6, stepSize=0.1</w:t>
             </w:r>
           </w:p>
         </w:tc>
@@ -3804,9 +3778,8 @@
                 <w:bCs w:val="false"/>
                 <w:sz w:val="18"/>
                 <w:szCs w:val="18"/>
-                <w:highlight w:val="yellow"/>
-              </w:rPr>
-              <w:t xml:space="preserve">[GBT_CV_PR_AUC]</w:t>
+              </w:rPr>
+              <w:t xml:space="preserve">0.469</w:t>
             </w:r>
           </w:p>
         </w:tc>
@@ -4229,9 +4202,8 @@
                 <w:bCs w:val="false"/>
                 <w:sz w:val="18"/>
                 <w:szCs w:val="18"/>
-                <w:highlight w:val="yellow"/>
-              </w:rPr>
-              <w:t xml:space="preserve">[BASELINE_ACCURACY]</w:t>
+              </w:rPr>
+              <w:t xml:space="preserve">77.70%</w:t>
             </w:r>
           </w:p>
         </w:tc>
@@ -4507,9 +4479,8 @@
                 <w:bCs w:val="false"/>
                 <w:sz w:val="18"/>
                 <w:szCs w:val="18"/>
-                <w:highlight w:val="yellow"/>
-              </w:rPr>
-              <w:t xml:space="preserve">[LR_ACCURACY]</w:t>
+              </w:rPr>
+              <w:t xml:space="preserve">0.624</w:t>
             </w:r>
           </w:p>
         </w:tc>
@@ -4542,9 +4513,8 @@
                 <w:bCs w:val="false"/>
                 <w:sz w:val="18"/>
                 <w:szCs w:val="18"/>
-                <w:highlight w:val="yellow"/>
-              </w:rPr>
-              <w:t xml:space="preserve">[LR_PRECISION]</w:t>
+              </w:rPr>
+              <w:t xml:space="preserve">0.325</w:t>
             </w:r>
           </w:p>
         </w:tc>
@@ -4577,9 +4547,8 @@
                 <w:bCs w:val="false"/>
                 <w:sz w:val="18"/>
                 <w:szCs w:val="18"/>
-                <w:highlight w:val="yellow"/>
-              </w:rPr>
-              <w:t xml:space="preserve">[LR_RECALL]</w:t>
+              </w:rPr>
+              <w:t xml:space="preserve">0.638</w:t>
             </w:r>
           </w:p>
         </w:tc>
@@ -4612,9 +4581,8 @@
                 <w:bCs w:val="false"/>
                 <w:sz w:val="18"/>
                 <w:szCs w:val="18"/>
-                <w:highlight w:val="yellow"/>
-              </w:rPr>
-              <w:t xml:space="preserve">[LR_F1]</w:t>
+              </w:rPr>
+              <w:t xml:space="preserve">0.431</w:t>
             </w:r>
           </w:p>
         </w:tc>
@@ -4647,9 +4615,8 @@
                 <w:bCs w:val="false"/>
                 <w:sz w:val="18"/>
                 <w:szCs w:val="18"/>
-                <w:highlight w:val="yellow"/>
-              </w:rPr>
-              <w:t xml:space="preserve">[LR_ROC_AUC]</w:t>
+              </w:rPr>
+              <w:t xml:space="preserve">0.676</w:t>
             </w:r>
           </w:p>
         </w:tc>
@@ -4682,9 +4649,8 @@
                 <w:bCs w:val="false"/>
                 <w:sz w:val="18"/>
                 <w:szCs w:val="18"/>
-                <w:highlight w:val="yellow"/>
-              </w:rPr>
-              <w:t xml:space="preserve">[LR_PR_AUC]</w:t>
+              </w:rPr>
+              <w:t xml:space="preserve">0.368</w:t>
             </w:r>
           </w:p>
         </w:tc>
@@ -4717,9 +4683,8 @@
                 <w:bCs w:val="false"/>
                 <w:sz w:val="18"/>
                 <w:szCs w:val="18"/>
-                <w:highlight w:val="yellow"/>
-              </w:rPr>
-              <w:t xml:space="preserve">[LR_TRAIN_S]</w:t>
+              </w:rPr>
+              <w:t xml:space="preserve">47</w:t>
             </w:r>
           </w:p>
         </w:tc>
@@ -4791,9 +4756,8 @@
                 <w:bCs w:val="false"/>
                 <w:sz w:val="18"/>
                 <w:szCs w:val="18"/>
-                <w:highlight w:val="yellow"/>
-              </w:rPr>
-              <w:t xml:space="preserve">[RF_ACCURACY]</w:t>
+              </w:rPr>
+              <w:t xml:space="preserve">0.669</w:t>
             </w:r>
           </w:p>
         </w:tc>
@@ -4826,9 +4790,8 @@
                 <w:bCs w:val="false"/>
                 <w:sz w:val="18"/>
                 <w:szCs w:val="18"/>
-                <w:highlight w:val="yellow"/>
-              </w:rPr>
-              <w:t xml:space="preserve">[RF_PRECISION]</w:t>
+              </w:rPr>
+              <w:t xml:space="preserve">0.362</w:t>
             </w:r>
           </w:p>
         </w:tc>
@@ -4861,9 +4824,8 @@
                 <w:bCs w:val="false"/>
                 <w:sz w:val="18"/>
                 <w:szCs w:val="18"/>
-                <w:highlight w:val="yellow"/>
-              </w:rPr>
-              <w:t xml:space="preserve">[RF_RECALL]</w:t>
+              </w:rPr>
+              <w:t xml:space="preserve">0.630</w:t>
             </w:r>
           </w:p>
         </w:tc>
@@ -4896,9 +4858,8 @@
                 <w:bCs w:val="false"/>
                 <w:sz w:val="18"/>
                 <w:szCs w:val="18"/>
-                <w:highlight w:val="yellow"/>
-              </w:rPr>
-              <w:t xml:space="preserve">[RF_F1]</w:t>
+              </w:rPr>
+              <w:t xml:space="preserve">0.460</w:t>
             </w:r>
           </w:p>
         </w:tc>
@@ -4931,9 +4892,8 @@
                 <w:bCs w:val="false"/>
                 <w:sz w:val="18"/>
                 <w:szCs w:val="18"/>
-                <w:highlight w:val="yellow"/>
-              </w:rPr>
-              <w:t xml:space="preserve">[RF_ROC_AUC]</w:t>
+              </w:rPr>
+              <w:t xml:space="preserve">0.715</w:t>
             </w:r>
           </w:p>
         </w:tc>
@@ -4966,9 +4926,8 @@
                 <w:bCs w:val="false"/>
                 <w:sz w:val="18"/>
                 <w:szCs w:val="18"/>
-                <w:highlight w:val="yellow"/>
-              </w:rPr>
-              <w:t xml:space="preserve">[RF_PR_AUC]</w:t>
+              </w:rPr>
+              <w:t xml:space="preserve">0.457</w:t>
             </w:r>
           </w:p>
         </w:tc>
@@ -5001,9 +4960,8 @@
                 <w:bCs w:val="false"/>
                 <w:sz w:val="18"/>
                 <w:szCs w:val="18"/>
-                <w:highlight w:val="yellow"/>
-              </w:rPr>
-              <w:t xml:space="preserve">[RF_TRAIN_S]</w:t>
+              </w:rPr>
+              <w:t xml:space="preserve">2115</w:t>
             </w:r>
           </w:p>
         </w:tc>
@@ -5075,9 +5033,8 @@
                 <w:bCs w:val="false"/>
                 <w:sz w:val="18"/>
                 <w:szCs w:val="18"/>
-                <w:highlight w:val="yellow"/>
-              </w:rPr>
-              <w:t xml:space="preserve">[GBT_ACCURACY]</w:t>
+              </w:rPr>
+              <w:t xml:space="preserve">0.710</w:t>
             </w:r>
           </w:p>
         </w:tc>
@@ -5110,9 +5067,8 @@
                 <w:bCs w:val="false"/>
                 <w:sz w:val="18"/>
                 <w:szCs w:val="18"/>
-                <w:highlight w:val="yellow"/>
-              </w:rPr>
-              <w:t xml:space="preserve">[GBT_PRECISION]</w:t>
+              </w:rPr>
+              <w:t xml:space="preserve">0.400</w:t>
             </w:r>
           </w:p>
         </w:tc>
@@ -5145,9 +5101,8 @@
                 <w:bCs w:val="false"/>
                 <w:sz w:val="18"/>
                 <w:szCs w:val="18"/>
-                <w:highlight w:val="yellow"/>
-              </w:rPr>
-              <w:t xml:space="preserve">[GBT_RECALL]</w:t>
+              </w:rPr>
+              <w:t xml:space="preserve">0.598</w:t>
             </w:r>
           </w:p>
         </w:tc>
@@ -5180,9 +5135,8 @@
                 <w:bCs w:val="false"/>
                 <w:sz w:val="18"/>
                 <w:szCs w:val="18"/>
-                <w:highlight w:val="yellow"/>
-              </w:rPr>
-              <w:t xml:space="preserve">[GBT_F1]</w:t>
+              </w:rPr>
+              <w:t xml:space="preserve">0.479</w:t>
             </w:r>
           </w:p>
         </w:tc>
@@ -5215,9 +5169,8 @@
                 <w:bCs w:val="false"/>
                 <w:sz w:val="18"/>
                 <w:szCs w:val="18"/>
-                <w:highlight w:val="yellow"/>
-              </w:rPr>
-              <w:t xml:space="preserve">[GBT_ROC_AUC]</w:t>
+              </w:rPr>
+              <w:t xml:space="preserve">0.735</w:t>
             </w:r>
           </w:p>
         </w:tc>
@@ -5250,9 +5203,8 @@
                 <w:bCs w:val="false"/>
                 <w:sz w:val="18"/>
                 <w:szCs w:val="18"/>
-                <w:highlight w:val="yellow"/>
-              </w:rPr>
-              <w:t xml:space="preserve">[GBT_PR_AUC]</w:t>
+              </w:rPr>
+              <w:t xml:space="preserve">0.482</w:t>
             </w:r>
           </w:p>
         </w:tc>
@@ -5285,9 +5237,8 @@
                 <w:bCs w:val="false"/>
                 <w:sz w:val="18"/>
                 <w:szCs w:val="18"/>
-                <w:highlight w:val="yellow"/>
-              </w:rPr>
-              <w:t xml:space="preserve">[GBT_TRAIN_S]</w:t>
+              </w:rPr>
+              <w:t xml:space="preserve">465</w:t>
             </w:r>
           </w:p>
         </w:tc>
@@ -5317,9 +5268,8 @@
           <w:color w:val="595959"/>
           <w:sz w:val="18"/>
           <w:szCs w:val="18"/>
-          <w:highlight w:val="yellow"/>
-        </w:rPr>
-        <w:t xml:space="preserve">[LR_THRESHOLD]</w:t>
+        </w:rPr>
+        <w:t xml:space="preserve">0.500</w:t>
       </w:r>
       <w:r>
         <w:rPr>
@@ -5340,9 +5290,8 @@
           <w:color w:val="595959"/>
           <w:sz w:val="18"/>
           <w:szCs w:val="18"/>
-          <w:highlight w:val="yellow"/>
-        </w:rPr>
-        <w:t xml:space="preserve">[RF_THRESHOLD]</w:t>
+        </w:rPr>
+        <w:t xml:space="preserve">0.500</w:t>
       </w:r>
       <w:r>
         <w:rPr>
@@ -5363,9 +5312,8 @@
           <w:color w:val="595959"/>
           <w:sz w:val="18"/>
           <w:szCs w:val="18"/>
-          <w:highlight w:val="yellow"/>
-        </w:rPr>
-        <w:t xml:space="preserve">[GBT_THRESHOLD]</w:t>
+        </w:rPr>
+        <w:t xml:space="preserve">0.525</w:t>
       </w:r>
       <w:r>
         <w:rPr>
@@ -5387,9 +5335,8 @@
       <w:r>
         <w:rPr>
           <w:rFonts w:ascii="Calibri" w:cs="Calibri" w:eastAsia="Calibri" w:hAnsi="Calibri"/>
-          <w:highlight w:val="yellow"/>
-        </w:rPr>
-        <w:t xml:space="preserve">[BEST_F1_MODEL]</w:t>
+        </w:rPr>
+        <w:t xml:space="preserve">Gradient-Boosted Trees</w:t>
       </w:r>
       <w:r>
         <w:rPr>
@@ -5400,9 +5347,8 @@
       <w:r>
         <w:rPr>
           <w:rFonts w:ascii="Calibri" w:cs="Calibri" w:eastAsia="Calibri" w:hAnsi="Calibri"/>
-          <w:highlight w:val="yellow"/>
-        </w:rPr>
-        <w:t xml:space="preserve">[BEST_AUC_MODEL]</w:t>
+        </w:rPr>
+        <w:t xml:space="preserve">Gradient-Boosted Trees</w:t>
       </w:r>
       <w:r>
         <w:rPr>
@@ -5413,9 +5359,8 @@
       <w:r>
         <w:rPr>
           <w:rFonts w:ascii="Calibri" w:cs="Calibri" w:eastAsia="Calibri" w:hAnsi="Calibri"/>
-          <w:highlight w:val="yellow"/>
-        </w:rPr>
-        <w:t xml:space="preserve">[FASTEST_MODEL]</w:t>
+        </w:rPr>
+        <w:t xml:space="preserve">Logistic Regression</w:t>
       </w:r>
       <w:r>
         <w:rPr>
@@ -5426,45 +5371,97 @@
       <w:r>
         <w:rPr>
           <w:rFonts w:ascii="Calibri" w:cs="Calibri" w:eastAsia="Calibri" w:hAnsi="Calibri"/>
-          <w:highlight w:val="yellow"/>
-        </w:rPr>
-        <w:t xml:space="preserve">[SLOWEST_MODEL]</w:t>
-      </w:r>
-      <w:r>
-        <w:rPr>
-          <w:rFonts w:ascii="Calibri" w:cs="Calibri" w:eastAsia="Calibri" w:hAnsi="Calibri"/>
-        </w:rPr>
-        <w:t xml:space="preserve"> the slowest. </w:t>
-      </w:r>
-      <w:r>
-        <w:rPr>
-          <w:rFonts w:ascii="Calibri" w:cs="Calibri" w:eastAsia="Calibri" w:hAnsi="Calibri"/>
-          <w:i/>
-          <w:iCs/>
-          <w:color w:val="7F6000"/>
-          <w:highlight w:val="yellow"/>
-        </w:rPr>
-        <w:t xml:space="preserve">[CHECK: one or two sentences on the size of the gaps, e.g. whether the tree models beat Logistic Regression by a meaningful margin and whether the extra training time is worth it.]</w:t>
-      </w:r>
-    </w:p>
-    <w:p>
-      <w:pPr>
-        <w:pBdr>
-          <w:top w:val="single" w:color="BFBFBF" w:sz="4"/>
-          <w:left w:val="single" w:color="BFBFBF" w:sz="4"/>
-          <w:bottom w:val="single" w:color="BFBFBF" w:sz="4"/>
-          <w:right w:val="single" w:color="BFBFBF" w:sz="4"/>
-        </w:pBdr>
-        <w:shd w:fill="FFF9E6" w:color="auto" w:val="clear"/>
+        </w:rPr>
+        <w:t xml:space="preserve">Random Forest</w:t>
+      </w:r>
+      <w:r>
+        <w:rPr>
+          <w:rFonts w:ascii="Calibri" w:cs="Calibri" w:eastAsia="Calibri" w:hAnsi="Calibri"/>
+        </w:rPr>
+        <w:t xml:space="preserve"> the slowest. Both tree models clearly beat Logistic Regression (ROC-AUC </w:t>
+      </w:r>
+      <w:r>
+        <w:rPr>
+          <w:rFonts w:ascii="Calibri" w:cs="Calibri" w:eastAsia="Calibri" w:hAnsi="Calibri"/>
+        </w:rPr>
+        <w:t xml:space="preserve">0.676</w:t>
+      </w:r>
+      <w:r>
+        <w:rPr>
+          <w:rFonts w:ascii="Calibri" w:cs="Calibri" w:eastAsia="Calibri" w:hAnsi="Calibri"/>
+        </w:rPr>
+        <w:t xml:space="preserve">), so the non-linear interactions matter. GBT was better than Random Forest on every threshold-free metric while training in less than a quarter of the time. Tuning lifted Random Forest from </w:t>
+      </w:r>
+      <w:r>
+        <w:rPr>
+          <w:rFonts w:ascii="Calibri" w:cs="Calibri" w:eastAsia="Calibri" w:hAnsi="Calibri"/>
+        </w:rPr>
+        <w:t xml:space="preserve">0.705</w:t>
+      </w:r>
+      <w:r>
+        <w:rPr>
+          <w:rFonts w:ascii="Calibri" w:cs="Calibri" w:eastAsia="Calibri" w:hAnsi="Calibri"/>
+        </w:rPr>
+        <w:t xml:space="preserve"> to </w:t>
+      </w:r>
+      <w:r>
+        <w:rPr>
+          <w:rFonts w:ascii="Calibri" w:cs="Calibri" w:eastAsia="Calibri" w:hAnsi="Calibri"/>
+        </w:rPr>
+        <w:t xml:space="preserve">0.715</w:t>
+      </w:r>
+      <w:r>
+        <w:rPr>
+          <w:rFonts w:ascii="Calibri" w:cs="Calibri" w:eastAsia="Calibri" w:hAnsi="Calibri"/>
+        </w:rPr>
+        <w:t xml:space="preserve"> ROC-AUC but doubled its training time, while for GBT the grid simply confirmed the default settings.</w:t>
+      </w:r>
+    </w:p>
+    <w:p>
+      <w:pPr>
+        <w:keepNext/>
         <w:spacing w:before="120"/>
         <w:jc w:val="center"/>
       </w:pPr>
       <w:r>
-        <w:rPr>
-          <w:rFonts w:ascii="Calibri" w:cs="Calibri" w:eastAsia="Calibri" w:hAnsi="Calibri"/>
-          <w:highlight w:val="yellow"/>
-        </w:rPr>
-        <w:t xml:space="preserve">[Insert figure: outputs/figures/06_model_metrics.png]</w:t>
+        <w:drawing>
+          <wp:inline distT="0" distB="0" distL="0" distR="0">
+            <wp:extent cx="5669280" cy="2819048"/>
+            <wp:effectExtent t="0" r="0" b="0" l="0"/>
+            <wp:docPr id="17" name="06_model_metrics.png" descr="Figure 6. Test-set metrics for the three models; the dashed line is the majority-class accuracy." title="Figure 6. Test-set metrics for the three models; the dashed line is the majority-class accuracy."/>
+            <wp:cNvGraphicFramePr>
+              <a:graphicFrameLocks xmlns:a="http://schemas.openxmlformats.org/drawingml/2006/main" noChangeAspect="1"/>
+            </wp:cNvGraphicFramePr>
+            <a:graphic xmlns:a="http://schemas.openxmlformats.org/drawingml/2006/main">
+              <a:graphicData uri="http://schemas.openxmlformats.org/drawingml/2006/picture">
+                <pic:pic xmlns:pic="http://schemas.openxmlformats.org/drawingml/2006/picture">
+                  <pic:nvPicPr>
+                    <pic:cNvPr id="0" name="" descr=""/>
+                    <pic:cNvPicPr>
+                      <a:picLocks noChangeAspect="1" noChangeArrowheads="1"/>
+                    </pic:cNvPicPr>
+                  </pic:nvPicPr>
+                  <pic:blipFill>
+                    <a:blip r:embed="rId13" cstate="none"/>
+                    <a:srcRect/>
+                    <a:stretch>
+                      <a:fillRect/>
+                    </a:stretch>
+                  </pic:blipFill>
+                  <pic:spPr bwMode="auto">
+                    <a:xfrm>
+                      <a:off x="0" y="0"/>
+                      <a:ext cx="5669280" cy="2819048"/>
+                    </a:xfrm>
+                    <a:prstGeom prst="rect">
+                      <a:avLst/>
+                    </a:prstGeom>
+                  </pic:spPr>
+                </pic:pic>
+              </a:graphicData>
+            </a:graphic>
+          </wp:inline>
+        </w:drawing>
       </w:r>
     </w:p>
     <w:p>
@@ -5486,22 +5483,49 @@
     </w:p>
     <w:p>
       <w:pPr>
-        <w:pBdr>
-          <w:top w:val="single" w:color="BFBFBF" w:sz="4"/>
-          <w:left w:val="single" w:color="BFBFBF" w:sz="4"/>
-          <w:bottom w:val="single" w:color="BFBFBF" w:sz="4"/>
-          <w:right w:val="single" w:color="BFBFBF" w:sz="4"/>
-        </w:pBdr>
-        <w:shd w:fill="FFF9E6" w:color="auto" w:val="clear"/>
+        <w:keepNext/>
         <w:spacing w:before="120"/>
         <w:jc w:val="center"/>
       </w:pPr>
       <w:r>
-        <w:rPr>
-          <w:rFonts w:ascii="Calibri" w:cs="Calibri" w:eastAsia="Calibri" w:hAnsi="Calibri"/>
-          <w:highlight w:val="yellow"/>
-        </w:rPr>
-        <w:t xml:space="preserve">[Insert figure: outputs/figures/08_roc_pr_curves.png]</w:t>
+        <w:drawing>
+          <wp:inline distT="0" distB="0" distL="0" distR="0">
+            <wp:extent cx="5669280" cy="2129529"/>
+            <wp:effectExtent t="0" r="0" b="0" l="0"/>
+            <wp:docPr id="18" name="08_roc_pr_curves.png" descr="Figure 7. ROC and precision-recall curves on the test set." title="Figure 7. ROC and precision-recall curves on the test set."/>
+            <wp:cNvGraphicFramePr>
+              <a:graphicFrameLocks xmlns:a="http://schemas.openxmlformats.org/drawingml/2006/main" noChangeAspect="1"/>
+            </wp:cNvGraphicFramePr>
+            <a:graphic xmlns:a="http://schemas.openxmlformats.org/drawingml/2006/main">
+              <a:graphicData uri="http://schemas.openxmlformats.org/drawingml/2006/picture">
+                <pic:pic xmlns:pic="http://schemas.openxmlformats.org/drawingml/2006/picture">
+                  <pic:nvPicPr>
+                    <pic:cNvPr id="0" name="" descr=""/>
+                    <pic:cNvPicPr>
+                      <a:picLocks noChangeAspect="1" noChangeArrowheads="1"/>
+                    </pic:cNvPicPr>
+                  </pic:nvPicPr>
+                  <pic:blipFill>
+                    <a:blip r:embed="rId14" cstate="none"/>
+                    <a:srcRect/>
+                    <a:stretch>
+                      <a:fillRect/>
+                    </a:stretch>
+                  </pic:blipFill>
+                  <pic:spPr bwMode="auto">
+                    <a:xfrm>
+                      <a:off x="0" y="0"/>
+                      <a:ext cx="5669280" cy="2129529"/>
+                    </a:xfrm>
+                    <a:prstGeom prst="rect">
+                      <a:avLst/>
+                    </a:prstGeom>
+                  </pic:spPr>
+                </pic:pic>
+              </a:graphicData>
+            </a:graphic>
+          </wp:inline>
+        </w:drawing>
       </w:r>
     </w:p>
     <w:p>
@@ -5523,22 +5547,49 @@
     </w:p>
     <w:p>
       <w:pPr>
-        <w:pBdr>
-          <w:top w:val="single" w:color="BFBFBF" w:sz="4"/>
-          <w:left w:val="single" w:color="BFBFBF" w:sz="4"/>
-          <w:bottom w:val="single" w:color="BFBFBF" w:sz="4"/>
-          <w:right w:val="single" w:color="BFBFBF" w:sz="4"/>
-        </w:pBdr>
-        <w:shd w:fill="FFF9E6" w:color="auto" w:val="clear"/>
+        <w:keepNext/>
         <w:spacing w:before="120"/>
         <w:jc w:val="center"/>
       </w:pPr>
       <w:r>
-        <w:rPr>
-          <w:rFonts w:ascii="Calibri" w:cs="Calibri" w:eastAsia="Calibri" w:hAnsi="Calibri"/>
-          <w:highlight w:val="yellow"/>
-        </w:rPr>
-        <w:t xml:space="preserve">[Insert figure: outputs/figures/09_confusion_matrices.png]</w:t>
+        <w:drawing>
+          <wp:inline distT="0" distB="0" distL="0" distR="0">
+            <wp:extent cx="5669280" cy="1638776"/>
+            <wp:effectExtent t="0" r="0" b="0" l="0"/>
+            <wp:docPr id="19" name="09_confusion_matrices.png" descr="Figure 8. Confusion matrices at each model's validation-tuned threshold." title="Figure 8. Confusion matrices at each model's validation-tuned threshold."/>
+            <wp:cNvGraphicFramePr>
+              <a:graphicFrameLocks xmlns:a="http://schemas.openxmlformats.org/drawingml/2006/main" noChangeAspect="1"/>
+            </wp:cNvGraphicFramePr>
+            <a:graphic xmlns:a="http://schemas.openxmlformats.org/drawingml/2006/main">
+              <a:graphicData uri="http://schemas.openxmlformats.org/drawingml/2006/picture">
+                <pic:pic xmlns:pic="http://schemas.openxmlformats.org/drawingml/2006/picture">
+                  <pic:nvPicPr>
+                    <pic:cNvPr id="0" name="" descr=""/>
+                    <pic:cNvPicPr>
+                      <a:picLocks noChangeAspect="1" noChangeArrowheads="1"/>
+                    </pic:cNvPicPr>
+                  </pic:nvPicPr>
+                  <pic:blipFill>
+                    <a:blip r:embed="rId15" cstate="none"/>
+                    <a:srcRect/>
+                    <a:stretch>
+                      <a:fillRect/>
+                    </a:stretch>
+                  </pic:blipFill>
+                  <pic:spPr bwMode="auto">
+                    <a:xfrm>
+                      <a:off x="0" y="0"/>
+                      <a:ext cx="5669280" cy="1638776"/>
+                    </a:xfrm>
+                    <a:prstGeom prst="rect">
+                      <a:avLst/>
+                    </a:prstGeom>
+                  </pic:spPr>
+                </pic:pic>
+              </a:graphicData>
+            </a:graphic>
+          </wp:inline>
+        </w:drawing>
       </w:r>
     </w:p>
     <w:p>
@@ -5560,22 +5611,49 @@
     </w:p>
     <w:p>
       <w:pPr>
-        <w:pBdr>
-          <w:top w:val="single" w:color="BFBFBF" w:sz="4"/>
-          <w:left w:val="single" w:color="BFBFBF" w:sz="4"/>
-          <w:bottom w:val="single" w:color="BFBFBF" w:sz="4"/>
-          <w:right w:val="single" w:color="BFBFBF" w:sz="4"/>
-        </w:pBdr>
-        <w:shd w:fill="FFF9E6" w:color="auto" w:val="clear"/>
+        <w:keepNext/>
         <w:spacing w:before="120"/>
         <w:jc w:val="center"/>
       </w:pPr>
       <w:r>
-        <w:rPr>
-          <w:rFonts w:ascii="Calibri" w:cs="Calibri" w:eastAsia="Calibri" w:hAnsi="Calibri"/>
-          <w:highlight w:val="yellow"/>
-        </w:rPr>
-        <w:t xml:space="preserve">[Insert figure: outputs/figures/07_training_time.png]</w:t>
+        <w:drawing>
+          <wp:inline distT="0" distB="0" distL="0" distR="0">
+            <wp:extent cx="4389120" cy="1706880"/>
+            <wp:effectExtent t="0" r="0" b="0" l="0"/>
+            <wp:docPr id="20" name="07_training_time.png" descr="Figure 9. Training time on the training sample." title="Figure 9. Training time on the training sample."/>
+            <wp:cNvGraphicFramePr>
+              <a:graphicFrameLocks xmlns:a="http://schemas.openxmlformats.org/drawingml/2006/main" noChangeAspect="1"/>
+            </wp:cNvGraphicFramePr>
+            <a:graphic xmlns:a="http://schemas.openxmlformats.org/drawingml/2006/main">
+              <a:graphicData uri="http://schemas.openxmlformats.org/drawingml/2006/picture">
+                <pic:pic xmlns:pic="http://schemas.openxmlformats.org/drawingml/2006/picture">
+                  <pic:nvPicPr>
+                    <pic:cNvPr id="0" name="" descr=""/>
+                    <pic:cNvPicPr>
+                      <a:picLocks noChangeAspect="1" noChangeArrowheads="1"/>
+                    </pic:cNvPicPr>
+                  </pic:nvPicPr>
+                  <pic:blipFill>
+                    <a:blip r:embed="rId16" cstate="none"/>
+                    <a:srcRect/>
+                    <a:stretch>
+                      <a:fillRect/>
+                    </a:stretch>
+                  </pic:blipFill>
+                  <pic:spPr bwMode="auto">
+                    <a:xfrm>
+                      <a:off x="0" y="0"/>
+                      <a:ext cx="4389120" cy="1706880"/>
+                    </a:xfrm>
+                    <a:prstGeom prst="rect">
+                      <a:avLst/>
+                    </a:prstGeom>
+                  </pic:spPr>
+                </pic:pic>
+              </a:graphicData>
+            </a:graphic>
+          </wp:inline>
+        </w:drawing>
       </w:r>
     </w:p>
     <w:p>
@@ -5609,9 +5687,8 @@
       <w:r>
         <w:rPr>
           <w:rFonts w:ascii="Calibri" w:cs="Calibri" w:eastAsia="Calibri" w:hAnsi="Calibri"/>
-          <w:highlight w:val="yellow"/>
-        </w:rPr>
-        <w:t xml:space="preserve">[GBT_TOP_FEATURE_1]</w:t>
+        </w:rPr>
+        <w:t xml:space="preserve">DAY_OF_MONTH</w:t>
       </w:r>
       <w:r>
         <w:rPr>
@@ -5622,9 +5699,8 @@
       <w:r>
         <w:rPr>
           <w:rFonts w:ascii="Calibri" w:cs="Calibri" w:eastAsia="Calibri" w:hAnsi="Calibri"/>
-          <w:highlight w:val="yellow"/>
-        </w:rPr>
-        <w:t xml:space="preserve">[GBT_TOP_FEATURE_2]</w:t>
+        </w:rPr>
+        <w:t xml:space="preserve">DAYS_TO_HOLIDAY</w:t>
       </w:r>
       <w:r>
         <w:rPr>
@@ -5635,45 +5711,61 @@
       <w:r>
         <w:rPr>
           <w:rFonts w:ascii="Calibri" w:cs="Calibri" w:eastAsia="Calibri" w:hAnsi="Calibri"/>
-          <w:highlight w:val="yellow"/>
-        </w:rPr>
-        <w:t xml:space="preserve">[GBT_TOP_FEATURE_3]</w:t>
-      </w:r>
-      <w:r>
-        <w:rPr>
-          <w:rFonts w:ascii="Calibri" w:cs="Calibri" w:eastAsia="Calibri" w:hAnsi="Calibri"/>
-        </w:rPr>
-        <w:t xml:space="preserve">. Because impurity-based importance can favour continuous features, I also ran a permutation test (shuffling one feature and measuring the drop in ROC-AUC), which is saved as figure 12 in the notebook outputs. </w:t>
-      </w:r>
-      <w:r>
-        <w:rPr>
-          <w:rFonts w:ascii="Calibri" w:cs="Calibri" w:eastAsia="Calibri" w:hAnsi="Calibri"/>
-          <w:i/>
-          <w:iCs/>
-          <w:color w:val="7F6000"/>
-          <w:highlight w:val="yellow"/>
-        </w:rPr>
-        <w:t xml:space="preserve">[CHECK: say whether permutation importance agrees with impurity importance.]</w:t>
-      </w:r>
-    </w:p>
-    <w:p>
-      <w:pPr>
-        <w:pBdr>
-          <w:top w:val="single" w:color="BFBFBF" w:sz="4"/>
-          <w:left w:val="single" w:color="BFBFBF" w:sz="4"/>
-          <w:bottom w:val="single" w:color="BFBFBF" w:sz="4"/>
-          <w:right w:val="single" w:color="BFBFBF" w:sz="4"/>
-        </w:pBdr>
-        <w:shd w:fill="FFF9E6" w:color="auto" w:val="clear"/>
+        </w:rPr>
+        <w:t xml:space="preserve">SCHED_TURNAROUND_MIN</w:t>
+      </w:r>
+      <w:r>
+        <w:rPr>
+          <w:rFonts w:ascii="Calibri" w:cs="Calibri" w:eastAsia="Calibri" w:hAnsi="Calibri"/>
+        </w:rPr>
+        <w:t xml:space="preserve">. Because impurity-based importance can favour continuous features, I also ran a permutation test (shuffling one feature and measuring the drop in ROC-AUC), shown in Figure 11. It partly agrees: the origin-airport-by-hour delay rate (TE_ORIGIN_HOUR) and the scheduled turnaround matter most, while the calendar features fall back.</w:t>
+      </w:r>
+    </w:p>
+    <w:p>
+      <w:pPr>
+        <w:keepNext/>
         <w:spacing w:before="120"/>
         <w:jc w:val="center"/>
       </w:pPr>
       <w:r>
-        <w:rPr>
-          <w:rFonts w:ascii="Calibri" w:cs="Calibri" w:eastAsia="Calibri" w:hAnsi="Calibri"/>
-          <w:highlight w:val="yellow"/>
-        </w:rPr>
-        <w:t xml:space="preserve">[Insert figure: outputs/figures/11_feature_importance.png]</w:t>
+        <w:drawing>
+          <wp:inline distT="0" distB="0" distL="0" distR="0">
+            <wp:extent cx="5669280" cy="2054638"/>
+            <wp:effectExtent t="0" r="0" b="0" l="0"/>
+            <wp:docPr id="21" name="11_feature_importance.png" descr="Figure 10. Top features: Logistic Regression coefficients (left), Random Forest and GBT importances." title="Figure 10. Top features: Logistic Regression coefficients (left), Random Forest and GBT importances."/>
+            <wp:cNvGraphicFramePr>
+              <a:graphicFrameLocks xmlns:a="http://schemas.openxmlformats.org/drawingml/2006/main" noChangeAspect="1"/>
+            </wp:cNvGraphicFramePr>
+            <a:graphic xmlns:a="http://schemas.openxmlformats.org/drawingml/2006/main">
+              <a:graphicData uri="http://schemas.openxmlformats.org/drawingml/2006/picture">
+                <pic:pic xmlns:pic="http://schemas.openxmlformats.org/drawingml/2006/picture">
+                  <pic:nvPicPr>
+                    <pic:cNvPr id="0" name="" descr=""/>
+                    <pic:cNvPicPr>
+                      <a:picLocks noChangeAspect="1" noChangeArrowheads="1"/>
+                    </pic:cNvPicPr>
+                  </pic:nvPicPr>
+                  <pic:blipFill>
+                    <a:blip r:embed="rId17" cstate="none"/>
+                    <a:srcRect/>
+                    <a:stretch>
+                      <a:fillRect/>
+                    </a:stretch>
+                  </pic:blipFill>
+                  <pic:spPr bwMode="auto">
+                    <a:xfrm>
+                      <a:off x="0" y="0"/>
+                      <a:ext cx="5669280" cy="2054638"/>
+                    </a:xfrm>
+                    <a:prstGeom prst="rect">
+                      <a:avLst/>
+                    </a:prstGeom>
+                  </pic:spPr>
+                </pic:pic>
+              </a:graphicData>
+            </a:graphic>
+          </wp:inline>
+        </w:drawing>
       </w:r>
     </w:p>
     <w:p>
@@ -5691,6 +5783,70 @@
           <w:szCs w:val="18"/>
         </w:rPr>
         <w:t xml:space="preserve">Figure 10. Top features: Logistic Regression coefficients (left), Random Forest and GBT importances.</w:t>
+      </w:r>
+    </w:p>
+    <w:p>
+      <w:pPr>
+        <w:keepNext/>
+        <w:spacing w:before="120"/>
+        <w:jc w:val="center"/>
+      </w:pPr>
+      <w:r>
+        <w:drawing>
+          <wp:inline distT="0" distB="0" distL="0" distR="0">
+            <wp:extent cx="4206240" cy="2163497"/>
+            <wp:effectExtent t="0" r="0" b="0" l="0"/>
+            <wp:docPr id="22" name="12_gbt_permutation_importance.png" descr="Figure 11. GBT permutation importance: drop in test ROC-AUC when each feature is shuffled." title="Figure 11. GBT permutation importance: drop in test ROC-AUC when each feature is shuffled."/>
+            <wp:cNvGraphicFramePr>
+              <a:graphicFrameLocks xmlns:a="http://schemas.openxmlformats.org/drawingml/2006/main" noChangeAspect="1"/>
+            </wp:cNvGraphicFramePr>
+            <a:graphic xmlns:a="http://schemas.openxmlformats.org/drawingml/2006/main">
+              <a:graphicData uri="http://schemas.openxmlformats.org/drawingml/2006/picture">
+                <pic:pic xmlns:pic="http://schemas.openxmlformats.org/drawingml/2006/picture">
+                  <pic:nvPicPr>
+                    <pic:cNvPr id="0" name="" descr=""/>
+                    <pic:cNvPicPr>
+                      <a:picLocks noChangeAspect="1" noChangeArrowheads="1"/>
+                    </pic:cNvPicPr>
+                  </pic:nvPicPr>
+                  <pic:blipFill>
+                    <a:blip r:embed="rId18" cstate="none"/>
+                    <a:srcRect/>
+                    <a:stretch>
+                      <a:fillRect/>
+                    </a:stretch>
+                  </pic:blipFill>
+                  <pic:spPr bwMode="auto">
+                    <a:xfrm>
+                      <a:off x="0" y="0"/>
+                      <a:ext cx="4206240" cy="2163497"/>
+                    </a:xfrm>
+                    <a:prstGeom prst="rect">
+                      <a:avLst/>
+                    </a:prstGeom>
+                  </pic:spPr>
+                </pic:pic>
+              </a:graphicData>
+            </a:graphic>
+          </wp:inline>
+        </w:drawing>
+      </w:r>
+    </w:p>
+    <w:p>
+      <w:pPr>
+        <w:spacing w:after="200" w:before="60"/>
+        <w:jc w:val="center"/>
+      </w:pPr>
+      <w:r>
+        <w:rPr>
+          <w:rFonts w:ascii="Calibri" w:cs="Calibri" w:eastAsia="Calibri" w:hAnsi="Calibri"/>
+          <w:i/>
+          <w:iCs/>
+          <w:color w:val="595959"/>
+          <w:sz w:val="18"/>
+          <w:szCs w:val="18"/>
+        </w:rPr>
+        <w:t xml:space="preserve">Figure 11. GBT permutation importance: drop in test ROC-AUC when each feature is shuffled.</w:t>
       </w:r>
     </w:p>
     <w:p>
@@ -5986,9 +6142,8 @@
                 <w:bCs w:val="false"/>
                 <w:sz w:val="18"/>
                 <w:szCs w:val="18"/>
-                <w:highlight w:val="yellow"/>
-              </w:rPr>
-              <w:t xml:space="preserve">[LR_ROC_AUC]</w:t>
+              </w:rPr>
+              <w:t xml:space="preserve">0.676</w:t>
             </w:r>
           </w:p>
         </w:tc>
@@ -6021,9 +6176,8 @@
                 <w:bCs w:val="false"/>
                 <w:sz w:val="18"/>
                 <w:szCs w:val="18"/>
-                <w:highlight w:val="yellow"/>
-              </w:rPr>
-              <w:t xml:space="preserve">[LR_TEMPORAL_ROC_AUC]</w:t>
+              </w:rPr>
+              <w:t xml:space="preserve">0.603</w:t>
             </w:r>
           </w:p>
         </w:tc>
@@ -6056,9 +6210,8 @@
                 <w:bCs w:val="false"/>
                 <w:sz w:val="18"/>
                 <w:szCs w:val="18"/>
-                <w:highlight w:val="yellow"/>
-              </w:rPr>
-              <w:t xml:space="preserve">[LR_F1]</w:t>
+              </w:rPr>
+              <w:t xml:space="preserve">0.431</w:t>
             </w:r>
           </w:p>
         </w:tc>
@@ -6091,9 +6244,8 @@
                 <w:bCs w:val="false"/>
                 <w:sz w:val="18"/>
                 <w:szCs w:val="18"/>
-                <w:highlight w:val="yellow"/>
-              </w:rPr>
-              <w:t xml:space="preserve">[LR_TEMPORAL_F1]</w:t>
+              </w:rPr>
+              <w:t xml:space="preserve">0.130</w:t>
             </w:r>
           </w:p>
         </w:tc>
@@ -6165,9 +6317,8 @@
                 <w:bCs w:val="false"/>
                 <w:sz w:val="18"/>
                 <w:szCs w:val="18"/>
-                <w:highlight w:val="yellow"/>
-              </w:rPr>
-              <w:t xml:space="preserve">[RF_ROC_AUC]</w:t>
+              </w:rPr>
+              <w:t xml:space="preserve">0.715</w:t>
             </w:r>
           </w:p>
         </w:tc>
@@ -6200,9 +6351,8 @@
                 <w:bCs w:val="false"/>
                 <w:sz w:val="18"/>
                 <w:szCs w:val="18"/>
-                <w:highlight w:val="yellow"/>
-              </w:rPr>
-              <w:t xml:space="preserve">[RF_TEMPORAL_ROC_AUC]</w:t>
+              </w:rPr>
+              <w:t xml:space="preserve">0.672</w:t>
             </w:r>
           </w:p>
         </w:tc>
@@ -6235,9 +6385,8 @@
                 <w:bCs w:val="false"/>
                 <w:sz w:val="18"/>
                 <w:szCs w:val="18"/>
-                <w:highlight w:val="yellow"/>
-              </w:rPr>
-              <w:t xml:space="preserve">[RF_F1]</w:t>
+              </w:rPr>
+              <w:t xml:space="preserve">0.460</w:t>
             </w:r>
           </w:p>
         </w:tc>
@@ -6270,9 +6419,8 @@
                 <w:bCs w:val="false"/>
                 <w:sz w:val="18"/>
                 <w:szCs w:val="18"/>
-                <w:highlight w:val="yellow"/>
-              </w:rPr>
-              <w:t xml:space="preserve">[RF_TEMPORAL_F1]</w:t>
+              </w:rPr>
+              <w:t xml:space="preserve">0.402</w:t>
             </w:r>
           </w:p>
         </w:tc>
@@ -6344,9 +6492,8 @@
                 <w:bCs w:val="false"/>
                 <w:sz w:val="18"/>
                 <w:szCs w:val="18"/>
-                <w:highlight w:val="yellow"/>
-              </w:rPr>
-              <w:t xml:space="preserve">[GBT_ROC_AUC]</w:t>
+              </w:rPr>
+              <w:t xml:space="preserve">0.735</w:t>
             </w:r>
           </w:p>
         </w:tc>
@@ -6379,9 +6526,8 @@
                 <w:bCs w:val="false"/>
                 <w:sz w:val="18"/>
                 <w:szCs w:val="18"/>
-                <w:highlight w:val="yellow"/>
-              </w:rPr>
-              <w:t xml:space="preserve">[GBT_TEMPORAL_ROC_AUC]</w:t>
+              </w:rPr>
+              <w:t xml:space="preserve">0.679</w:t>
             </w:r>
           </w:p>
         </w:tc>
@@ -6414,9 +6560,8 @@
                 <w:bCs w:val="false"/>
                 <w:sz w:val="18"/>
                 <w:szCs w:val="18"/>
-                <w:highlight w:val="yellow"/>
-              </w:rPr>
-              <w:t xml:space="preserve">[GBT_F1]</w:t>
+              </w:rPr>
+              <w:t xml:space="preserve">0.479</w:t>
             </w:r>
           </w:p>
         </w:tc>
@@ -6449,9 +6594,8 @@
                 <w:bCs w:val="false"/>
                 <w:sz w:val="18"/>
                 <w:szCs w:val="18"/>
-                <w:highlight w:val="yellow"/>
-              </w:rPr>
-              <w:t xml:space="preserve">[GBT_TEMPORAL_F1]</w:t>
+              </w:rPr>
+              <w:t xml:space="preserve">0.377</w:t>
             </w:r>
           </w:p>
         </w:tc>
@@ -6496,7 +6640,19 @@
         <w:rPr>
           <w:rFonts w:ascii="Calibri" w:cs="Calibri" w:eastAsia="Calibri" w:hAnsi="Calibri"/>
         </w:rPr>
-        <w:t xml:space="preserve">The first lesson is that the baseline matters: without it, around 80% accuracy looks good, when it is roughly what doing nothing achieves. F1, recall and PR-AUC tell a more honest story. The second is that the threshold is a business decision. An airline pre-positioning spare crews might accept more false alarms to catch more delays, while a passenger alert needs higher precision. Results at both 0.5 and the tuned threshold are saved in model_results_all.csv.</w:t>
+        <w:t xml:space="preserve">First, the baseline matters: doing nothing already gives </w:t>
+      </w:r>
+      <w:r>
+        <w:rPr>
+          <w:rFonts w:ascii="Calibri" w:cs="Calibri" w:eastAsia="Calibri" w:hAnsi="Calibri"/>
+        </w:rPr>
+        <w:t xml:space="preserve">77.70%</w:t>
+      </w:r>
+      <w:r>
+        <w:rPr>
+          <w:rFonts w:ascii="Calibri" w:cs="Calibri" w:eastAsia="Calibri" w:hAnsi="Calibri"/>
+        </w:rPr>
+        <w:t xml:space="preserve"> accuracy, so F1, recall and PR-AUC are the honest measures. Second, the threshold is a business decision. An airline pre-positioning spare crews might accept more false alarms to catch more delays, while a passenger alert needs higher precision. Results at both 0.5 and the tuned threshold are saved in model_results_all.csv.</w:t>
       </w:r>
     </w:p>
     <w:p>
@@ -6507,18 +6663,44 @@
       <w:r>
         <w:rPr>
           <w:rFonts w:ascii="Calibri" w:cs="Calibri" w:eastAsia="Calibri" w:hAnsi="Calibri"/>
-          <w:i/>
-          <w:iCs/>
-          <w:color w:val="7F6000"/>
-          <w:highlight w:val="yellow"/>
-        </w:rPr>
-        <w:t xml:space="preserve">[CHECK: compare the models. Typical points: whether the tree models' non-linear interactions helped compared with Logistic Regression; whether GBT's accuracy gain justifies its longer, harder-to-parallelise training; and how large the drop from random to temporal evaluation was.]</w:t>
-      </w:r>
-      <w:r>
-        <w:rPr>
-          <w:rFonts w:ascii="Calibri" w:cs="Calibri" w:eastAsia="Calibri" w:hAnsi="Calibri"/>
-        </w:rPr>
-        <w:t xml:space="preserve"> A drop on the temporal split is expected, because a random split lets the model learn from the same days (storms, holiday weeks) that appear in the test set; the temporal figure is the realistic one.</w:t>
+        </w:rPr>
+        <w:t xml:space="preserve">The temporal test is the most important result. ROC-AUC fell to </w:t>
+      </w:r>
+      <w:r>
+        <w:rPr>
+          <w:rFonts w:ascii="Calibri" w:cs="Calibri" w:eastAsia="Calibri" w:hAnsi="Calibri"/>
+        </w:rPr>
+        <w:t xml:space="preserve">0.679</w:t>
+      </w:r>
+      <w:r>
+        <w:rPr>
+          <w:rFonts w:ascii="Calibri" w:cs="Calibri" w:eastAsia="Calibri" w:hAnsi="Calibri"/>
+        </w:rPr>
+        <w:t xml:space="preserve"> for GBT and </w:t>
+      </w:r>
+      <w:r>
+        <w:rPr>
+          <w:rFonts w:ascii="Calibri" w:cs="Calibri" w:eastAsia="Calibri" w:hAnsi="Calibri"/>
+        </w:rPr>
+        <w:t xml:space="preserve">0.672</w:t>
+      </w:r>
+      <w:r>
+        <w:rPr>
+          <w:rFonts w:ascii="Calibri" w:cs="Calibri" w:eastAsia="Calibri" w:hAnsi="Calibri"/>
+        </w:rPr>
+        <w:t xml:space="preserve"> for Random Forest, and Logistic Regression collapsed (recall </w:t>
+      </w:r>
+      <w:r>
+        <w:rPr>
+          <w:rFonts w:ascii="Calibri" w:cs="Calibri" w:eastAsia="Calibri" w:hAnsi="Calibri"/>
+        </w:rPr>
+        <w:t xml:space="preserve">0.079</w:t>
+      </w:r>
+      <w:r>
+        <w:rPr>
+          <w:rFonts w:ascii="Calibri" w:cs="Calibri" w:eastAsia="Calibri" w:hAnsi="Calibri"/>
+        </w:rPr>
+        <w:t xml:space="preserve">) because October to December lie outside the months it was trained on and its linear month terms extrapolate badly. The high impurity importance of day-of-month and holiday distance suggests the random split let the trees memorise specific bad days, which a temporal split cannot reward. The temporal figure is therefore the honest estimate for real use.</w:t>
       </w:r>
     </w:p>
     <w:p>
@@ -6644,9 +6826,8 @@
       <w:r>
         <w:rPr>
           <w:rFonts w:ascii="Calibri" w:cs="Calibri" w:eastAsia="Calibri" w:hAnsi="Calibri"/>
-          <w:highlight w:val="yellow"/>
-        </w:rPr>
-        <w:t xml:space="preserve">[N_CORES]</w:t>
+        </w:rPr>
+        <w:t xml:space="preserve">2</w:t>
       </w:r>
       <w:r>
         <w:rPr>
@@ -6706,9 +6887,8 @@
       <w:r>
         <w:rPr>
           <w:rFonts w:ascii="Calibri" w:cs="Calibri" w:eastAsia="Calibri" w:hAnsi="Calibri"/>
-          <w:highlight w:val="yellow"/>
-        </w:rPr>
-        <w:t xml:space="preserve">[RAW_ROWS]</w:t>
+        </w:rPr>
+        <w:t xml:space="preserve">7,001,619</w:t>
       </w:r>
       <w:r>
         <w:rPr>
@@ -6719,9 +6899,8 @@
       <w:r>
         <w:rPr>
           <w:rFonts w:ascii="Calibri" w:cs="Calibri" w:eastAsia="Calibri" w:hAnsi="Calibri"/>
-          <w:highlight w:val="yellow"/>
-        </w:rPr>
-        <w:t xml:space="preserve">[BEST_F1_MODEL]</w:t>
+        </w:rPr>
+        <w:t xml:space="preserve">Gradient-Boosted Trees</w:t>
       </w:r>
       <w:r>
         <w:rPr>
@@ -6732,9 +6911,8 @@
       <w:r>
         <w:rPr>
           <w:rFonts w:ascii="Calibri" w:cs="Calibri" w:eastAsia="Calibri" w:hAnsi="Calibri"/>
-          <w:highlight w:val="yellow"/>
-        </w:rPr>
-        <w:t xml:space="preserve">[BEST_F1_VALUE]</w:t>
+        </w:rPr>
+        <w:t xml:space="preserve">0.479</w:t>
       </w:r>
       <w:r>
         <w:rPr>
@@ -6752,7 +6930,7 @@
         <w:rPr>
           <w:rFonts w:ascii="Calibri" w:cs="Calibri" w:eastAsia="Calibri" w:hAnsi="Calibri"/>
         </w:rPr>
-        <w:t xml:space="preserve">For future work, I would (1) join hourly NOAA weather forecasts for origin and destination; (2) use out-of-fold target encoding; (3) try XGBoost or LightGBM on Spark with GPU acceleration; (4) run on a Dataproc cluster with the full training set and larger tuning grids; and (5) use Spark Structured Streaming to update predictions on the day as upstream flights report delays, which is where the biggest accuracy gains are likely to be.</w:t>
+        <w:t xml:space="preserve">Next, I would (1) add hourly NOAA weather forecasts, the biggest missing signal; (2) use out-of-fold target encoding; (3) try XGBoost on Spark with GPUs; (4) train on the full data on a Dataproc cluster; and (5) use Structured Streaming to update predictions on the day as earlier flights report delays.</w:t>
       </w:r>
     </w:p>
     <w:p>

</xml_diff>

<commit_message>
Merge useful points from the ChatGPT review versions
Name on title page/slide/script, historical-cost caveat, cautious
explanation of the Logistic Regression temporal collapse, 'importance is
not causation', and validate-before-extending future work. Notes and
slides stay consistent (checked for withdrawn claims).

Co-Authored-By: Claude Opus 5.5 <noreply@anthropic.com>
Claude-Session: https://claude.ai/code/session_013cmZjtFTpWtFMxYtK982h3
</commit_message>
<xml_diff>
--- a/bdmla-flight-delay/report/BDMLA_CW2_Part2_Flight_Delay_Report.docx
+++ b/bdmla-flight-delay/report/BDMLA_CW2_Part2_Flight_Delay_Report.docx
@@ -84,6 +84,20 @@
           <w:b/>
           <w:bCs/>
         </w:rPr>
+        <w:t xml:space="preserve">Student:</w:t>
+      </w:r>
+      <w:r>
+        <w:rPr>
+          <w:rFonts w:ascii="Calibri" w:cs="Calibri" w:eastAsia="Calibri" w:hAnsi="Calibri"/>
+        </w:rPr>
+        <w:t xml:space="preserve"> Kelvin Soh      </w:t>
+      </w:r>
+      <w:r>
+        <w:rPr>
+          <w:rFonts w:ascii="Calibri" w:cs="Calibri" w:eastAsia="Calibri" w:hAnsi="Calibri"/>
+          <w:b/>
+          <w:bCs/>
+        </w:rPr>
         <w:t xml:space="preserve">Student ID:</w:t>
       </w:r>
       <w:r>
@@ -143,7 +157,7 @@
         <w:rPr>
           <w:rFonts w:ascii="Calibri" w:cs="Calibri" w:eastAsia="Calibri" w:hAnsi="Calibri"/>
         </w:rPr>
-        <w:t xml:space="preserve">2,179</w:t>
+        <w:t xml:space="preserve">2,228</w:t>
       </w:r>
       <w:r>
         <w:rPr>
@@ -920,7 +934,7 @@
         <w:rPr>
           <w:rFonts w:ascii="Calibri" w:cs="Calibri" w:eastAsia="Calibri" w:hAnsi="Calibri"/>
         </w:rPr>
-        <w:t xml:space="preserve">Flight delays cost the U.S. economy an estimated $32.9 billion in 2007 (Ball et al., 2010). The Bureau of Transportation Statistics (BTS) counts a flight as </w:t>
+        <w:t xml:space="preserve">Flight delays cost the U.S. economy an estimated $32.9 billion in 2007 (Ball et al., 2010); this historical figure gives context rather than a current cost. The Bureau of Transportation Statistics (BTS) counts a flight as </w:t>
       </w:r>
       <w:r>
         <w:rPr>
@@ -5749,7 +5763,7 @@
         <w:rPr>
           <w:rFonts w:ascii="Calibri" w:cs="Calibri" w:eastAsia="Calibri" w:hAnsi="Calibri"/>
         </w:rPr>
-        <w:t xml:space="preserve">. Because impurity importance can favour continuous features, I also ran a permutation test (Figure 11). It partly agrees: the origin-airport-by-hour delay rate (TE_ORIGIN_HOUR) and the scheduled turnaround matter most.</w:t>
+        <w:t xml:space="preserve">. Because impurity importance can favour continuous features, I also ran a permutation test (Figure 11). It partly agrees: the origin-airport-by-hour delay rate (TE_ORIGIN_HOUR) and the scheduled turnaround matter most. Importance does not establish causation.</w:t>
       </w:r>
     </w:p>
     <w:p>
@@ -6755,7 +6769,7 @@
         <w:rPr>
           <w:rFonts w:ascii="Calibri" w:cs="Calibri" w:eastAsia="Calibri" w:hAnsi="Calibri"/>
         </w:rPr>
-        <w:t xml:space="preserve">), probably because its linear month terms extrapolate badly to unseen months. The high impurity importance of day-of-month and holiday distance suggests the trees partly learned specific bad days under the random split, which does not carry over.</w:t>
+        <w:t xml:space="preserve">); seasonal change and the way its linear month terms extrapolate to unseen months are possible explanations, but an ablation test would be needed to confirm the cause. The high impurity importance of day-of-month and holiday distance suggests the trees partly learned specific bad days under the random split, which does not carry over.</w:t>
       </w:r>
     </w:p>
     <w:p>
@@ -7058,7 +7072,7 @@
         <w:rPr>
           <w:rFonts w:ascii="Calibri" w:cs="Calibri" w:eastAsia="Calibri" w:hAnsi="Calibri"/>
         </w:rPr>
-        <w:t xml:space="preserve">Next, I would add hourly NOAA weather forecasts, use out-of-fold target encoding inside the CV pipeline, compare runs with and without class weights and threshold tuning, select temporal thresholds on an earlier month, and repeat the timing runs on a Dataproc cluster.</w:t>
+        <w:t xml:space="preserve">Before adding complexity, I would validate the existing method: use out-of-fold target encoding inside the CV pipeline, select temporal thresholds on an earlier month, audit the rotation features, and compare runs with and without class weights and threshold tuning. Only then would I add weather forecasts available at the prediction time and repeat the timing runs on a Dataproc cluster.</w:t>
       </w:r>
     </w:p>
     <w:p>

</xml_diff>

<commit_message>
Add result interpretation in the style of the lecturer's sample
- executed notebook: 26 markdown Interpretation cells after the key
  outputs (data quality, cleaning, EDA, encoding, each model, tuning,
  curves, confusion matrices, threshold, importance, temporal, scaling);
  code cells and outputs verified identical to the original run
- report: default-vs-tuned table (Table 4), interpretation of ROC/PR
  curves and confusion matrices; trimmed elsewhere (~2,260 words)

Co-Authored-By: Claude Opus 5.5 <noreply@anthropic.com>
Claude-Session: https://claude.ai/code/session_013cmZjtFTpWtFMxYtK982h3
</commit_message>
<xml_diff>
--- a/bdmla-flight-delay/report/BDMLA_CW2_Part2_Flight_Delay_Report.docx
+++ b/bdmla-flight-delay/report/BDMLA_CW2_Part2_Flight_Delay_Report.docx
@@ -157,7 +157,7 @@
         <w:rPr>
           <w:rFonts w:ascii="Calibri" w:cs="Calibri" w:eastAsia="Calibri" w:hAnsi="Calibri"/>
         </w:rPr>
-        <w:t xml:space="preserve">2,228</w:t>
+        <w:t xml:space="preserve">2,258</w:t>
       </w:r>
       <w:r>
         <w:rPr>
@@ -1105,7 +1105,7 @@
         <w:rPr>
           <w:rFonts w:ascii="Calibri" w:cs="Calibri" w:eastAsia="Calibri" w:hAnsi="Calibri"/>
         </w:rPr>
-        <w:t xml:space="preserve">Sternberg et al. (2017) found that most delay studies use classification, with tree models and congestion features recurring. Rebollo and Balakrishnan (2014) and Gui et al. (2020) found random forests strong, and Belcastro et al. (2016) built a scalable MapReduce pipeline joining flight and weather data. Both random forests (Breiman, 2001) and gradient boosting (Friedman, 2001) are available in Spark MLlib (Meng et al., 2016). This project adds a strict pre-departure feature policy, aircraft-rotation features and a temporal evaluation on the latest full year.</w:t>
+        <w:t xml:space="preserve">Sternberg et al. (2017) found that most delay studies use classification, with tree models and congestion features recurring; Rebollo and Balakrishnan (2014) and Gui et al. (2020) found random forests strong, and Belcastro et al. (2016) joined flight and weather data in a scalable MapReduce pipeline. Both random forests (Breiman, 2001) and gradient boosting (Friedman, 2001) are available in Spark MLlib (Meng et al., 2016). This project adds aircraft-rotation features and a temporal evaluation on the latest full year.</w:t>
       </w:r>
     </w:p>
     <w:p>
@@ -1157,19 +1157,7 @@
         <w:rPr>
           <w:rFonts w:ascii="Calibri" w:cs="Calibri" w:eastAsia="Calibri" w:hAnsi="Calibri"/>
         </w:rPr>
-        <w:t xml:space="preserve"> table (Bureau of Transportation Statistics, 2026): one row per domestic flight, with date, carrier, tail number, airports, scheduled and actual times, cancellation and diversion flags, and delay minutes by cause. I downloaded the twelve 2025 monthly CSVs (220 to 280 MB each, about 3 GB) to Google Drive. At </w:t>
-      </w:r>
-      <w:r>
-        <w:rPr>
-          <w:rFonts w:ascii="Calibri" w:cs="Calibri" w:eastAsia="Calibri" w:hAnsi="Calibri"/>
-        </w:rPr>
-        <w:t xml:space="preserve">7,001,619</w:t>
-      </w:r>
-      <w:r>
-        <w:rPr>
-          <w:rFonts w:ascii="Calibri" w:cs="Calibri" w:eastAsia="Calibri" w:hAnsi="Calibri"/>
-        </w:rPr>
-        <w:t xml:space="preserve"> rows with an industry-standard label, it is large enough to justify Spark while remaining workable in Colab.</w:t>
+        <w:t xml:space="preserve"> table (Bureau of Transportation Statistics, 2026): one row per domestic flight, with carrier, tail number, airports, scheduled and actual times, cancellation and diversion flags, and delay minutes by cause. I downloaded the twelve 2025 monthly CSVs (about 3 GB) to Google Drive.</w:t>
       </w:r>
     </w:p>
     <w:p>
@@ -2403,33 +2391,7 @@
         <w:rPr>
           <w:rFonts w:ascii="Calibri" w:cs="Calibri" w:eastAsia="Calibri" w:hAnsi="Calibri"/>
         </w:rPr>
-        <w:t xml:space="preserve">Spark turns a job into a DAG of stages, each made of parallel tasks, one per data partition (Zaharia et al., 2016). Because transformations are lazy, the Catalyst optimiser sees the whole query and can push the column allow-list down to the file scan (Armbrust et al., 2015). In Colab the driver and executor share one VM (</w:t>
-      </w:r>
-      <w:r>
-        <w:rPr>
-          <w:rFonts w:ascii="Calibri" w:cs="Calibri" w:eastAsia="Calibri" w:hAnsi="Calibri"/>
-        </w:rPr>
-        <w:t xml:space="preserve">2</w:t>
-      </w:r>
-      <w:r>
-        <w:rPr>
-          <w:rFonts w:ascii="Calibri" w:cs="Calibri" w:eastAsia="Calibri" w:hAnsi="Calibri"/>
-        </w:rPr>
-        <w:t xml:space="preserve"> cores) in </w:t>
-      </w:r>
-      <w:r>
-        <w:rPr>
-          <w:rFonts w:ascii="Calibri" w:cs="Calibri" w:eastAsia="Calibri" w:hAnsi="Calibri"/>
-          <w:i/>
-          <w:iCs/>
-        </w:rPr>
-        <w:t xml:space="preserve">local mode</w:t>
-      </w:r>
-      <w:r>
-        <w:rPr>
-          <w:rFonts w:ascii="Calibri" w:cs="Calibri" w:eastAsia="Calibri" w:hAnsi="Calibri"/>
-        </w:rPr>
-        <w:t xml:space="preserve"> (Figure 5). The same code runs on a YARN or Kubernetes cluster by changing the master URL.</w:t>
+        <w:t xml:space="preserve">Spark turns a job into stages of parallel tasks, one per data partition (Zaharia et al., 2016), and its Catalyst optimiser pushes the column allow-list down to the file scan (Armbrust et al., 2015). In Colab the driver and executor share one two-core VM in local mode (Figure 5); the same code runs on a cluster by changing the master URL.</w:t>
       </w:r>
     </w:p>
     <w:p>
@@ -2949,7 +2911,7 @@
         <w:rPr>
           <w:rFonts w:ascii="Calibri" w:cs="Calibri" w:eastAsia="Calibri" w:hAnsi="Calibri"/>
         </w:rPr>
-        <w:t xml:space="preserve">The turnaround is the difference between two scheduled times at the same airport (the previous arrival and the next departure), so both are in that airport's local time, as BTS records them. Legs are ordered by local departure time within each calendar day. This could misorder rare cases with large time-zone differences, it does not check that the previous destination matches the current origin, and a leg whose previous arrival crosses midnight is treated as having no previous leg.</w:t>
+        <w:t xml:space="preserve">The turnaround subtracts two scheduled times at the same airport, so both are in that airport's local time. Legs are ordered by local departure time within each day, which could misorder rare large time-zone cases; there is no check that the previous destination matches the current origin, and a leg whose previous arrival crosses midnight is treated as having no previous leg.</w:t>
       </w:r>
     </w:p>
     <w:p>
@@ -3084,7 +3046,7 @@
         <w:rPr>
           <w:rFonts w:ascii="Calibri" w:cs="Calibri" w:eastAsia="Calibri" w:hAnsi="Calibri"/>
         </w:rPr>
-        <w:t xml:space="preserve">, so a majority-class baseline is reported. The useful measures are </w:t>
+        <w:t xml:space="preserve">, so a majority-class baseline is reported alongside </w:t>
       </w:r>
       <w:r>
         <w:rPr>
@@ -3112,7 +3074,7 @@
         <w:rPr>
           <w:rFonts w:ascii="Calibri" w:cs="Calibri" w:eastAsia="Calibri" w:hAnsi="Calibri"/>
         </w:rPr>
-        <w:t xml:space="preserve"> (delays caught) and </w:t>
+        <w:t xml:space="preserve"> (delays caught), </w:t>
       </w:r>
       <w:r>
         <w:rPr>
@@ -3126,7 +3088,7 @@
         <w:rPr>
           <w:rFonts w:ascii="Calibri" w:cs="Calibri" w:eastAsia="Calibri" w:hAnsi="Calibri"/>
         </w:rPr>
-        <w:t xml:space="preserve">, their balance, plus </w:t>
+        <w:t xml:space="preserve">, </w:t>
       </w:r>
       <w:r>
         <w:rPr>
@@ -3140,7 +3102,7 @@
         <w:rPr>
           <w:rFonts w:ascii="Calibri" w:cs="Calibri" w:eastAsia="Calibri" w:hAnsi="Calibri"/>
         </w:rPr>
-        <w:t xml:space="preserve"> for ranking across thresholds and </w:t>
+        <w:t xml:space="preserve"> and </w:t>
       </w:r>
       <w:r>
         <w:rPr>
@@ -3154,7 +3116,7 @@
         <w:rPr>
           <w:rFonts w:ascii="Calibri" w:cs="Calibri" w:eastAsia="Calibri" w:hAnsi="Calibri"/>
         </w:rPr>
-        <w:t xml:space="preserve">, which is more informative when positives are rare (Saito &amp; Rehmsmeier, 2015). Training time is included because scalability is part of the brief.</w:t>
+        <w:t xml:space="preserve">, which is more informative when positives are rare (Saito &amp; Rehmsmeier, 2015), plus training time.</w:t>
       </w:r>
     </w:p>
     <w:p>
@@ -5411,31 +5373,7 @@
         <w:rPr>
           <w:rFonts w:ascii="Calibri" w:cs="Calibri" w:eastAsia="Calibri" w:hAnsi="Calibri"/>
         </w:rPr>
-        <w:t xml:space="preserve">), which suggests that feature interactions help to predict delays. GBT beat Random Forest on every threshold-free metric in under a quarter of the training time; tuning lifted Random Forest from </w:t>
-      </w:r>
-      <w:r>
-        <w:rPr>
-          <w:rFonts w:ascii="Calibri" w:cs="Calibri" w:eastAsia="Calibri" w:hAnsi="Calibri"/>
-        </w:rPr>
-        <w:t xml:space="preserve">0.705</w:t>
-      </w:r>
-      <w:r>
-        <w:rPr>
-          <w:rFonts w:ascii="Calibri" w:cs="Calibri" w:eastAsia="Calibri" w:hAnsi="Calibri"/>
-        </w:rPr>
-        <w:t xml:space="preserve"> to </w:t>
-      </w:r>
-      <w:r>
-        <w:rPr>
-          <w:rFonts w:ascii="Calibri" w:cs="Calibri" w:eastAsia="Calibri" w:hAnsi="Calibri"/>
-        </w:rPr>
-        <w:t xml:space="preserve">0.715</w:t>
-      </w:r>
-      <w:r>
-        <w:rPr>
-          <w:rFonts w:ascii="Calibri" w:cs="Calibri" w:eastAsia="Calibri" w:hAnsi="Calibri"/>
-        </w:rPr>
-        <w:t xml:space="preserve"> but doubled its training time. In practical terms, GBT identifies about 60% of delayed flights (recall </w:t>
+        <w:t xml:space="preserve">), which suggests that feature interactions help to predict delays. GBT beat Random Forest on every threshold-free metric in under a quarter of the training time. In practical terms, GBT identifies about 60% of delayed flights (recall </w:t>
       </w:r>
       <w:r>
         <w:rPr>
@@ -5727,6 +5665,981 @@
         <w:rPr>
           <w:rFonts w:ascii="Calibri" w:cs="Calibri" w:eastAsia="Calibri" w:hAnsi="Calibri"/>
         </w:rPr>
+        <w:t xml:space="preserve">Figure 7 adds two details. The ROC curves never cross, so the ranking of the models holds at every threshold. The precision-recall curves show that for the riskiest 5 to 10% of flights the tree models are right 80 to 90% of the time, against about 55% for Logistic Regression, so a short high-risk list from GBT would be quite reliable. Figure 8 shows the cost of the chosen threshold: GBT flags about a third of all flights and raises about 1.5 false alarms for every delay it catches.</w:t>
+      </w:r>
+    </w:p>
+    <w:p>
+      <w:pPr>
+        <w:spacing w:after="140" w:line="288"/>
+        <w:jc w:val="both"/>
+      </w:pPr>
+      <w:r>
+        <w:rPr>
+          <w:rFonts w:ascii="Calibri" w:cs="Calibri" w:eastAsia="Calibri" w:hAnsi="Calibri"/>
+        </w:rPr>
+        <w:t xml:space="preserve">Table 4 shows what tuning added compared with each model's default settings. Only Random Forest improved, and it doubled its training time to do so, while tuned Random Forest still stayed behind default GBT. On this data the choice of algorithm mattered more than tuning.</w:t>
+      </w:r>
+    </w:p>
+    <w:tbl>
+      <w:tblPr>
+        <w:tblW w:type="dxa" w:w="8900"/>
+        <w:tblBorders>
+          <w:top w:val="single" w:color="auto" w:sz="4"/>
+          <w:left w:val="single" w:color="auto" w:sz="4"/>
+          <w:bottom w:val="single" w:color="auto" w:sz="4"/>
+          <w:right w:val="single" w:color="auto" w:sz="4"/>
+          <w:insideH w:val="single" w:color="auto" w:sz="4"/>
+          <w:insideV w:val="single" w:color="auto" w:sz="4"/>
+        </w:tblBorders>
+      </w:tblPr>
+      <w:tblGrid>
+        <w:gridCol w:w="2200"/>
+        <w:gridCol w:w="1250"/>
+        <w:gridCol w:w="1200"/>
+        <w:gridCol w:w="1050"/>
+        <w:gridCol w:w="950"/>
+        <w:gridCol w:w="2250"/>
+      </w:tblGrid>
+      <w:tr>
+        <w:trPr>
+          <w:cantSplit/>
+          <w:tblHeader/>
+        </w:trPr>
+        <w:tc>
+          <w:tcPr>
+            <w:tcW w:type="dxa" w:w="2200"/>
+            <w:tcBorders>
+              <w:top w:val="single" w:color="BFBFBF" w:sz="4"/>
+              <w:left w:val="single" w:color="BFBFBF" w:sz="4"/>
+              <w:bottom w:val="single" w:color="BFBFBF" w:sz="4"/>
+              <w:right w:val="single" w:color="BFBFBF" w:sz="4"/>
+            </w:tcBorders>
+            <w:shd w:fill="DCE6F2" w:color="auto" w:val="clear"/>
+            <w:tcMar>
+              <w:top w:type="dxa" w:w="60"/>
+              <w:left w:type="dxa" w:w="100"/>
+              <w:bottom w:type="dxa" w:w="60"/>
+              <w:right w:type="dxa" w:w="100"/>
+            </w:tcMar>
+          </w:tcPr>
+          <w:p>
+            <w:pPr>
+              <w:keepNext/>
+              <w:keepLines/>
+              <w:jc w:val="left"/>
+            </w:pPr>
+            <w:r>
+              <w:rPr>
+                <w:rFonts w:ascii="Calibri" w:cs="Calibri" w:eastAsia="Calibri" w:hAnsi="Calibri"/>
+                <w:b/>
+                <w:bCs/>
+                <w:sz w:val="18"/>
+                <w:szCs w:val="18"/>
+              </w:rPr>
+              <w:t xml:space="preserve">Model</w:t>
+            </w:r>
+          </w:p>
+        </w:tc>
+        <w:tc>
+          <w:tcPr>
+            <w:tcW w:type="dxa" w:w="1250"/>
+            <w:tcBorders>
+              <w:top w:val="single" w:color="BFBFBF" w:sz="4"/>
+              <w:left w:val="single" w:color="BFBFBF" w:sz="4"/>
+              <w:bottom w:val="single" w:color="BFBFBF" w:sz="4"/>
+              <w:right w:val="single" w:color="BFBFBF" w:sz="4"/>
+            </w:tcBorders>
+            <w:shd w:fill="DCE6F2" w:color="auto" w:val="clear"/>
+            <w:tcMar>
+              <w:top w:type="dxa" w:w="60"/>
+              <w:left w:type="dxa" w:w="100"/>
+              <w:bottom w:type="dxa" w:w="60"/>
+              <w:right w:type="dxa" w:w="100"/>
+            </w:tcMar>
+          </w:tcPr>
+          <w:p>
+            <w:pPr>
+              <w:keepNext/>
+              <w:keepLines/>
+              <w:jc w:val="left"/>
+            </w:pPr>
+            <w:r>
+              <w:rPr>
+                <w:rFonts w:ascii="Calibri" w:cs="Calibri" w:eastAsia="Calibri" w:hAnsi="Calibri"/>
+                <w:b/>
+                <w:bCs/>
+                <w:sz w:val="18"/>
+                <w:szCs w:val="18"/>
+              </w:rPr>
+              <w:t xml:space="preserve">Default ROC-AUC</w:t>
+            </w:r>
+          </w:p>
+        </w:tc>
+        <w:tc>
+          <w:tcPr>
+            <w:tcW w:type="dxa" w:w="1200"/>
+            <w:tcBorders>
+              <w:top w:val="single" w:color="BFBFBF" w:sz="4"/>
+              <w:left w:val="single" w:color="BFBFBF" w:sz="4"/>
+              <w:bottom w:val="single" w:color="BFBFBF" w:sz="4"/>
+              <w:right w:val="single" w:color="BFBFBF" w:sz="4"/>
+            </w:tcBorders>
+            <w:shd w:fill="DCE6F2" w:color="auto" w:val="clear"/>
+            <w:tcMar>
+              <w:top w:type="dxa" w:w="60"/>
+              <w:left w:type="dxa" w:w="100"/>
+              <w:bottom w:type="dxa" w:w="60"/>
+              <w:right w:type="dxa" w:w="100"/>
+            </w:tcMar>
+          </w:tcPr>
+          <w:p>
+            <w:pPr>
+              <w:keepNext/>
+              <w:keepLines/>
+              <w:jc w:val="left"/>
+            </w:pPr>
+            <w:r>
+              <w:rPr>
+                <w:rFonts w:ascii="Calibri" w:cs="Calibri" w:eastAsia="Calibri" w:hAnsi="Calibri"/>
+                <w:b/>
+                <w:bCs/>
+                <w:sz w:val="18"/>
+                <w:szCs w:val="18"/>
+              </w:rPr>
+              <w:t xml:space="preserve">Tuned ROC-AUC</w:t>
+            </w:r>
+          </w:p>
+        </w:tc>
+        <w:tc>
+          <w:tcPr>
+            <w:tcW w:type="dxa" w:w="1050"/>
+            <w:tcBorders>
+              <w:top w:val="single" w:color="BFBFBF" w:sz="4"/>
+              <w:left w:val="single" w:color="BFBFBF" w:sz="4"/>
+              <w:bottom w:val="single" w:color="BFBFBF" w:sz="4"/>
+              <w:right w:val="single" w:color="BFBFBF" w:sz="4"/>
+            </w:tcBorders>
+            <w:shd w:fill="DCE6F2" w:color="auto" w:val="clear"/>
+            <w:tcMar>
+              <w:top w:type="dxa" w:w="60"/>
+              <w:left w:type="dxa" w:w="100"/>
+              <w:bottom w:type="dxa" w:w="60"/>
+              <w:right w:type="dxa" w:w="100"/>
+            </w:tcMar>
+          </w:tcPr>
+          <w:p>
+            <w:pPr>
+              <w:keepNext/>
+              <w:keepLines/>
+              <w:jc w:val="left"/>
+            </w:pPr>
+            <w:r>
+              <w:rPr>
+                <w:rFonts w:ascii="Calibri" w:cs="Calibri" w:eastAsia="Calibri" w:hAnsi="Calibri"/>
+                <w:b/>
+                <w:bCs/>
+                <w:sz w:val="18"/>
+                <w:szCs w:val="18"/>
+              </w:rPr>
+              <w:t xml:space="preserve">Default F1</w:t>
+            </w:r>
+          </w:p>
+        </w:tc>
+        <w:tc>
+          <w:tcPr>
+            <w:tcW w:type="dxa" w:w="950"/>
+            <w:tcBorders>
+              <w:top w:val="single" w:color="BFBFBF" w:sz="4"/>
+              <w:left w:val="single" w:color="BFBFBF" w:sz="4"/>
+              <w:bottom w:val="single" w:color="BFBFBF" w:sz="4"/>
+              <w:right w:val="single" w:color="BFBFBF" w:sz="4"/>
+            </w:tcBorders>
+            <w:shd w:fill="DCE6F2" w:color="auto" w:val="clear"/>
+            <w:tcMar>
+              <w:top w:type="dxa" w:w="60"/>
+              <w:left w:type="dxa" w:w="100"/>
+              <w:bottom w:type="dxa" w:w="60"/>
+              <w:right w:type="dxa" w:w="100"/>
+            </w:tcMar>
+          </w:tcPr>
+          <w:p>
+            <w:pPr>
+              <w:keepNext/>
+              <w:keepLines/>
+              <w:jc w:val="left"/>
+            </w:pPr>
+            <w:r>
+              <w:rPr>
+                <w:rFonts w:ascii="Calibri" w:cs="Calibri" w:eastAsia="Calibri" w:hAnsi="Calibri"/>
+                <w:b/>
+                <w:bCs/>
+                <w:sz w:val="18"/>
+                <w:szCs w:val="18"/>
+              </w:rPr>
+              <w:t xml:space="preserve">Tuned F1</w:t>
+            </w:r>
+          </w:p>
+        </w:tc>
+        <w:tc>
+          <w:tcPr>
+            <w:tcW w:type="dxa" w:w="2250"/>
+            <w:tcBorders>
+              <w:top w:val="single" w:color="BFBFBF" w:sz="4"/>
+              <w:left w:val="single" w:color="BFBFBF" w:sz="4"/>
+              <w:bottom w:val="single" w:color="BFBFBF" w:sz="4"/>
+              <w:right w:val="single" w:color="BFBFBF" w:sz="4"/>
+            </w:tcBorders>
+            <w:shd w:fill="DCE6F2" w:color="auto" w:val="clear"/>
+            <w:tcMar>
+              <w:top w:type="dxa" w:w="60"/>
+              <w:left w:type="dxa" w:w="100"/>
+              <w:bottom w:type="dxa" w:w="60"/>
+              <w:right w:type="dxa" w:w="100"/>
+            </w:tcMar>
+          </w:tcPr>
+          <w:p>
+            <w:pPr>
+              <w:keepNext/>
+              <w:keepLines/>
+              <w:jc w:val="left"/>
+            </w:pPr>
+            <w:r>
+              <w:rPr>
+                <w:rFonts w:ascii="Calibri" w:cs="Calibri" w:eastAsia="Calibri" w:hAnsi="Calibri"/>
+                <w:b/>
+                <w:bCs/>
+                <w:sz w:val="18"/>
+                <w:szCs w:val="18"/>
+              </w:rPr>
+              <w:t xml:space="preserve">Train time (default → tuned)</w:t>
+            </w:r>
+          </w:p>
+        </w:tc>
+      </w:tr>
+      <w:tr>
+        <w:trPr>
+          <w:cantSplit/>
+        </w:trPr>
+        <w:tc>
+          <w:tcPr>
+            <w:tcW w:type="dxa" w:w="2200"/>
+            <w:tcBorders>
+              <w:top w:val="single" w:color="BFBFBF" w:sz="4"/>
+              <w:left w:val="single" w:color="BFBFBF" w:sz="4"/>
+              <w:bottom w:val="single" w:color="BFBFBF" w:sz="4"/>
+              <w:right w:val="single" w:color="BFBFBF" w:sz="4"/>
+            </w:tcBorders>
+            <w:tcMar>
+              <w:top w:type="dxa" w:w="60"/>
+              <w:left w:type="dxa" w:w="100"/>
+              <w:bottom w:type="dxa" w:w="60"/>
+              <w:right w:type="dxa" w:w="100"/>
+            </w:tcMar>
+          </w:tcPr>
+          <w:p>
+            <w:pPr>
+              <w:keepNext/>
+              <w:keepLines/>
+              <w:jc w:val="left"/>
+            </w:pPr>
+            <w:r>
+              <w:rPr>
+                <w:rFonts w:ascii="Calibri" w:cs="Calibri" w:eastAsia="Calibri" w:hAnsi="Calibri"/>
+                <w:b w:val="false"/>
+                <w:bCs w:val="false"/>
+                <w:sz w:val="18"/>
+                <w:szCs w:val="18"/>
+              </w:rPr>
+              <w:t xml:space="preserve">Logistic Regression</w:t>
+            </w:r>
+          </w:p>
+        </w:tc>
+        <w:tc>
+          <w:tcPr>
+            <w:tcW w:type="dxa" w:w="1250"/>
+            <w:tcBorders>
+              <w:top w:val="single" w:color="BFBFBF" w:sz="4"/>
+              <w:left w:val="single" w:color="BFBFBF" w:sz="4"/>
+              <w:bottom w:val="single" w:color="BFBFBF" w:sz="4"/>
+              <w:right w:val="single" w:color="BFBFBF" w:sz="4"/>
+            </w:tcBorders>
+            <w:tcMar>
+              <w:top w:type="dxa" w:w="60"/>
+              <w:left w:type="dxa" w:w="100"/>
+              <w:bottom w:type="dxa" w:w="60"/>
+              <w:right w:type="dxa" w:w="100"/>
+            </w:tcMar>
+          </w:tcPr>
+          <w:p>
+            <w:pPr>
+              <w:keepNext/>
+              <w:keepLines/>
+              <w:jc w:val="right"/>
+            </w:pPr>
+            <w:r>
+              <w:rPr>
+                <w:rFonts w:ascii="Calibri" w:cs="Calibri" w:eastAsia="Calibri" w:hAnsi="Calibri"/>
+                <w:b w:val="false"/>
+                <w:bCs w:val="false"/>
+                <w:sz w:val="18"/>
+                <w:szCs w:val="18"/>
+              </w:rPr>
+              <w:t xml:space="preserve">0.676</w:t>
+            </w:r>
+          </w:p>
+        </w:tc>
+        <w:tc>
+          <w:tcPr>
+            <w:tcW w:type="dxa" w:w="1200"/>
+            <w:tcBorders>
+              <w:top w:val="single" w:color="BFBFBF" w:sz="4"/>
+              <w:left w:val="single" w:color="BFBFBF" w:sz="4"/>
+              <w:bottom w:val="single" w:color="BFBFBF" w:sz="4"/>
+              <w:right w:val="single" w:color="BFBFBF" w:sz="4"/>
+            </w:tcBorders>
+            <w:tcMar>
+              <w:top w:type="dxa" w:w="60"/>
+              <w:left w:type="dxa" w:w="100"/>
+              <w:bottom w:type="dxa" w:w="60"/>
+              <w:right w:type="dxa" w:w="100"/>
+            </w:tcMar>
+          </w:tcPr>
+          <w:p>
+            <w:pPr>
+              <w:keepNext/>
+              <w:keepLines/>
+              <w:jc w:val="right"/>
+            </w:pPr>
+            <w:r>
+              <w:rPr>
+                <w:rFonts w:ascii="Calibri" w:cs="Calibri" w:eastAsia="Calibri" w:hAnsi="Calibri"/>
+                <w:b w:val="false"/>
+                <w:bCs w:val="false"/>
+                <w:sz w:val="18"/>
+                <w:szCs w:val="18"/>
+              </w:rPr>
+              <w:t xml:space="preserve">0.676</w:t>
+            </w:r>
+          </w:p>
+        </w:tc>
+        <w:tc>
+          <w:tcPr>
+            <w:tcW w:type="dxa" w:w="1050"/>
+            <w:tcBorders>
+              <w:top w:val="single" w:color="BFBFBF" w:sz="4"/>
+              <w:left w:val="single" w:color="BFBFBF" w:sz="4"/>
+              <w:bottom w:val="single" w:color="BFBFBF" w:sz="4"/>
+              <w:right w:val="single" w:color="BFBFBF" w:sz="4"/>
+            </w:tcBorders>
+            <w:tcMar>
+              <w:top w:type="dxa" w:w="60"/>
+              <w:left w:type="dxa" w:w="100"/>
+              <w:bottom w:type="dxa" w:w="60"/>
+              <w:right w:type="dxa" w:w="100"/>
+            </w:tcMar>
+          </w:tcPr>
+          <w:p>
+            <w:pPr>
+              <w:keepNext/>
+              <w:keepLines/>
+              <w:jc w:val="right"/>
+            </w:pPr>
+            <w:r>
+              <w:rPr>
+                <w:rFonts w:ascii="Calibri" w:cs="Calibri" w:eastAsia="Calibri" w:hAnsi="Calibri"/>
+                <w:b w:val="false"/>
+                <w:bCs w:val="false"/>
+                <w:sz w:val="18"/>
+                <w:szCs w:val="18"/>
+              </w:rPr>
+              <w:t xml:space="preserve">0.431</w:t>
+            </w:r>
+          </w:p>
+        </w:tc>
+        <w:tc>
+          <w:tcPr>
+            <w:tcW w:type="dxa" w:w="950"/>
+            <w:tcBorders>
+              <w:top w:val="single" w:color="BFBFBF" w:sz="4"/>
+              <w:left w:val="single" w:color="BFBFBF" w:sz="4"/>
+              <w:bottom w:val="single" w:color="BFBFBF" w:sz="4"/>
+              <w:right w:val="single" w:color="BFBFBF" w:sz="4"/>
+            </w:tcBorders>
+            <w:tcMar>
+              <w:top w:type="dxa" w:w="60"/>
+              <w:left w:type="dxa" w:w="100"/>
+              <w:bottom w:type="dxa" w:w="60"/>
+              <w:right w:type="dxa" w:w="100"/>
+            </w:tcMar>
+          </w:tcPr>
+          <w:p>
+            <w:pPr>
+              <w:keepNext/>
+              <w:keepLines/>
+              <w:jc w:val="right"/>
+            </w:pPr>
+            <w:r>
+              <w:rPr>
+                <w:rFonts w:ascii="Calibri" w:cs="Calibri" w:eastAsia="Calibri" w:hAnsi="Calibri"/>
+                <w:b w:val="false"/>
+                <w:bCs w:val="false"/>
+                <w:sz w:val="18"/>
+                <w:szCs w:val="18"/>
+              </w:rPr>
+              <w:t xml:space="preserve">0.431</w:t>
+            </w:r>
+          </w:p>
+        </w:tc>
+        <w:tc>
+          <w:tcPr>
+            <w:tcW w:type="dxa" w:w="2250"/>
+            <w:tcBorders>
+              <w:top w:val="single" w:color="BFBFBF" w:sz="4"/>
+              <w:left w:val="single" w:color="BFBFBF" w:sz="4"/>
+              <w:bottom w:val="single" w:color="BFBFBF" w:sz="4"/>
+              <w:right w:val="single" w:color="BFBFBF" w:sz="4"/>
+            </w:tcBorders>
+            <w:tcMar>
+              <w:top w:type="dxa" w:w="60"/>
+              <w:left w:type="dxa" w:w="100"/>
+              <w:bottom w:type="dxa" w:w="60"/>
+              <w:right w:type="dxa" w:w="100"/>
+            </w:tcMar>
+          </w:tcPr>
+          <w:p>
+            <w:pPr>
+              <w:keepNext/>
+              <w:keepLines/>
+              <w:jc w:val="right"/>
+            </w:pPr>
+            <w:r>
+              <w:rPr>
+                <w:rFonts w:ascii="Calibri" w:cs="Calibri" w:eastAsia="Calibri" w:hAnsi="Calibri"/>
+                <w:b w:val="false"/>
+                <w:bCs w:val="false"/>
+                <w:sz w:val="18"/>
+                <w:szCs w:val="18"/>
+              </w:rPr>
+              <w:t xml:space="preserve">49 s → </w:t>
+            </w:r>
+            <w:r>
+              <w:rPr>
+                <w:rFonts w:ascii="Calibri" w:cs="Calibri" w:eastAsia="Calibri" w:hAnsi="Calibri"/>
+                <w:b w:val="false"/>
+                <w:bCs w:val="false"/>
+                <w:sz w:val="18"/>
+                <w:szCs w:val="18"/>
+              </w:rPr>
+              <w:t xml:space="preserve">47</w:t>
+            </w:r>
+            <w:r>
+              <w:rPr>
+                <w:rFonts w:ascii="Calibri" w:cs="Calibri" w:eastAsia="Calibri" w:hAnsi="Calibri"/>
+                <w:b w:val="false"/>
+                <w:bCs w:val="false"/>
+                <w:sz w:val="18"/>
+                <w:szCs w:val="18"/>
+              </w:rPr>
+              <w:t xml:space="preserve"> s</w:t>
+            </w:r>
+          </w:p>
+        </w:tc>
+      </w:tr>
+      <w:tr>
+        <w:trPr>
+          <w:cantSplit/>
+        </w:trPr>
+        <w:tc>
+          <w:tcPr>
+            <w:tcW w:type="dxa" w:w="2200"/>
+            <w:tcBorders>
+              <w:top w:val="single" w:color="BFBFBF" w:sz="4"/>
+              <w:left w:val="single" w:color="BFBFBF" w:sz="4"/>
+              <w:bottom w:val="single" w:color="BFBFBF" w:sz="4"/>
+              <w:right w:val="single" w:color="BFBFBF" w:sz="4"/>
+            </w:tcBorders>
+            <w:tcMar>
+              <w:top w:type="dxa" w:w="60"/>
+              <w:left w:type="dxa" w:w="100"/>
+              <w:bottom w:type="dxa" w:w="60"/>
+              <w:right w:type="dxa" w:w="100"/>
+            </w:tcMar>
+          </w:tcPr>
+          <w:p>
+            <w:pPr>
+              <w:keepNext/>
+              <w:keepLines/>
+              <w:jc w:val="left"/>
+            </w:pPr>
+            <w:r>
+              <w:rPr>
+                <w:rFonts w:ascii="Calibri" w:cs="Calibri" w:eastAsia="Calibri" w:hAnsi="Calibri"/>
+                <w:b w:val="false"/>
+                <w:bCs w:val="false"/>
+                <w:sz w:val="18"/>
+                <w:szCs w:val="18"/>
+              </w:rPr>
+              <w:t xml:space="preserve">Random Forest</w:t>
+            </w:r>
+          </w:p>
+        </w:tc>
+        <w:tc>
+          <w:tcPr>
+            <w:tcW w:type="dxa" w:w="1250"/>
+            <w:tcBorders>
+              <w:top w:val="single" w:color="BFBFBF" w:sz="4"/>
+              <w:left w:val="single" w:color="BFBFBF" w:sz="4"/>
+              <w:bottom w:val="single" w:color="BFBFBF" w:sz="4"/>
+              <w:right w:val="single" w:color="BFBFBF" w:sz="4"/>
+            </w:tcBorders>
+            <w:tcMar>
+              <w:top w:type="dxa" w:w="60"/>
+              <w:left w:type="dxa" w:w="100"/>
+              <w:bottom w:type="dxa" w:w="60"/>
+              <w:right w:type="dxa" w:w="100"/>
+            </w:tcMar>
+          </w:tcPr>
+          <w:p>
+            <w:pPr>
+              <w:keepNext/>
+              <w:keepLines/>
+              <w:jc w:val="right"/>
+            </w:pPr>
+            <w:r>
+              <w:rPr>
+                <w:rFonts w:ascii="Calibri" w:cs="Calibri" w:eastAsia="Calibri" w:hAnsi="Calibri"/>
+                <w:b w:val="false"/>
+                <w:bCs w:val="false"/>
+                <w:sz w:val="18"/>
+                <w:szCs w:val="18"/>
+              </w:rPr>
+              <w:t xml:space="preserve">0.705</w:t>
+            </w:r>
+          </w:p>
+        </w:tc>
+        <w:tc>
+          <w:tcPr>
+            <w:tcW w:type="dxa" w:w="1200"/>
+            <w:tcBorders>
+              <w:top w:val="single" w:color="BFBFBF" w:sz="4"/>
+              <w:left w:val="single" w:color="BFBFBF" w:sz="4"/>
+              <w:bottom w:val="single" w:color="BFBFBF" w:sz="4"/>
+              <w:right w:val="single" w:color="BFBFBF" w:sz="4"/>
+            </w:tcBorders>
+            <w:tcMar>
+              <w:top w:type="dxa" w:w="60"/>
+              <w:left w:type="dxa" w:w="100"/>
+              <w:bottom w:type="dxa" w:w="60"/>
+              <w:right w:type="dxa" w:w="100"/>
+            </w:tcMar>
+          </w:tcPr>
+          <w:p>
+            <w:pPr>
+              <w:keepNext/>
+              <w:keepLines/>
+              <w:jc w:val="right"/>
+            </w:pPr>
+            <w:r>
+              <w:rPr>
+                <w:rFonts w:ascii="Calibri" w:cs="Calibri" w:eastAsia="Calibri" w:hAnsi="Calibri"/>
+                <w:b w:val="false"/>
+                <w:bCs w:val="false"/>
+                <w:sz w:val="18"/>
+                <w:szCs w:val="18"/>
+              </w:rPr>
+              <w:t xml:space="preserve">0.715</w:t>
+            </w:r>
+          </w:p>
+        </w:tc>
+        <w:tc>
+          <w:tcPr>
+            <w:tcW w:type="dxa" w:w="1050"/>
+            <w:tcBorders>
+              <w:top w:val="single" w:color="BFBFBF" w:sz="4"/>
+              <w:left w:val="single" w:color="BFBFBF" w:sz="4"/>
+              <w:bottom w:val="single" w:color="BFBFBF" w:sz="4"/>
+              <w:right w:val="single" w:color="BFBFBF" w:sz="4"/>
+            </w:tcBorders>
+            <w:tcMar>
+              <w:top w:type="dxa" w:w="60"/>
+              <w:left w:type="dxa" w:w="100"/>
+              <w:bottom w:type="dxa" w:w="60"/>
+              <w:right w:type="dxa" w:w="100"/>
+            </w:tcMar>
+          </w:tcPr>
+          <w:p>
+            <w:pPr>
+              <w:keepNext/>
+              <w:keepLines/>
+              <w:jc w:val="right"/>
+            </w:pPr>
+            <w:r>
+              <w:rPr>
+                <w:rFonts w:ascii="Calibri" w:cs="Calibri" w:eastAsia="Calibri" w:hAnsi="Calibri"/>
+                <w:b w:val="false"/>
+                <w:bCs w:val="false"/>
+                <w:sz w:val="18"/>
+                <w:szCs w:val="18"/>
+              </w:rPr>
+              <w:t xml:space="preserve">0.450</w:t>
+            </w:r>
+          </w:p>
+        </w:tc>
+        <w:tc>
+          <w:tcPr>
+            <w:tcW w:type="dxa" w:w="950"/>
+            <w:tcBorders>
+              <w:top w:val="single" w:color="BFBFBF" w:sz="4"/>
+              <w:left w:val="single" w:color="BFBFBF" w:sz="4"/>
+              <w:bottom w:val="single" w:color="BFBFBF" w:sz="4"/>
+              <w:right w:val="single" w:color="BFBFBF" w:sz="4"/>
+            </w:tcBorders>
+            <w:tcMar>
+              <w:top w:type="dxa" w:w="60"/>
+              <w:left w:type="dxa" w:w="100"/>
+              <w:bottom w:type="dxa" w:w="60"/>
+              <w:right w:type="dxa" w:w="100"/>
+            </w:tcMar>
+          </w:tcPr>
+          <w:p>
+            <w:pPr>
+              <w:keepNext/>
+              <w:keepLines/>
+              <w:jc w:val="right"/>
+            </w:pPr>
+            <w:r>
+              <w:rPr>
+                <w:rFonts w:ascii="Calibri" w:cs="Calibri" w:eastAsia="Calibri" w:hAnsi="Calibri"/>
+                <w:b w:val="false"/>
+                <w:bCs w:val="false"/>
+                <w:sz w:val="18"/>
+                <w:szCs w:val="18"/>
+              </w:rPr>
+              <w:t xml:space="preserve">0.460</w:t>
+            </w:r>
+          </w:p>
+        </w:tc>
+        <w:tc>
+          <w:tcPr>
+            <w:tcW w:type="dxa" w:w="2250"/>
+            <w:tcBorders>
+              <w:top w:val="single" w:color="BFBFBF" w:sz="4"/>
+              <w:left w:val="single" w:color="BFBFBF" w:sz="4"/>
+              <w:bottom w:val="single" w:color="BFBFBF" w:sz="4"/>
+              <w:right w:val="single" w:color="BFBFBF" w:sz="4"/>
+            </w:tcBorders>
+            <w:tcMar>
+              <w:top w:type="dxa" w:w="60"/>
+              <w:left w:type="dxa" w:w="100"/>
+              <w:bottom w:type="dxa" w:w="60"/>
+              <w:right w:type="dxa" w:w="100"/>
+            </w:tcMar>
+          </w:tcPr>
+          <w:p>
+            <w:pPr>
+              <w:keepNext/>
+              <w:keepLines/>
+              <w:jc w:val="right"/>
+            </w:pPr>
+            <w:r>
+              <w:rPr>
+                <w:rFonts w:ascii="Calibri" w:cs="Calibri" w:eastAsia="Calibri" w:hAnsi="Calibri"/>
+                <w:b w:val="false"/>
+                <w:bCs w:val="false"/>
+                <w:sz w:val="18"/>
+                <w:szCs w:val="18"/>
+              </w:rPr>
+              <w:t xml:space="preserve">1077</w:t>
+            </w:r>
+            <w:r>
+              <w:rPr>
+                <w:rFonts w:ascii="Calibri" w:cs="Calibri" w:eastAsia="Calibri" w:hAnsi="Calibri"/>
+                <w:b w:val="false"/>
+                <w:bCs w:val="false"/>
+                <w:sz w:val="18"/>
+                <w:szCs w:val="18"/>
+              </w:rPr>
+              <w:t xml:space="preserve"> s → </w:t>
+            </w:r>
+            <w:r>
+              <w:rPr>
+                <w:rFonts w:ascii="Calibri" w:cs="Calibri" w:eastAsia="Calibri" w:hAnsi="Calibri"/>
+                <w:b w:val="false"/>
+                <w:bCs w:val="false"/>
+                <w:sz w:val="18"/>
+                <w:szCs w:val="18"/>
+              </w:rPr>
+              <w:t xml:space="preserve">2115</w:t>
+            </w:r>
+            <w:r>
+              <w:rPr>
+                <w:rFonts w:ascii="Calibri" w:cs="Calibri" w:eastAsia="Calibri" w:hAnsi="Calibri"/>
+                <w:b w:val="false"/>
+                <w:bCs w:val="false"/>
+                <w:sz w:val="18"/>
+                <w:szCs w:val="18"/>
+              </w:rPr>
+              <w:t xml:space="preserve"> s</w:t>
+            </w:r>
+          </w:p>
+        </w:tc>
+      </w:tr>
+      <w:tr>
+        <w:trPr>
+          <w:cantSplit/>
+        </w:trPr>
+        <w:tc>
+          <w:tcPr>
+            <w:tcW w:type="dxa" w:w="2200"/>
+            <w:tcBorders>
+              <w:top w:val="single" w:color="BFBFBF" w:sz="4"/>
+              <w:left w:val="single" w:color="BFBFBF" w:sz="4"/>
+              <w:bottom w:val="single" w:color="BFBFBF" w:sz="4"/>
+              <w:right w:val="single" w:color="BFBFBF" w:sz="4"/>
+            </w:tcBorders>
+            <w:tcMar>
+              <w:top w:type="dxa" w:w="60"/>
+              <w:left w:type="dxa" w:w="100"/>
+              <w:bottom w:type="dxa" w:w="60"/>
+              <w:right w:type="dxa" w:w="100"/>
+            </w:tcMar>
+          </w:tcPr>
+          <w:p>
+            <w:pPr>
+              <w:keepNext/>
+              <w:keepLines/>
+              <w:jc w:val="left"/>
+            </w:pPr>
+            <w:r>
+              <w:rPr>
+                <w:rFonts w:ascii="Calibri" w:cs="Calibri" w:eastAsia="Calibri" w:hAnsi="Calibri"/>
+                <w:b w:val="false"/>
+                <w:bCs w:val="false"/>
+                <w:sz w:val="18"/>
+                <w:szCs w:val="18"/>
+              </w:rPr>
+              <w:t xml:space="preserve">Gradient-Boosted Trees</w:t>
+            </w:r>
+          </w:p>
+        </w:tc>
+        <w:tc>
+          <w:tcPr>
+            <w:tcW w:type="dxa" w:w="1250"/>
+            <w:tcBorders>
+              <w:top w:val="single" w:color="BFBFBF" w:sz="4"/>
+              <w:left w:val="single" w:color="BFBFBF" w:sz="4"/>
+              <w:bottom w:val="single" w:color="BFBFBF" w:sz="4"/>
+              <w:right w:val="single" w:color="BFBFBF" w:sz="4"/>
+            </w:tcBorders>
+            <w:tcMar>
+              <w:top w:type="dxa" w:w="60"/>
+              <w:left w:type="dxa" w:w="100"/>
+              <w:bottom w:type="dxa" w:w="60"/>
+              <w:right w:type="dxa" w:w="100"/>
+            </w:tcMar>
+          </w:tcPr>
+          <w:p>
+            <w:pPr>
+              <w:keepNext/>
+              <w:keepLines/>
+              <w:jc w:val="right"/>
+            </w:pPr>
+            <w:r>
+              <w:rPr>
+                <w:rFonts w:ascii="Calibri" w:cs="Calibri" w:eastAsia="Calibri" w:hAnsi="Calibri"/>
+                <w:b w:val="false"/>
+                <w:bCs w:val="false"/>
+                <w:sz w:val="18"/>
+                <w:szCs w:val="18"/>
+              </w:rPr>
+              <w:t xml:space="preserve">0.735</w:t>
+            </w:r>
+          </w:p>
+        </w:tc>
+        <w:tc>
+          <w:tcPr>
+            <w:tcW w:type="dxa" w:w="1200"/>
+            <w:tcBorders>
+              <w:top w:val="single" w:color="BFBFBF" w:sz="4"/>
+              <w:left w:val="single" w:color="BFBFBF" w:sz="4"/>
+              <w:bottom w:val="single" w:color="BFBFBF" w:sz="4"/>
+              <w:right w:val="single" w:color="BFBFBF" w:sz="4"/>
+            </w:tcBorders>
+            <w:tcMar>
+              <w:top w:type="dxa" w:w="60"/>
+              <w:left w:type="dxa" w:w="100"/>
+              <w:bottom w:type="dxa" w:w="60"/>
+              <w:right w:type="dxa" w:w="100"/>
+            </w:tcMar>
+          </w:tcPr>
+          <w:p>
+            <w:pPr>
+              <w:keepNext/>
+              <w:keepLines/>
+              <w:jc w:val="right"/>
+            </w:pPr>
+            <w:r>
+              <w:rPr>
+                <w:rFonts w:ascii="Calibri" w:cs="Calibri" w:eastAsia="Calibri" w:hAnsi="Calibri"/>
+                <w:b w:val="false"/>
+                <w:bCs w:val="false"/>
+                <w:sz w:val="18"/>
+                <w:szCs w:val="18"/>
+              </w:rPr>
+              <w:t xml:space="preserve">0.735</w:t>
+            </w:r>
+          </w:p>
+        </w:tc>
+        <w:tc>
+          <w:tcPr>
+            <w:tcW w:type="dxa" w:w="1050"/>
+            <w:tcBorders>
+              <w:top w:val="single" w:color="BFBFBF" w:sz="4"/>
+              <w:left w:val="single" w:color="BFBFBF" w:sz="4"/>
+              <w:bottom w:val="single" w:color="BFBFBF" w:sz="4"/>
+              <w:right w:val="single" w:color="BFBFBF" w:sz="4"/>
+            </w:tcBorders>
+            <w:tcMar>
+              <w:top w:type="dxa" w:w="60"/>
+              <w:left w:type="dxa" w:w="100"/>
+              <w:bottom w:type="dxa" w:w="60"/>
+              <w:right w:type="dxa" w:w="100"/>
+            </w:tcMar>
+          </w:tcPr>
+          <w:p>
+            <w:pPr>
+              <w:keepNext/>
+              <w:keepLines/>
+              <w:jc w:val="right"/>
+            </w:pPr>
+            <w:r>
+              <w:rPr>
+                <w:rFonts w:ascii="Calibri" w:cs="Calibri" w:eastAsia="Calibri" w:hAnsi="Calibri"/>
+                <w:b w:val="false"/>
+                <w:bCs w:val="false"/>
+                <w:sz w:val="18"/>
+                <w:szCs w:val="18"/>
+              </w:rPr>
+              <w:t xml:space="preserve">0.479</w:t>
+            </w:r>
+          </w:p>
+        </w:tc>
+        <w:tc>
+          <w:tcPr>
+            <w:tcW w:type="dxa" w:w="950"/>
+            <w:tcBorders>
+              <w:top w:val="single" w:color="BFBFBF" w:sz="4"/>
+              <w:left w:val="single" w:color="BFBFBF" w:sz="4"/>
+              <w:bottom w:val="single" w:color="BFBFBF" w:sz="4"/>
+              <w:right w:val="single" w:color="BFBFBF" w:sz="4"/>
+            </w:tcBorders>
+            <w:tcMar>
+              <w:top w:type="dxa" w:w="60"/>
+              <w:left w:type="dxa" w:w="100"/>
+              <w:bottom w:type="dxa" w:w="60"/>
+              <w:right w:type="dxa" w:w="100"/>
+            </w:tcMar>
+          </w:tcPr>
+          <w:p>
+            <w:pPr>
+              <w:keepNext/>
+              <w:keepLines/>
+              <w:jc w:val="right"/>
+            </w:pPr>
+            <w:r>
+              <w:rPr>
+                <w:rFonts w:ascii="Calibri" w:cs="Calibri" w:eastAsia="Calibri" w:hAnsi="Calibri"/>
+                <w:b w:val="false"/>
+                <w:bCs w:val="false"/>
+                <w:sz w:val="18"/>
+                <w:szCs w:val="18"/>
+              </w:rPr>
+              <w:t xml:space="preserve">0.479</w:t>
+            </w:r>
+          </w:p>
+        </w:tc>
+        <w:tc>
+          <w:tcPr>
+            <w:tcW w:type="dxa" w:w="2250"/>
+            <w:tcBorders>
+              <w:top w:val="single" w:color="BFBFBF" w:sz="4"/>
+              <w:left w:val="single" w:color="BFBFBF" w:sz="4"/>
+              <w:bottom w:val="single" w:color="BFBFBF" w:sz="4"/>
+              <w:right w:val="single" w:color="BFBFBF" w:sz="4"/>
+            </w:tcBorders>
+            <w:tcMar>
+              <w:top w:type="dxa" w:w="60"/>
+              <w:left w:type="dxa" w:w="100"/>
+              <w:bottom w:type="dxa" w:w="60"/>
+              <w:right w:type="dxa" w:w="100"/>
+            </w:tcMar>
+          </w:tcPr>
+          <w:p>
+            <w:pPr>
+              <w:keepNext/>
+              <w:keepLines/>
+              <w:jc w:val="right"/>
+            </w:pPr>
+            <w:r>
+              <w:rPr>
+                <w:rFonts w:ascii="Calibri" w:cs="Calibri" w:eastAsia="Calibri" w:hAnsi="Calibri"/>
+                <w:b w:val="false"/>
+                <w:bCs w:val="false"/>
+                <w:sz w:val="18"/>
+                <w:szCs w:val="18"/>
+              </w:rPr>
+              <w:t xml:space="preserve">443 s → </w:t>
+            </w:r>
+            <w:r>
+              <w:rPr>
+                <w:rFonts w:ascii="Calibri" w:cs="Calibri" w:eastAsia="Calibri" w:hAnsi="Calibri"/>
+                <w:b w:val="false"/>
+                <w:bCs w:val="false"/>
+                <w:sz w:val="18"/>
+                <w:szCs w:val="18"/>
+              </w:rPr>
+              <w:t xml:space="preserve">465</w:t>
+            </w:r>
+            <w:r>
+              <w:rPr>
+                <w:rFonts w:ascii="Calibri" w:cs="Calibri" w:eastAsia="Calibri" w:hAnsi="Calibri"/>
+                <w:b w:val="false"/>
+                <w:bCs w:val="false"/>
+                <w:sz w:val="18"/>
+                <w:szCs w:val="18"/>
+              </w:rPr>
+              <w:t xml:space="preserve"> s</w:t>
+            </w:r>
+          </w:p>
+        </w:tc>
+      </w:tr>
+    </w:tbl>
+    <w:p>
+      <w:pPr>
+        <w:spacing w:after="200" w:before="60"/>
+        <w:jc w:val="center"/>
+      </w:pPr>
+      <w:r>
+        <w:rPr>
+          <w:rFonts w:ascii="Calibri" w:cs="Calibri" w:eastAsia="Calibri" w:hAnsi="Calibri"/>
+          <w:i/>
+          <w:iCs/>
+          <w:color w:val="595959"/>
+          <w:sz w:val="18"/>
+          <w:szCs w:val="18"/>
+        </w:rPr>
+        <w:t xml:space="preserve">Table 4. Default versus tuned configurations on the test set (Section 13 of the notebook).</w:t>
+      </w:r>
+    </w:p>
+    <w:p>
+      <w:pPr>
+        <w:spacing w:after="140" w:line="288"/>
+        <w:jc w:val="both"/>
+      </w:pPr>
+      <w:r>
+        <w:rPr>
+          <w:rFonts w:ascii="Calibri" w:cs="Calibri" w:eastAsia="Calibri" w:hAnsi="Calibri"/>
+        </w:rPr>
         <w:t xml:space="preserve">Figure 10 shows the most important features; in GBT the top three were </w:t>
       </w:r>
       <w:r>
@@ -5903,7 +6816,7 @@
         <w:rPr>
           <w:rFonts w:ascii="Calibri" w:cs="Calibri" w:eastAsia="Calibri" w:hAnsi="Calibri"/>
         </w:rPr>
-        <w:t xml:space="preserve">Finally, Table 4 compares the random split with a stricter </w:t>
+        <w:t xml:space="preserve">Finally, Table 5 compares the random split with a stricter </w:t>
       </w:r>
       <w:r>
         <w:rPr>
@@ -6660,7 +7573,7 @@
           <w:sz w:val="18"/>
           <w:szCs w:val="18"/>
         </w:rPr>
-        <w:t xml:space="preserve">Table 4. Random versus temporal (train Jan to Sep, test Oct to Dec) evaluation.</w:t>
+        <w:t xml:space="preserve">Table 5. Random versus temporal (train Jan to Sep, test Oct to Dec) evaluation.</w:t>
       </w:r>
     </w:p>
     <w:p>
@@ -6781,7 +7694,7 @@
         <w:rPr>
           <w:rFonts w:ascii="Calibri" w:cs="Calibri" w:eastAsia="Calibri" w:hAnsi="Calibri"/>
         </w:rPr>
-        <w:t xml:space="preserve">Schedule-only prediction is possible but limited: most delay causes (weather, air traffic control, knock-on delays) are invisible in the schedule, which caps what any model here can achieve.</w:t>
+        <w:t xml:space="preserve">Schedule-only prediction is possible but limited, because most delay causes (weather, air traffic control, knock-on delays) are invisible in the schedule.</w:t>
       </w:r>
     </w:p>
     <w:p>

</xml_diff>

<commit_message>
Report: add notebook screenshots and four more figures
Following the lecturer's sample presentations: six screenshots rendered
from the executed notebook (real code and output, key lines boxed in red)
for ingestion, data quality, Spark configuration, Parquet benchmark,
target encoding/leakage check and cross-validation; plus holiday/distance,
scaling, threshold-tuning and random-vs-temporal charts. Figures
renumbered 1-15 with cross-references; ~2,310 words.

Co-Authored-By: Claude Opus 5.5 <noreply@anthropic.com>
Claude-Session: https://claude.ai/code/session_013cmZjtFTpWtFMxYtK982h3
</commit_message>
<xml_diff>
--- a/bdmla-flight-delay/report/BDMLA_CW2_Part2_Flight_Delay_Report.docx
+++ b/bdmla-flight-delay/report/BDMLA_CW2_Part2_Flight_Delay_Report.docx
@@ -157,7 +157,7 @@
         <w:rPr>
           <w:rFonts w:ascii="Calibri" w:cs="Calibri" w:eastAsia="Calibri" w:hAnsi="Calibri"/>
         </w:rPr>
-        <w:t xml:space="preserve">2,258</w:t>
+        <w:t xml:space="preserve">2,310</w:t>
       </w:r>
       <w:r>
         <w:rPr>
@@ -987,7 +987,7 @@
         <w:rPr>
           <w:rFonts w:ascii="Calibri" w:cs="Calibri" w:eastAsia="Calibri" w:hAnsi="Calibri"/>
         </w:rPr>
-        <w:t xml:space="preserve"> This is binary classification (DELAYED = 1 if ARR_DELAY ≥ 15). Many public notebooks on this data report high accuracy only because they use departure delay or other post-flight columns, which makes the model useless in practice (Kaufman et al., 2012). A schedule-only model could be run the evening before to help plan crews and spare aircraft.</w:t>
+        <w:t xml:space="preserve"> (DELAYED = 1 if ARR_DELAY ≥ 15). Many public notebooks on this data report high accuracy only because they use departure delay or other post-flight columns (Kaufman et al., 2012). A schedule-only model could instead be run the evening before to help plan crews and spare aircraft.</w:t>
       </w:r>
     </w:p>
     <w:p>
@@ -1157,7 +1157,7 @@
         <w:rPr>
           <w:rFonts w:ascii="Calibri" w:cs="Calibri" w:eastAsia="Calibri" w:hAnsi="Calibri"/>
         </w:rPr>
-        <w:t xml:space="preserve"> table (Bureau of Transportation Statistics, 2026): one row per domestic flight, with carrier, tail number, airports, scheduled and actual times, cancellation and diversion flags, and delay minutes by cause. I downloaded the twelve 2025 monthly CSVs (about 3 GB) to Google Drive.</w:t>
+        <w:t xml:space="preserve"> table (Bureau of Transportation Statistics, 2026): one row per domestic flight, with carrier, tail number, airports, scheduled and actual times, cancellation and diversion flags, and delay minutes by cause. I downloaded the twelve 2025 monthly CSVs (about 3 GB) to Google Drive. Screenshot 1 shows the files being checked, read and unioned in Spark.</w:t>
       </w:r>
     </w:p>
     <w:p>
@@ -1169,9 +1169,9 @@
       <w:r>
         <w:drawing>
           <wp:inline distT="0" distB="0" distL="0" distR="0">
-            <wp:extent cx="4206240" cy="2238805"/>
+            <wp:extent cx="5120640" cy="4696331"/>
             <wp:effectExtent t="0" r="0" b="0" l="0"/>
-            <wp:docPr id="12" name="01_class_balance.png" descr="Figure 1. Class balance after cleaning (DELAYED = 1 when ARR_DELAY ≥ 15 minutes)." title="Figure 1. Class balance after cleaning (DELAYED = 1 when ARR_DELAY ≥ 15 minutes)."/>
+            <wp:docPr id="22" name="s1_ingestion.png" descr="Screenshot 1. Reading the twelve monthly files and unioning them with an allow-list of 17 columns (notebook output)." title="Screenshot 1. Reading the twelve monthly files and unioning them with an allow-list of 17 columns (notebook output)."/>
             <wp:cNvGraphicFramePr>
               <a:graphicFrameLocks xmlns:a="http://schemas.openxmlformats.org/drawingml/2006/main" noChangeAspect="1"/>
             </wp:cNvGraphicFramePr>
@@ -1194,7 +1194,7 @@
                   <pic:spPr bwMode="auto">
                     <a:xfrm>
                       <a:off x="0" y="0"/>
-                      <a:ext cx="4206240" cy="2238805"/>
+                      <a:ext cx="5120640" cy="4696331"/>
                     </a:xfrm>
                     <a:prstGeom prst="rect">
                       <a:avLst/>
@@ -1221,56 +1221,7 @@
           <w:sz w:val="18"/>
           <w:szCs w:val="18"/>
         </w:rPr>
-        <w:t xml:space="preserve">Figure 1. Class balance after cleaning (DELAYED = 1 when ARR_DELAY ≥ 15 minutes).</w:t>
-      </w:r>
-    </w:p>
-    <w:p>
-      <w:pPr>
-        <w:pStyle w:val="Heading2"/>
-      </w:pPr>
-      <w:bookmarkStart w:name="_Toc9" w:id="9"/>
-      <w:r>
-        <w:rPr>
-          <w:rFonts w:ascii="Calibri" w:cs="Calibri" w:eastAsia="Calibri" w:hAnsi="Calibri"/>
-        </w:rPr>
-        <w:t xml:space="preserve">3.2 Exploration</w:t>
-      </w:r>
-      <w:bookmarkEnd w:id="9"/>
-    </w:p>
-    <w:p>
-      <w:pPr>
-        <w:spacing w:after="140" w:line="288"/>
-        <w:jc w:val="both"/>
-      </w:pPr>
-      <w:r>
-        <w:rPr>
-          <w:rFonts w:ascii="Calibri" w:cs="Calibri" w:eastAsia="Calibri" w:hAnsi="Calibri"/>
-        </w:rPr>
-        <w:t xml:space="preserve">After cleaning, </w:t>
-      </w:r>
-      <w:r>
-        <w:rPr>
-          <w:rFonts w:ascii="Calibri" w:cs="Calibri" w:eastAsia="Calibri" w:hAnsi="Calibri"/>
-        </w:rPr>
-        <w:t xml:space="preserve">22.31%</w:t>
-      </w:r>
-      <w:r>
-        <w:rPr>
-          <w:rFonts w:ascii="Calibri" w:cs="Calibri" w:eastAsia="Calibri" w:hAnsi="Calibri"/>
-        </w:rPr>
-        <w:t xml:space="preserve"> of flights are delayed (Figure 1), so the data is imbalanced: always predicting "on time" would score </w:t>
-      </w:r>
-      <w:r>
-        <w:rPr>
-          <w:rFonts w:ascii="Calibri" w:cs="Calibri" w:eastAsia="Calibri" w:hAnsi="Calibri"/>
-        </w:rPr>
-        <w:t xml:space="preserve">77.70%</w:t>
-      </w:r>
-      <w:r>
-        <w:rPr>
-          <w:rFonts w:ascii="Calibri" w:cs="Calibri" w:eastAsia="Calibri" w:hAnsi="Calibri"/>
-        </w:rPr>
-        <w:t xml:space="preserve"> accuracy. Delays peak in July (about 29%) and December and are lowest in September (about 17%); Sundays are worst, and airlines range from about 17% to 28% (Figure 2). The clearest pattern is by hour: about 9% of 5am departures arrive late, against about 33% at 7pm, consistent with delays carrying over to later legs. Figure 3 supports this: an aircraft's first leg is late about 15% of the time and its seventh about 34%, and turnarounds under 40 minutes have a 38% delay rate, against about 21% for 60 to 179 minutes.</w:t>
+        <w:t xml:space="preserve">Screenshot 1. Reading the twelve monthly files and unioning them with an allow-list of 17 columns (notebook output).</w:t>
       </w:r>
     </w:p>
     <w:p>
@@ -1282,9 +1233,9 @@
       <w:r>
         <w:drawing>
           <wp:inline distT="0" distB="0" distL="0" distR="0">
-            <wp:extent cx="5669280" cy="3587074"/>
+            <wp:extent cx="4206240" cy="2238805"/>
             <wp:effectExtent t="0" r="0" b="0" l="0"/>
-            <wp:docPr id="13" name="03_delay_rate_patterns.png" descr="Figure 2. Delay rate by month, day of week, scheduled departure hour and reporting airline." title="Figure 2. Delay rate by month, day of week, scheduled departure hour and reporting airline."/>
+            <wp:docPr id="23" name="01_class_balance.png" descr="Figure 1. Class balance after cleaning (DELAYED = 1 when ARR_DELAY ≥ 15 minutes)." title="Figure 1. Class balance after cleaning (DELAYED = 1 when ARR_DELAY ≥ 15 minutes)."/>
             <wp:cNvGraphicFramePr>
               <a:graphicFrameLocks xmlns:a="http://schemas.openxmlformats.org/drawingml/2006/main" noChangeAspect="1"/>
             </wp:cNvGraphicFramePr>
@@ -1307,7 +1258,7 @@
                   <pic:spPr bwMode="auto">
                     <a:xfrm>
                       <a:off x="0" y="0"/>
-                      <a:ext cx="5669280" cy="3587074"/>
+                      <a:ext cx="4206240" cy="2238805"/>
                     </a:xfrm>
                     <a:prstGeom prst="rect">
                       <a:avLst/>
@@ -1334,7 +1285,56 @@
           <w:sz w:val="18"/>
           <w:szCs w:val="18"/>
         </w:rPr>
-        <w:t xml:space="preserve">Figure 2. Delay rate by month, day of week, scheduled departure hour and reporting airline.</w:t>
+        <w:t xml:space="preserve">Figure 1. Class balance after cleaning (DELAYED = 1 when ARR_DELAY ≥ 15 minutes).</w:t>
+      </w:r>
+    </w:p>
+    <w:p>
+      <w:pPr>
+        <w:pStyle w:val="Heading2"/>
+      </w:pPr>
+      <w:bookmarkStart w:name="_Toc9" w:id="9"/>
+      <w:r>
+        <w:rPr>
+          <w:rFonts w:ascii="Calibri" w:cs="Calibri" w:eastAsia="Calibri" w:hAnsi="Calibri"/>
+        </w:rPr>
+        <w:t xml:space="preserve">3.2 Exploration</w:t>
+      </w:r>
+      <w:bookmarkEnd w:id="9"/>
+    </w:p>
+    <w:p>
+      <w:pPr>
+        <w:spacing w:after="140" w:line="288"/>
+        <w:jc w:val="both"/>
+      </w:pPr>
+      <w:r>
+        <w:rPr>
+          <w:rFonts w:ascii="Calibri" w:cs="Calibri" w:eastAsia="Calibri" w:hAnsi="Calibri"/>
+        </w:rPr>
+        <w:t xml:space="preserve">After cleaning, </w:t>
+      </w:r>
+      <w:r>
+        <w:rPr>
+          <w:rFonts w:ascii="Calibri" w:cs="Calibri" w:eastAsia="Calibri" w:hAnsi="Calibri"/>
+        </w:rPr>
+        <w:t xml:space="preserve">22.31%</w:t>
+      </w:r>
+      <w:r>
+        <w:rPr>
+          <w:rFonts w:ascii="Calibri" w:cs="Calibri" w:eastAsia="Calibri" w:hAnsi="Calibri"/>
+        </w:rPr>
+        <w:t xml:space="preserve"> of flights are delayed (Figure 1), so the data is imbalanced: always predicting "on time" would score </w:t>
+      </w:r>
+      <w:r>
+        <w:rPr>
+          <w:rFonts w:ascii="Calibri" w:cs="Calibri" w:eastAsia="Calibri" w:hAnsi="Calibri"/>
+        </w:rPr>
+        <w:t xml:space="preserve">77.70%</w:t>
+      </w:r>
+      <w:r>
+        <w:rPr>
+          <w:rFonts w:ascii="Calibri" w:cs="Calibri" w:eastAsia="Calibri" w:hAnsi="Calibri"/>
+        </w:rPr>
+        <w:t xml:space="preserve"> accuracy. Delays peak in July (about 29%) and December and are lowest in September (about 17%); Sundays are worst, and airlines range from about 17% to 28% (Figure 2). The clearest pattern is by hour: about 9% of 5am departures arrive late, against about 33% at 7pm, consistent with delays carrying over to later legs. Figure 3 supports this: an aircraft's first leg is late about 15% of the time and its seventh about 34%, and turnarounds under 40 minutes have a 38% delay rate, against about 21% for 60 to 179 minutes. Holiday proximity (Figure 4) peaks at about 26% three days from a holiday but is noisy, which matters later.</w:t>
       </w:r>
     </w:p>
     <w:p>
@@ -1346,9 +1346,9 @@
       <w:r>
         <w:drawing>
           <wp:inline distT="0" distB="0" distL="0" distR="0">
-            <wp:extent cx="5669280" cy="1832869"/>
+            <wp:extent cx="5669280" cy="3587074"/>
             <wp:effectExtent t="0" r="0" b="0" l="0"/>
-            <wp:docPr id="14" name="04_airport_and_rotation_patterns.png" descr="Figure 3. Delay rate at the 20 busiest origin airports, by scheduled turnaround, and by aircraft leg of the day." title="Figure 3. Delay rate at the 20 busiest origin airports, by scheduled turnaround, and by aircraft leg of the day."/>
+            <wp:docPr id="24" name="03_delay_rate_patterns.png" descr="Figure 2. Delay rate by month, day of week, scheduled departure hour and reporting airline." title="Figure 2. Delay rate by month, day of week, scheduled departure hour and reporting airline."/>
             <wp:cNvGraphicFramePr>
               <a:graphicFrameLocks xmlns:a="http://schemas.openxmlformats.org/drawingml/2006/main" noChangeAspect="1"/>
             </wp:cNvGraphicFramePr>
@@ -1371,6 +1371,70 @@
                   <pic:spPr bwMode="auto">
                     <a:xfrm>
                       <a:off x="0" y="0"/>
+                      <a:ext cx="5669280" cy="3587074"/>
+                    </a:xfrm>
+                    <a:prstGeom prst="rect">
+                      <a:avLst/>
+                    </a:prstGeom>
+                  </pic:spPr>
+                </pic:pic>
+              </a:graphicData>
+            </a:graphic>
+          </wp:inline>
+        </w:drawing>
+      </w:r>
+    </w:p>
+    <w:p>
+      <w:pPr>
+        <w:spacing w:after="200" w:before="60"/>
+        <w:jc w:val="center"/>
+      </w:pPr>
+      <w:r>
+        <w:rPr>
+          <w:rFonts w:ascii="Calibri" w:cs="Calibri" w:eastAsia="Calibri" w:hAnsi="Calibri"/>
+          <w:i/>
+          <w:iCs/>
+          <w:color w:val="595959"/>
+          <w:sz w:val="18"/>
+          <w:szCs w:val="18"/>
+        </w:rPr>
+        <w:t xml:space="preserve">Figure 2. Delay rate by month, day of week, scheduled departure hour and reporting airline.</w:t>
+      </w:r>
+    </w:p>
+    <w:p>
+      <w:pPr>
+        <w:keepNext/>
+        <w:spacing w:before="120"/>
+        <w:jc w:val="center"/>
+      </w:pPr>
+      <w:r>
+        <w:drawing>
+          <wp:inline distT="0" distB="0" distL="0" distR="0">
+            <wp:extent cx="5669280" cy="1832869"/>
+            <wp:effectExtent t="0" r="0" b="0" l="0"/>
+            <wp:docPr id="25" name="04_airport_and_rotation_patterns.png" descr="Figure 3. Delay rate at the 20 busiest origin airports, by scheduled turnaround, and by aircraft leg of the day." title="Figure 3. Delay rate at the 20 busiest origin airports, by scheduled turnaround, and by aircraft leg of the day."/>
+            <wp:cNvGraphicFramePr>
+              <a:graphicFrameLocks xmlns:a="http://schemas.openxmlformats.org/drawingml/2006/main" noChangeAspect="1"/>
+            </wp:cNvGraphicFramePr>
+            <a:graphic xmlns:a="http://schemas.openxmlformats.org/drawingml/2006/main">
+              <a:graphicData uri="http://schemas.openxmlformats.org/drawingml/2006/picture">
+                <pic:pic xmlns:pic="http://schemas.openxmlformats.org/drawingml/2006/picture">
+                  <pic:nvPicPr>
+                    <pic:cNvPr id="0" name="" descr=""/>
+                    <pic:cNvPicPr>
+                      <a:picLocks noChangeAspect="1" noChangeArrowheads="1"/>
+                    </pic:cNvPicPr>
+                  </pic:nvPicPr>
+                  <pic:blipFill>
+                    <a:blip r:embed="rId11" cstate="none"/>
+                    <a:srcRect/>
+                    <a:stretch>
+                      <a:fillRect/>
+                    </a:stretch>
+                  </pic:blipFill>
+                  <pic:spPr bwMode="auto">
+                    <a:xfrm>
+                      <a:off x="0" y="0"/>
                       <a:ext cx="5669280" cy="1832869"/>
                     </a:xfrm>
                     <a:prstGeom prst="rect">
@@ -1403,6 +1467,70 @@
     </w:p>
     <w:p>
       <w:pPr>
+        <w:keepNext/>
+        <w:spacing w:before="120"/>
+        <w:jc w:val="center"/>
+      </w:pPr>
+      <w:r>
+        <w:drawing>
+          <wp:inline distT="0" distB="0" distL="0" distR="0">
+            <wp:extent cx="5669280" cy="1821931"/>
+            <wp:effectExtent t="0" r="0" b="0" l="0"/>
+            <wp:docPr id="26" name="05_holiday_and_distance.png" descr="Figure 4. Delay rate by distance to the nearest federal holiday and by flight distance; both patterns are noisy." title="Figure 4. Delay rate by distance to the nearest federal holiday and by flight distance; both patterns are noisy."/>
+            <wp:cNvGraphicFramePr>
+              <a:graphicFrameLocks xmlns:a="http://schemas.openxmlformats.org/drawingml/2006/main" noChangeAspect="1"/>
+            </wp:cNvGraphicFramePr>
+            <a:graphic xmlns:a="http://schemas.openxmlformats.org/drawingml/2006/main">
+              <a:graphicData uri="http://schemas.openxmlformats.org/drawingml/2006/picture">
+                <pic:pic xmlns:pic="http://schemas.openxmlformats.org/drawingml/2006/picture">
+                  <pic:nvPicPr>
+                    <pic:cNvPr id="0" name="" descr=""/>
+                    <pic:cNvPicPr>
+                      <a:picLocks noChangeAspect="1" noChangeArrowheads="1"/>
+                    </pic:cNvPicPr>
+                  </pic:nvPicPr>
+                  <pic:blipFill>
+                    <a:blip r:embed="rId12" cstate="none"/>
+                    <a:srcRect/>
+                    <a:stretch>
+                      <a:fillRect/>
+                    </a:stretch>
+                  </pic:blipFill>
+                  <pic:spPr bwMode="auto">
+                    <a:xfrm>
+                      <a:off x="0" y="0"/>
+                      <a:ext cx="5669280" cy="1821931"/>
+                    </a:xfrm>
+                    <a:prstGeom prst="rect">
+                      <a:avLst/>
+                    </a:prstGeom>
+                  </pic:spPr>
+                </pic:pic>
+              </a:graphicData>
+            </a:graphic>
+          </wp:inline>
+        </w:drawing>
+      </w:r>
+    </w:p>
+    <w:p>
+      <w:pPr>
+        <w:spacing w:after="200" w:before="60"/>
+        <w:jc w:val="center"/>
+      </w:pPr>
+      <w:r>
+        <w:rPr>
+          <w:rFonts w:ascii="Calibri" w:cs="Calibri" w:eastAsia="Calibri" w:hAnsi="Calibri"/>
+          <w:i/>
+          <w:iCs/>
+          <w:color w:val="595959"/>
+          <w:sz w:val="18"/>
+          <w:szCs w:val="18"/>
+        </w:rPr>
+        <w:t xml:space="preserve">Figure 4. Delay rate by distance to the nearest federal holiday and by flight distance; both patterns are noisy.</w:t>
+      </w:r>
+    </w:p>
+    <w:p>
+      <w:pPr>
         <w:pStyle w:val="Heading2"/>
       </w:pPr>
       <w:bookmarkStart w:name="_Toc10" w:id="10"/>
@@ -1423,7 +1551,71 @@
         <w:rPr>
           <w:rFonts w:ascii="Calibri" w:cs="Calibri" w:eastAsia="Calibri" w:hAnsi="Calibri"/>
         </w:rPr>
-        <w:t xml:space="preserve">Cancelled and diverted flights were removed because they have no arrival-delay label, then null ARR_DELAY rows, duplicates and impossible schedule values (Table 1). Missing tail numbers were kept, with a neutral rotation value and a HAS_PREV_LEG flag.</w:t>
+        <w:t xml:space="preserve">Cancelled and diverted flights were removed because they have no arrival-delay label, then null ARR_DELAY rows, duplicates and impossible schedule values (Table 1). Missing tail numbers were kept, with a neutral rotation value and a HAS_PREV_LEG flag. The data-quality profile in Screenshot 2 shows why: the 122,135 missing delays match the cancelled and diverted flights almost exactly.</w:t>
+      </w:r>
+    </w:p>
+    <w:p>
+      <w:pPr>
+        <w:keepNext/>
+        <w:spacing w:before="120"/>
+        <w:jc w:val="center"/>
+      </w:pPr>
+      <w:r>
+        <w:drawing>
+          <wp:inline distT="0" distB="0" distL="0" distR="0">
+            <wp:extent cx="5120640" cy="2820692"/>
+            <wp:effectExtent t="0" r="0" b="0" l="0"/>
+            <wp:docPr id="27" name="s3_quality.png" descr="Screenshot 2. Data-quality profile before cleaning (notebook output)." title="Screenshot 2. Data-quality profile before cleaning (notebook output)."/>
+            <wp:cNvGraphicFramePr>
+              <a:graphicFrameLocks xmlns:a="http://schemas.openxmlformats.org/drawingml/2006/main" noChangeAspect="1"/>
+            </wp:cNvGraphicFramePr>
+            <a:graphic xmlns:a="http://schemas.openxmlformats.org/drawingml/2006/main">
+              <a:graphicData uri="http://schemas.openxmlformats.org/drawingml/2006/picture">
+                <pic:pic xmlns:pic="http://schemas.openxmlformats.org/drawingml/2006/picture">
+                  <pic:nvPicPr>
+                    <pic:cNvPr id="0" name="" descr=""/>
+                    <pic:cNvPicPr>
+                      <a:picLocks noChangeAspect="1" noChangeArrowheads="1"/>
+                    </pic:cNvPicPr>
+                  </pic:nvPicPr>
+                  <pic:blipFill>
+                    <a:blip r:embed="rId13" cstate="none"/>
+                    <a:srcRect/>
+                    <a:stretch>
+                      <a:fillRect/>
+                    </a:stretch>
+                  </pic:blipFill>
+                  <pic:spPr bwMode="auto">
+                    <a:xfrm>
+                      <a:off x="0" y="0"/>
+                      <a:ext cx="5120640" cy="2820692"/>
+                    </a:xfrm>
+                    <a:prstGeom prst="rect">
+                      <a:avLst/>
+                    </a:prstGeom>
+                  </pic:spPr>
+                </pic:pic>
+              </a:graphicData>
+            </a:graphic>
+          </wp:inline>
+        </w:drawing>
+      </w:r>
+    </w:p>
+    <w:p>
+      <w:pPr>
+        <w:spacing w:after="200" w:before="60"/>
+        <w:jc w:val="center"/>
+      </w:pPr>
+      <w:r>
+        <w:rPr>
+          <w:rFonts w:ascii="Calibri" w:cs="Calibri" w:eastAsia="Calibri" w:hAnsi="Calibri"/>
+          <w:i/>
+          <w:iCs/>
+          <w:color w:val="595959"/>
+          <w:sz w:val="18"/>
+          <w:szCs w:val="18"/>
+        </w:rPr>
+        <w:t xml:space="preserve">Screenshot 2. Data-quality profile before cleaning (notebook output).</w:t>
       </w:r>
     </w:p>
     <w:tbl>
@@ -2303,7 +2495,7 @@
         <w:rPr>
           <w:rFonts w:ascii="Calibri" w:cs="Calibri" w:eastAsia="Calibri" w:hAnsi="Calibri"/>
         </w:rPr>
-        <w:t xml:space="preserve">Figure 4 shows the pipeline. Everything runs in Google Colab with PySpark </w:t>
+        <w:t xml:space="preserve">Figure 5 shows the pipeline. Everything runs in Google Colab with PySpark </w:t>
       </w:r>
       <w:r>
         <w:rPr>
@@ -2329,7 +2521,7 @@
           <wp:inline distT="0" distB="0" distL="0" distR="0">
             <wp:extent cx="5669280" cy="2317370"/>
             <wp:effectExtent t="0" r="0" b="0" l="0"/>
-            <wp:docPr id="15" name="architecture_pipeline.png" descr="Figure 4. End-to-end architecture of the Spark pipeline." title="Figure 4. End-to-end architecture of the Spark pipeline."/>
+            <wp:docPr id="28" name="architecture_pipeline.png" descr="Figure 5. End-to-end architecture of the Spark pipeline." title="Figure 5. End-to-end architecture of the Spark pipeline."/>
             <wp:cNvGraphicFramePr>
               <a:graphicFrameLocks xmlns:a="http://schemas.openxmlformats.org/drawingml/2006/main" noChangeAspect="1"/>
             </wp:cNvGraphicFramePr>
@@ -2343,7 +2535,7 @@
                     </pic:cNvPicPr>
                   </pic:nvPicPr>
                   <pic:blipFill>
-                    <a:blip r:embed="rId11" cstate="none"/>
+                    <a:blip r:embed="rId14" cstate="none"/>
                     <a:srcRect/>
                     <a:stretch>
                       <a:fillRect/>
@@ -2379,7 +2571,7 @@
           <w:sz w:val="18"/>
           <w:szCs w:val="18"/>
         </w:rPr>
-        <w:t xml:space="preserve">Figure 4. End-to-end architecture of the Spark pipeline.</w:t>
+        <w:t xml:space="preserve">Figure 5. End-to-end architecture of the Spark pipeline.</w:t>
       </w:r>
     </w:p>
     <w:p>
@@ -2391,7 +2583,7 @@
         <w:rPr>
           <w:rFonts w:ascii="Calibri" w:cs="Calibri" w:eastAsia="Calibri" w:hAnsi="Calibri"/>
         </w:rPr>
-        <w:t xml:space="preserve">Spark turns a job into stages of parallel tasks, one per data partition (Zaharia et al., 2016), and its Catalyst optimiser pushes the column allow-list down to the file scan (Armbrust et al., 2015). In Colab the driver and executor share one two-core VM in local mode (Figure 5); the same code runs on a cluster by changing the master URL.</w:t>
+        <w:t xml:space="preserve">Spark turns a job into stages of parallel tasks, one per data partition (Zaharia et al., 2016), and its Catalyst optimiser pushes the column allow-list down to the file scan (Armbrust et al., 2015). In Colab the driver and executor share one two-core VM in local mode (Figure 6; its configuration is in Screenshot 3); the same code runs on a cluster by changing the master URL.</w:t>
       </w:r>
     </w:p>
     <w:p>
@@ -2405,7 +2597,7 @@
           <wp:inline distT="0" distB="0" distL="0" distR="0">
             <wp:extent cx="5120640" cy="2183010"/>
             <wp:effectExtent t="0" r="0" b="0" l="0"/>
-            <wp:docPr id="16" name="spark_architecture.png" descr="Figure 5. Spark execution model: in Colab the driver and executor share one VM; on a cluster, tasks are spread across executors." title="Figure 5. Spark execution model: in Colab the driver and executor share one VM; on a cluster, tasks are spread across executors."/>
+            <wp:docPr id="29" name="spark_architecture.png" descr="Figure 6. Spark execution model: in Colab the driver and executor share one VM; on a cluster, tasks are spread across executors." title="Figure 6. Spark execution model: in Colab the driver and executor share one VM; on a cluster, tasks are spread across executors."/>
             <wp:cNvGraphicFramePr>
               <a:graphicFrameLocks xmlns:a="http://schemas.openxmlformats.org/drawingml/2006/main" noChangeAspect="1"/>
             </wp:cNvGraphicFramePr>
@@ -2419,7 +2611,7 @@
                     </pic:cNvPicPr>
                   </pic:nvPicPr>
                   <pic:blipFill>
-                    <a:blip r:embed="rId12" cstate="none"/>
+                    <a:blip r:embed="rId15" cstate="none"/>
                     <a:srcRect/>
                     <a:stretch>
                       <a:fillRect/>
@@ -2455,7 +2647,71 @@
           <w:sz w:val="18"/>
           <w:szCs w:val="18"/>
         </w:rPr>
-        <w:t xml:space="preserve">Figure 5. Spark execution model: in Colab the driver and executor share one VM; on a cluster, tasks are spread across executors.</w:t>
+        <w:t xml:space="preserve">Figure 6. Spark execution model: in Colab the driver and executor share one VM; on a cluster, tasks are spread across executors.</w:t>
+      </w:r>
+    </w:p>
+    <w:p>
+      <w:pPr>
+        <w:keepNext/>
+        <w:spacing w:before="120"/>
+        <w:jc w:val="center"/>
+      </w:pPr>
+      <w:r>
+        <w:drawing>
+          <wp:inline distT="0" distB="0" distL="0" distR="0">
+            <wp:extent cx="5120640" cy="2121546"/>
+            <wp:effectExtent t="0" r="0" b="0" l="0"/>
+            <wp:docPr id="30" name="s4_spark.png" descr="Screenshot 3. Spark session configuration on Colab: local mode, two cores, tuned shuffle partitions (notebook output)." title="Screenshot 3. Spark session configuration on Colab: local mode, two cores, tuned shuffle partitions (notebook output)."/>
+            <wp:cNvGraphicFramePr>
+              <a:graphicFrameLocks xmlns:a="http://schemas.openxmlformats.org/drawingml/2006/main" noChangeAspect="1"/>
+            </wp:cNvGraphicFramePr>
+            <a:graphic xmlns:a="http://schemas.openxmlformats.org/drawingml/2006/main">
+              <a:graphicData uri="http://schemas.openxmlformats.org/drawingml/2006/picture">
+                <pic:pic xmlns:pic="http://schemas.openxmlformats.org/drawingml/2006/picture">
+                  <pic:nvPicPr>
+                    <pic:cNvPr id="0" name="" descr=""/>
+                    <pic:cNvPicPr>
+                      <a:picLocks noChangeAspect="1" noChangeArrowheads="1"/>
+                    </pic:cNvPicPr>
+                  </pic:nvPicPr>
+                  <pic:blipFill>
+                    <a:blip r:embed="rId16" cstate="none"/>
+                    <a:srcRect/>
+                    <a:stretch>
+                      <a:fillRect/>
+                    </a:stretch>
+                  </pic:blipFill>
+                  <pic:spPr bwMode="auto">
+                    <a:xfrm>
+                      <a:off x="0" y="0"/>
+                      <a:ext cx="5120640" cy="2121546"/>
+                    </a:xfrm>
+                    <a:prstGeom prst="rect">
+                      <a:avLst/>
+                    </a:prstGeom>
+                  </pic:spPr>
+                </pic:pic>
+              </a:graphicData>
+            </a:graphic>
+          </wp:inline>
+        </w:drawing>
+      </w:r>
+    </w:p>
+    <w:p>
+      <w:pPr>
+        <w:spacing w:after="200" w:before="60"/>
+        <w:jc w:val="center"/>
+      </w:pPr>
+      <w:r>
+        <w:rPr>
+          <w:rFonts w:ascii="Calibri" w:cs="Calibri" w:eastAsia="Calibri" w:hAnsi="Calibri"/>
+          <w:i/>
+          <w:iCs/>
+          <w:color w:val="595959"/>
+          <w:sz w:val="18"/>
+          <w:szCs w:val="18"/>
+        </w:rPr>
+        <w:t xml:space="preserve">Screenshot 3. Spark session configuration on Colab: local mode, two cores, tuned shuffle partitions (notebook output).</w:t>
       </w:r>
     </w:p>
     <w:p>
@@ -2527,7 +2783,7 @@
         <w:rPr>
           <w:rFonts w:ascii="Calibri" w:cs="Calibri" w:eastAsia="Calibri" w:hAnsi="Calibri"/>
         </w:rPr>
-        <w:t xml:space="preserve"> faster), and the Drive copy acts as a checkpoint.</w:t>
+        <w:t xml:space="preserve"> faster), and the Drive copy acts as a checkpoint (Screenshot 4).</w:t>
       </w:r>
     </w:p>
     <w:p>
@@ -2608,6 +2864,70 @@
     </w:p>
     <w:p>
       <w:pPr>
+        <w:keepNext/>
+        <w:spacing w:before="120"/>
+        <w:jc w:val="center"/>
+      </w:pPr>
+      <w:r>
+        <w:drawing>
+          <wp:inline distT="0" distB="0" distL="0" distR="0">
+            <wp:extent cx="5120640" cy="3081063"/>
+            <wp:effectExtent t="0" r="0" b="0" l="0"/>
+            <wp:docPr id="31" name="s2_parquet.png" descr="Screenshot 4. Rows per monthly file and the CSV-versus-Parquet benchmark (notebook output)." title="Screenshot 4. Rows per monthly file and the CSV-versus-Parquet benchmark (notebook output)."/>
+            <wp:cNvGraphicFramePr>
+              <a:graphicFrameLocks xmlns:a="http://schemas.openxmlformats.org/drawingml/2006/main" noChangeAspect="1"/>
+            </wp:cNvGraphicFramePr>
+            <a:graphic xmlns:a="http://schemas.openxmlformats.org/drawingml/2006/main">
+              <a:graphicData uri="http://schemas.openxmlformats.org/drawingml/2006/picture">
+                <pic:pic xmlns:pic="http://schemas.openxmlformats.org/drawingml/2006/picture">
+                  <pic:nvPicPr>
+                    <pic:cNvPr id="0" name="" descr=""/>
+                    <pic:cNvPicPr>
+                      <a:picLocks noChangeAspect="1" noChangeArrowheads="1"/>
+                    </pic:cNvPicPr>
+                  </pic:nvPicPr>
+                  <pic:blipFill>
+                    <a:blip r:embed="rId17" cstate="none"/>
+                    <a:srcRect/>
+                    <a:stretch>
+                      <a:fillRect/>
+                    </a:stretch>
+                  </pic:blipFill>
+                  <pic:spPr bwMode="auto">
+                    <a:xfrm>
+                      <a:off x="0" y="0"/>
+                      <a:ext cx="5120640" cy="3081063"/>
+                    </a:xfrm>
+                    <a:prstGeom prst="rect">
+                      <a:avLst/>
+                    </a:prstGeom>
+                  </pic:spPr>
+                </pic:pic>
+              </a:graphicData>
+            </a:graphic>
+          </wp:inline>
+        </w:drawing>
+      </w:r>
+    </w:p>
+    <w:p>
+      <w:pPr>
+        <w:spacing w:after="200" w:before="60"/>
+        <w:jc w:val="center"/>
+      </w:pPr>
+      <w:r>
+        <w:rPr>
+          <w:rFonts w:ascii="Calibri" w:cs="Calibri" w:eastAsia="Calibri" w:hAnsi="Calibri"/>
+          <w:i/>
+          <w:iCs/>
+          <w:color w:val="595959"/>
+          <w:sz w:val="18"/>
+          <w:szCs w:val="18"/>
+        </w:rPr>
+        <w:t xml:space="preserve">Screenshot 4. Rows per monthly file and the CSV-versus-Parquet benchmark (notebook output).</w:t>
+      </w:r>
+    </w:p>
+    <w:p>
+      <w:pPr>
         <w:pStyle w:val="Heading2"/>
       </w:pPr>
       <w:bookmarkStart w:name="_Toc13" w:id="13"/>
@@ -2688,7 +3008,71 @@
         <w:rPr>
           <w:rFonts w:ascii="Calibri" w:cs="Calibri" w:eastAsia="Calibri" w:hAnsi="Calibri"/>
         </w:rPr>
-        <w:t xml:space="preserve">), as each iteration is a short, overhead-dominated job. On Dataproc or Databricks the notebook would run unchanged with more executors, and RAPIDS and XGBoost's Spark integration offer GPU acceleration (Chen &amp; Guestrin, 2016).</w:t>
+        <w:t xml:space="preserve">), as each iteration is a short, overhead-dominated job. On Dataproc or Databricks the notebook would run unchanged with more executors, and RAPIDS and XGBoost's Spark integration offer GPU acceleration (Chen &amp; Guestrin, 2016). Figure 7 plots both speed-ups against the ideal.</w:t>
+      </w:r>
+    </w:p>
+    <w:p>
+      <w:pPr>
+        <w:keepNext/>
+        <w:spacing w:before="120"/>
+        <w:jc w:val="center"/>
+      </w:pPr>
+      <w:r>
+        <w:drawing>
+          <wp:inline distT="0" distB="0" distL="0" distR="0">
+            <wp:extent cx="3840480" cy="2471209"/>
+            <wp:effectExtent t="0" r="0" b="0" l="0"/>
+            <wp:docPr id="32" name="14_scaling_experiment.png" descr="Figure 7. Exploratory speed-up from one to two local cores (single run)." title="Figure 7. Exploratory speed-up from one to two local cores (single run)."/>
+            <wp:cNvGraphicFramePr>
+              <a:graphicFrameLocks xmlns:a="http://schemas.openxmlformats.org/drawingml/2006/main" noChangeAspect="1"/>
+            </wp:cNvGraphicFramePr>
+            <a:graphic xmlns:a="http://schemas.openxmlformats.org/drawingml/2006/main">
+              <a:graphicData uri="http://schemas.openxmlformats.org/drawingml/2006/picture">
+                <pic:pic xmlns:pic="http://schemas.openxmlformats.org/drawingml/2006/picture">
+                  <pic:nvPicPr>
+                    <pic:cNvPr id="0" name="" descr=""/>
+                    <pic:cNvPicPr>
+                      <a:picLocks noChangeAspect="1" noChangeArrowheads="1"/>
+                    </pic:cNvPicPr>
+                  </pic:nvPicPr>
+                  <pic:blipFill>
+                    <a:blip r:embed="rId18" cstate="none"/>
+                    <a:srcRect/>
+                    <a:stretch>
+                      <a:fillRect/>
+                    </a:stretch>
+                  </pic:blipFill>
+                  <pic:spPr bwMode="auto">
+                    <a:xfrm>
+                      <a:off x="0" y="0"/>
+                      <a:ext cx="3840480" cy="2471209"/>
+                    </a:xfrm>
+                    <a:prstGeom prst="rect">
+                      <a:avLst/>
+                    </a:prstGeom>
+                  </pic:spPr>
+                </pic:pic>
+              </a:graphicData>
+            </a:graphic>
+          </wp:inline>
+        </w:drawing>
+      </w:r>
+    </w:p>
+    <w:p>
+      <w:pPr>
+        <w:spacing w:after="200" w:before="60"/>
+        <w:jc w:val="center"/>
+      </w:pPr>
+      <w:r>
+        <w:rPr>
+          <w:rFonts w:ascii="Calibri" w:cs="Calibri" w:eastAsia="Calibri" w:hAnsi="Calibri"/>
+          <w:i/>
+          <w:iCs/>
+          <w:color w:val="595959"/>
+          <w:sz w:val="18"/>
+          <w:szCs w:val="18"/>
+        </w:rPr>
+        <w:t xml:space="preserve">Figure 7. Exploratory speed-up from one to two local cores (single run).</w:t>
       </w:r>
     </w:p>
     <w:p>
@@ -2937,7 +3321,71 @@
         <w:rPr>
           <w:rFonts w:ascii="Calibri" w:cs="Calibri" w:eastAsia="Calibri" w:hAnsi="Calibri"/>
         </w:rPr>
-        <w:t xml:space="preserve"> (Micci-Barreca, 2001), TE = (n·mean + m·prior)/(n + m) with m = 100, fitted on the training split only.</w:t>
+        <w:t xml:space="preserve"> (Micci-Barreca, 2001), TE = (n·mean + m·prior)/(n + m) with m = 100, fitted on the training split only. Screenshot 5 shows the encoders and the leakage assertion passing.</w:t>
+      </w:r>
+    </w:p>
+    <w:p>
+      <w:pPr>
+        <w:keepNext/>
+        <w:spacing w:before="120"/>
+        <w:jc w:val="center"/>
+      </w:pPr>
+      <w:r>
+        <w:drawing>
+          <wp:inline distT="0" distB="0" distL="0" distR="0">
+            <wp:extent cx="5120640" cy="2864087"/>
+            <wp:effectExtent t="0" r="0" b="0" l="0"/>
+            <wp:docPr id="33" name="s5_encoding.png" descr="Screenshot 5. Smoothed target encoding fitted on the training split, and the leakage check (notebook output)." title="Screenshot 5. Smoothed target encoding fitted on the training split, and the leakage check (notebook output)."/>
+            <wp:cNvGraphicFramePr>
+              <a:graphicFrameLocks xmlns:a="http://schemas.openxmlformats.org/drawingml/2006/main" noChangeAspect="1"/>
+            </wp:cNvGraphicFramePr>
+            <a:graphic xmlns:a="http://schemas.openxmlformats.org/drawingml/2006/main">
+              <a:graphicData uri="http://schemas.openxmlformats.org/drawingml/2006/picture">
+                <pic:pic xmlns:pic="http://schemas.openxmlformats.org/drawingml/2006/picture">
+                  <pic:nvPicPr>
+                    <pic:cNvPr id="0" name="" descr=""/>
+                    <pic:cNvPicPr>
+                      <a:picLocks noChangeAspect="1" noChangeArrowheads="1"/>
+                    </pic:cNvPicPr>
+                  </pic:nvPicPr>
+                  <pic:blipFill>
+                    <a:blip r:embed="rId19" cstate="none"/>
+                    <a:srcRect/>
+                    <a:stretch>
+                      <a:fillRect/>
+                    </a:stretch>
+                  </pic:blipFill>
+                  <pic:spPr bwMode="auto">
+                    <a:xfrm>
+                      <a:off x="0" y="0"/>
+                      <a:ext cx="5120640" cy="2864087"/>
+                    </a:xfrm>
+                    <a:prstGeom prst="rect">
+                      <a:avLst/>
+                    </a:prstGeom>
+                  </pic:spPr>
+                </pic:pic>
+              </a:graphicData>
+            </a:graphic>
+          </wp:inline>
+        </w:drawing>
+      </w:r>
+    </w:p>
+    <w:p>
+      <w:pPr>
+        <w:spacing w:after="200" w:before="60"/>
+        <w:jc w:val="center"/>
+      </w:pPr>
+      <w:r>
+        <w:rPr>
+          <w:rFonts w:ascii="Calibri" w:cs="Calibri" w:eastAsia="Calibri" w:hAnsi="Calibri"/>
+          <w:i/>
+          <w:iCs/>
+          <w:color w:val="595959"/>
+          <w:sz w:val="18"/>
+          <w:szCs w:val="18"/>
+        </w:rPr>
+        <w:t xml:space="preserve">Screenshot 5. Smoothed target encoding fitted on the training split, and the leakage check (notebook output).</w:t>
       </w:r>
     </w:p>
     <w:p>
@@ -3026,7 +3474,71 @@
         <w:rPr>
           <w:rFonts w:ascii="Calibri" w:cs="Calibri" w:eastAsia="Calibri" w:hAnsi="Calibri"/>
         </w:rPr>
-        <w:t xml:space="preserve"> on validation to maximise F1.</w:t>
+        <w:t xml:space="preserve"> on validation to maximise F1. Figure 8 shows the validation F1 at each threshold: the peaks sit near 0.5 because the class weights already rebalance the models.</w:t>
+      </w:r>
+    </w:p>
+    <w:p>
+      <w:pPr>
+        <w:keepNext/>
+        <w:spacing w:before="120"/>
+        <w:jc w:val="center"/>
+      </w:pPr>
+      <w:r>
+        <w:drawing>
+          <wp:inline distT="0" distB="0" distL="0" distR="0">
+            <wp:extent cx="4572000" cy="2484521"/>
+            <wp:effectExtent t="0" r="0" b="0" l="0"/>
+            <wp:docPr id="34" name="10_threshold_tuning.png" descr="Figure 8. Validation F1 against the decision threshold; dots mark the chosen thresholds." title="Figure 8. Validation F1 against the decision threshold; dots mark the chosen thresholds."/>
+            <wp:cNvGraphicFramePr>
+              <a:graphicFrameLocks xmlns:a="http://schemas.openxmlformats.org/drawingml/2006/main" noChangeAspect="1"/>
+            </wp:cNvGraphicFramePr>
+            <a:graphic xmlns:a="http://schemas.openxmlformats.org/drawingml/2006/main">
+              <a:graphicData uri="http://schemas.openxmlformats.org/drawingml/2006/picture">
+                <pic:pic xmlns:pic="http://schemas.openxmlformats.org/drawingml/2006/picture">
+                  <pic:nvPicPr>
+                    <pic:cNvPr id="0" name="" descr=""/>
+                    <pic:cNvPicPr>
+                      <a:picLocks noChangeAspect="1" noChangeArrowheads="1"/>
+                    </pic:cNvPicPr>
+                  </pic:nvPicPr>
+                  <pic:blipFill>
+                    <a:blip r:embed="rId20" cstate="none"/>
+                    <a:srcRect/>
+                    <a:stretch>
+                      <a:fillRect/>
+                    </a:stretch>
+                  </pic:blipFill>
+                  <pic:spPr bwMode="auto">
+                    <a:xfrm>
+                      <a:off x="0" y="0"/>
+                      <a:ext cx="4572000" cy="2484521"/>
+                    </a:xfrm>
+                    <a:prstGeom prst="rect">
+                      <a:avLst/>
+                    </a:prstGeom>
+                  </pic:spPr>
+                </pic:pic>
+              </a:graphicData>
+            </a:graphic>
+          </wp:inline>
+        </w:drawing>
+      </w:r>
+    </w:p>
+    <w:p>
+      <w:pPr>
+        <w:spacing w:after="200" w:before="60"/>
+        <w:jc w:val="center"/>
+      </w:pPr>
+      <w:r>
+        <w:rPr>
+          <w:rFonts w:ascii="Calibri" w:cs="Calibri" w:eastAsia="Calibri" w:hAnsi="Calibri"/>
+          <w:i/>
+          <w:iCs/>
+          <w:color w:val="595959"/>
+          <w:sz w:val="18"/>
+          <w:szCs w:val="18"/>
+        </w:rPr>
+        <w:t xml:space="preserve">Figure 8. Validation F1 against the decision threshold; dots mark the chosen thresholds.</w:t>
       </w:r>
     </w:p>
     <w:p>
@@ -3183,7 +3695,7 @@
         <w:rPr>
           <w:rFonts w:ascii="Calibri" w:cs="Calibri" w:eastAsia="Calibri" w:hAnsi="Calibri"/>
         </w:rPr>
-        <w:t xml:space="preserve"> add trees sequentially, each correcting the last. Each was tuned with CrossValidator (3-fold, PR-AUC) on a training sample (Table 2) and refitted on the full training sample. The target encoders were fitted on the whole training split before cross-validation, so the held-out folds were not fully independent of the encoding; CV scores may be slightly optimistic, although the test set was not affected.</w:t>
+        <w:t xml:space="preserve"> add trees sequentially, each correcting the last. Each was tuned with CrossValidator (3-fold, PR-AUC) on a training sample (Table 2, Screenshot 6) and refitted on the full training sample. The target encoders were fitted on the whole training split before cross-validation, so the held-out folds were not fully independent of the encoding; CV scores may be slightly optimistic, although the test set was not affected.</w:t>
       </w:r>
     </w:p>
     <w:tbl>
@@ -3789,6 +4301,70 @@
           <w:szCs w:val="18"/>
         </w:rPr>
         <w:t xml:space="preserve">Table 2. Hyperparameter grids (searched on a 5% training sample), selected values and mean cross-validated PR-AUC.</w:t>
+      </w:r>
+    </w:p>
+    <w:p>
+      <w:pPr>
+        <w:keepNext/>
+        <w:spacing w:before="120"/>
+        <w:jc w:val="center"/>
+      </w:pPr>
+      <w:r>
+        <w:drawing>
+          <wp:inline distT="0" distB="0" distL="0" distR="0">
+            <wp:extent cx="5120640" cy="2994273"/>
+            <wp:effectExtent t="0" r="0" b="0" l="0"/>
+            <wp:docPr id="35" name="s6_tuning.png" descr="Screenshot 6. Three-fold cross-validation output: the selected settings and mean CV PR-AUC per model (notebook output)." title="Screenshot 6. Three-fold cross-validation output: the selected settings and mean CV PR-AUC per model (notebook output)."/>
+            <wp:cNvGraphicFramePr>
+              <a:graphicFrameLocks xmlns:a="http://schemas.openxmlformats.org/drawingml/2006/main" noChangeAspect="1"/>
+            </wp:cNvGraphicFramePr>
+            <a:graphic xmlns:a="http://schemas.openxmlformats.org/drawingml/2006/main">
+              <a:graphicData uri="http://schemas.openxmlformats.org/drawingml/2006/picture">
+                <pic:pic xmlns:pic="http://schemas.openxmlformats.org/drawingml/2006/picture">
+                  <pic:nvPicPr>
+                    <pic:cNvPr id="0" name="" descr=""/>
+                    <pic:cNvPicPr>
+                      <a:picLocks noChangeAspect="1" noChangeArrowheads="1"/>
+                    </pic:cNvPicPr>
+                  </pic:nvPicPr>
+                  <pic:blipFill>
+                    <a:blip r:embed="rId21" cstate="none"/>
+                    <a:srcRect/>
+                    <a:stretch>
+                      <a:fillRect/>
+                    </a:stretch>
+                  </pic:blipFill>
+                  <pic:spPr bwMode="auto">
+                    <a:xfrm>
+                      <a:off x="0" y="0"/>
+                      <a:ext cx="5120640" cy="2994273"/>
+                    </a:xfrm>
+                    <a:prstGeom prst="rect">
+                      <a:avLst/>
+                    </a:prstGeom>
+                  </pic:spPr>
+                </pic:pic>
+              </a:graphicData>
+            </a:graphic>
+          </wp:inline>
+        </w:drawing>
+      </w:r>
+    </w:p>
+    <w:p>
+      <w:pPr>
+        <w:spacing w:after="200" w:before="60"/>
+        <w:jc w:val="center"/>
+      </w:pPr>
+      <w:r>
+        <w:rPr>
+          <w:rFonts w:ascii="Calibri" w:cs="Calibri" w:eastAsia="Calibri" w:hAnsi="Calibri"/>
+          <w:i/>
+          <w:iCs/>
+          <w:color w:val="595959"/>
+          <w:sz w:val="18"/>
+          <w:szCs w:val="18"/>
+        </w:rPr>
+        <w:t xml:space="preserve">Screenshot 6. Three-fold cross-validation output: the selected settings and mean CV PR-AUC per model (notebook output).</w:t>
       </w:r>
     </w:p>
     <w:p>
@@ -5411,7 +5987,7 @@
           <wp:inline distT="0" distB="0" distL="0" distR="0">
             <wp:extent cx="5669280" cy="2819048"/>
             <wp:effectExtent t="0" r="0" b="0" l="0"/>
-            <wp:docPr id="17" name="06_model_metrics.png" descr="Figure 6. Test-set metrics for the three models; the dashed line is the majority-class accuracy." title="Figure 6. Test-set metrics for the three models; the dashed line is the majority-class accuracy."/>
+            <wp:docPr id="36" name="06_model_metrics.png" descr="Figure 9. Test-set metrics for the three models; the dashed line is the majority-class accuracy." title="Figure 9. Test-set metrics for the three models; the dashed line is the majority-class accuracy."/>
             <wp:cNvGraphicFramePr>
               <a:graphicFrameLocks xmlns:a="http://schemas.openxmlformats.org/drawingml/2006/main" noChangeAspect="1"/>
             </wp:cNvGraphicFramePr>
@@ -5425,7 +6001,7 @@
                     </pic:cNvPicPr>
                   </pic:nvPicPr>
                   <pic:blipFill>
-                    <a:blip r:embed="rId13" cstate="none"/>
+                    <a:blip r:embed="rId22" cstate="none"/>
                     <a:srcRect/>
                     <a:stretch>
                       <a:fillRect/>
@@ -5461,7 +6037,7 @@
           <w:sz w:val="18"/>
           <w:szCs w:val="18"/>
         </w:rPr>
-        <w:t xml:space="preserve">Figure 6. Test-set metrics for the three models; the dashed line is the majority-class accuracy.</w:t>
+        <w:t xml:space="preserve">Figure 9. Test-set metrics for the three models; the dashed line is the majority-class accuracy.</w:t>
       </w:r>
     </w:p>
     <w:p>
@@ -5475,7 +6051,7 @@
           <wp:inline distT="0" distB="0" distL="0" distR="0">
             <wp:extent cx="5669280" cy="2129529"/>
             <wp:effectExtent t="0" r="0" b="0" l="0"/>
-            <wp:docPr id="18" name="08_roc_pr_curves.png" descr="Figure 7. ROC and precision-recall curves on the test set." title="Figure 7. ROC and precision-recall curves on the test set."/>
+            <wp:docPr id="37" name="08_roc_pr_curves.png" descr="Figure 10. ROC and precision-recall curves on the test set." title="Figure 10. ROC and precision-recall curves on the test set."/>
             <wp:cNvGraphicFramePr>
               <a:graphicFrameLocks xmlns:a="http://schemas.openxmlformats.org/drawingml/2006/main" noChangeAspect="1"/>
             </wp:cNvGraphicFramePr>
@@ -5489,7 +6065,7 @@
                     </pic:cNvPicPr>
                   </pic:nvPicPr>
                   <pic:blipFill>
-                    <a:blip r:embed="rId14" cstate="none"/>
+                    <a:blip r:embed="rId23" cstate="none"/>
                     <a:srcRect/>
                     <a:stretch>
                       <a:fillRect/>
@@ -5525,7 +6101,7 @@
           <w:sz w:val="18"/>
           <w:szCs w:val="18"/>
         </w:rPr>
-        <w:t xml:space="preserve">Figure 7. ROC and precision-recall curves on the test set.</w:t>
+        <w:t xml:space="preserve">Figure 10. ROC and precision-recall curves on the test set.</w:t>
       </w:r>
     </w:p>
     <w:p>
@@ -5539,7 +6115,7 @@
           <wp:inline distT="0" distB="0" distL="0" distR="0">
             <wp:extent cx="5669280" cy="1638776"/>
             <wp:effectExtent t="0" r="0" b="0" l="0"/>
-            <wp:docPr id="19" name="09_confusion_matrices.png" descr="Figure 8. Confusion matrices at each model's validation-tuned threshold." title="Figure 8. Confusion matrices at each model's validation-tuned threshold."/>
+            <wp:docPr id="38" name="09_confusion_matrices.png" descr="Figure 11. Confusion matrices at each model's validation-tuned threshold." title="Figure 11. Confusion matrices at each model's validation-tuned threshold."/>
             <wp:cNvGraphicFramePr>
               <a:graphicFrameLocks xmlns:a="http://schemas.openxmlformats.org/drawingml/2006/main" noChangeAspect="1"/>
             </wp:cNvGraphicFramePr>
@@ -5553,7 +6129,7 @@
                     </pic:cNvPicPr>
                   </pic:nvPicPr>
                   <pic:blipFill>
-                    <a:blip r:embed="rId15" cstate="none"/>
+                    <a:blip r:embed="rId24" cstate="none"/>
                     <a:srcRect/>
                     <a:stretch>
                       <a:fillRect/>
@@ -5589,7 +6165,7 @@
           <w:sz w:val="18"/>
           <w:szCs w:val="18"/>
         </w:rPr>
-        <w:t xml:space="preserve">Figure 8. Confusion matrices at each model's validation-tuned threshold.</w:t>
+        <w:t xml:space="preserve">Figure 11. Confusion matrices at each model's validation-tuned threshold.</w:t>
       </w:r>
     </w:p>
     <w:p>
@@ -5603,7 +6179,7 @@
           <wp:inline distT="0" distB="0" distL="0" distR="0">
             <wp:extent cx="4389120" cy="1706880"/>
             <wp:effectExtent t="0" r="0" b="0" l="0"/>
-            <wp:docPr id="20" name="07_training_time.png" descr="Figure 9. Training time on the training sample." title="Figure 9. Training time on the training sample."/>
+            <wp:docPr id="39" name="07_training_time.png" descr="Figure 12. Training time on the training sample." title="Figure 12. Training time on the training sample."/>
             <wp:cNvGraphicFramePr>
               <a:graphicFrameLocks xmlns:a="http://schemas.openxmlformats.org/drawingml/2006/main" noChangeAspect="1"/>
             </wp:cNvGraphicFramePr>
@@ -5617,7 +6193,7 @@
                     </pic:cNvPicPr>
                   </pic:nvPicPr>
                   <pic:blipFill>
-                    <a:blip r:embed="rId16" cstate="none"/>
+                    <a:blip r:embed="rId25" cstate="none"/>
                     <a:srcRect/>
                     <a:stretch>
                       <a:fillRect/>
@@ -5653,7 +6229,7 @@
           <w:sz w:val="18"/>
           <w:szCs w:val="18"/>
         </w:rPr>
-        <w:t xml:space="preserve">Figure 9. Training time on the training sample.</w:t>
+        <w:t xml:space="preserve">Figure 12. Training time on the training sample.</w:t>
       </w:r>
     </w:p>
     <w:p>
@@ -5665,7 +6241,7 @@
         <w:rPr>
           <w:rFonts w:ascii="Calibri" w:cs="Calibri" w:eastAsia="Calibri" w:hAnsi="Calibri"/>
         </w:rPr>
-        <w:t xml:space="preserve">Figure 7 adds two details. The ROC curves never cross, so the ranking of the models holds at every threshold. The precision-recall curves show that for the riskiest 5 to 10% of flights the tree models are right 80 to 90% of the time, against about 55% for Logistic Regression, so a short high-risk list from GBT would be quite reliable. Figure 8 shows the cost of the chosen threshold: GBT flags about a third of all flights and raises about 1.5 false alarms for every delay it catches.</w:t>
+        <w:t xml:space="preserve">Figure 10 adds two details. The ROC curves never cross, so the ranking of the models holds at every threshold. The precision-recall curves show that for the riskiest 5 to 10% of flights the tree models are right 80 to 90% of the time, against about 55% for Logistic Regression, so a short high-risk list from GBT would be quite reliable. Figure 11 shows the cost of the chosen threshold: GBT flags about a third of all flights and raises about 1.5 false alarms for every delay it catches.</w:t>
       </w:r>
     </w:p>
     <w:p>
@@ -6640,7 +7216,7 @@
         <w:rPr>
           <w:rFonts w:ascii="Calibri" w:cs="Calibri" w:eastAsia="Calibri" w:hAnsi="Calibri"/>
         </w:rPr>
-        <w:t xml:space="preserve">Figure 10 shows the most important features; in GBT the top three were </w:t>
+        <w:t xml:space="preserve">Figure 13 shows the most important features; in GBT the top three were </w:t>
       </w:r>
       <w:r>
         <w:rPr>
@@ -6676,7 +7252,7 @@
         <w:rPr>
           <w:rFonts w:ascii="Calibri" w:cs="Calibri" w:eastAsia="Calibri" w:hAnsi="Calibri"/>
         </w:rPr>
-        <w:t xml:space="preserve">. Because impurity importance can favour continuous features, I also ran a permutation test (Figure 11). It partly agrees: the origin-airport-by-hour delay rate (TE_ORIGIN_HOUR) and the scheduled turnaround matter most. Importance does not establish causation.</w:t>
+        <w:t xml:space="preserve">. Because impurity importance can favour continuous features, I also ran a permutation test (Figure 14). It partly agrees: the origin-airport-by-hour delay rate (TE_ORIGIN_HOUR) and the scheduled turnaround matter most. Importance does not establish causation.</w:t>
       </w:r>
     </w:p>
     <w:p>
@@ -6690,7 +7266,7 @@
           <wp:inline distT="0" distB="0" distL="0" distR="0">
             <wp:extent cx="5669280" cy="2054638"/>
             <wp:effectExtent t="0" r="0" b="0" l="0"/>
-            <wp:docPr id="21" name="11_feature_importance.png" descr="Figure 10. Top features: Logistic Regression coefficients (left), Random Forest and GBT importances." title="Figure 10. Top features: Logistic Regression coefficients (left), Random Forest and GBT importances."/>
+            <wp:docPr id="40" name="11_feature_importance.png" descr="Figure 13. Top features: Logistic Regression coefficients (left), Random Forest and GBT importances." title="Figure 13. Top features: Logistic Regression coefficients (left), Random Forest and GBT importances."/>
             <wp:cNvGraphicFramePr>
               <a:graphicFrameLocks xmlns:a="http://schemas.openxmlformats.org/drawingml/2006/main" noChangeAspect="1"/>
             </wp:cNvGraphicFramePr>
@@ -6704,7 +7280,7 @@
                     </pic:cNvPicPr>
                   </pic:nvPicPr>
                   <pic:blipFill>
-                    <a:blip r:embed="rId17" cstate="none"/>
+                    <a:blip r:embed="rId26" cstate="none"/>
                     <a:srcRect/>
                     <a:stretch>
                       <a:fillRect/>
@@ -6740,7 +7316,7 @@
           <w:sz w:val="18"/>
           <w:szCs w:val="18"/>
         </w:rPr>
-        <w:t xml:space="preserve">Figure 10. Top features: Logistic Regression coefficients (left), Random Forest and GBT importances.</w:t>
+        <w:t xml:space="preserve">Figure 13. Top features: Logistic Regression coefficients (left), Random Forest and GBT importances.</w:t>
       </w:r>
     </w:p>
     <w:p>
@@ -6754,7 +7330,7 @@
           <wp:inline distT="0" distB="0" distL="0" distR="0">
             <wp:extent cx="4206240" cy="2163497"/>
             <wp:effectExtent t="0" r="0" b="0" l="0"/>
-            <wp:docPr id="22" name="12_gbt_permutation_importance.png" descr="Figure 11. GBT permutation importance: drop in test ROC-AUC when each feature is shuffled." title="Figure 11. GBT permutation importance: drop in test ROC-AUC when each feature is shuffled."/>
+            <wp:docPr id="41" name="12_gbt_permutation_importance.png" descr="Figure 14. GBT permutation importance: drop in test ROC-AUC when each feature is shuffled." title="Figure 14. GBT permutation importance: drop in test ROC-AUC when each feature is shuffled."/>
             <wp:cNvGraphicFramePr>
               <a:graphicFrameLocks xmlns:a="http://schemas.openxmlformats.org/drawingml/2006/main" noChangeAspect="1"/>
             </wp:cNvGraphicFramePr>
@@ -6768,7 +7344,7 @@
                     </pic:cNvPicPr>
                   </pic:nvPicPr>
                   <pic:blipFill>
-                    <a:blip r:embed="rId18" cstate="none"/>
+                    <a:blip r:embed="rId27" cstate="none"/>
                     <a:srcRect/>
                     <a:stretch>
                       <a:fillRect/>
@@ -6804,7 +7380,7 @@
           <w:sz w:val="18"/>
           <w:szCs w:val="18"/>
         </w:rPr>
-        <w:t xml:space="preserve">Figure 11. GBT permutation importance: drop in test ROC-AUC when each feature is shuffled.</w:t>
+        <w:t xml:space="preserve">Figure 14. GBT permutation importance: drop in test ROC-AUC when each feature is shuffled.</w:t>
       </w:r>
     </w:p>
     <w:p>
@@ -7578,6 +8154,70 @@
     </w:p>
     <w:p>
       <w:pPr>
+        <w:keepNext/>
+        <w:spacing w:before="120"/>
+        <w:jc w:val="center"/>
+      </w:pPr>
+      <w:r>
+        <w:drawing>
+          <wp:inline distT="0" distB="0" distL="0" distR="0">
+            <wp:extent cx="4572000" cy="2313134"/>
+            <wp:effectExtent t="0" r="0" b="0" l="0"/>
+            <wp:docPr id="42" name="13_random_vs_temporal.png" descr="Figure 15. ROC-AUC on the random test split versus the temporal test (October to December)." title="Figure 15. ROC-AUC on the random test split versus the temporal test (October to December)."/>
+            <wp:cNvGraphicFramePr>
+              <a:graphicFrameLocks xmlns:a="http://schemas.openxmlformats.org/drawingml/2006/main" noChangeAspect="1"/>
+            </wp:cNvGraphicFramePr>
+            <a:graphic xmlns:a="http://schemas.openxmlformats.org/drawingml/2006/main">
+              <a:graphicData uri="http://schemas.openxmlformats.org/drawingml/2006/picture">
+                <pic:pic xmlns:pic="http://schemas.openxmlformats.org/drawingml/2006/picture">
+                  <pic:nvPicPr>
+                    <pic:cNvPr id="0" name="" descr=""/>
+                    <pic:cNvPicPr>
+                      <a:picLocks noChangeAspect="1" noChangeArrowheads="1"/>
+                    </pic:cNvPicPr>
+                  </pic:nvPicPr>
+                  <pic:blipFill>
+                    <a:blip r:embed="rId28" cstate="none"/>
+                    <a:srcRect/>
+                    <a:stretch>
+                      <a:fillRect/>
+                    </a:stretch>
+                  </pic:blipFill>
+                  <pic:spPr bwMode="auto">
+                    <a:xfrm>
+                      <a:off x="0" y="0"/>
+                      <a:ext cx="4572000" cy="2313134"/>
+                    </a:xfrm>
+                    <a:prstGeom prst="rect">
+                      <a:avLst/>
+                    </a:prstGeom>
+                  </pic:spPr>
+                </pic:pic>
+              </a:graphicData>
+            </a:graphic>
+          </wp:inline>
+        </w:drawing>
+      </w:r>
+    </w:p>
+    <w:p>
+      <w:pPr>
+        <w:spacing w:after="200" w:before="60"/>
+        <w:jc w:val="center"/>
+      </w:pPr>
+      <w:r>
+        <w:rPr>
+          <w:rFonts w:ascii="Calibri" w:cs="Calibri" w:eastAsia="Calibri" w:hAnsi="Calibri"/>
+          <w:i/>
+          <w:iCs/>
+          <w:color w:val="595959"/>
+          <w:sz w:val="18"/>
+          <w:szCs w:val="18"/>
+        </w:rPr>
+        <w:t xml:space="preserve">Figure 15. ROC-AUC on the random test split versus the temporal test (October to December).</w:t>
+      </w:r>
+    </w:p>
+    <w:p>
+      <w:pPr>
         <w:pStyle w:val="Heading1"/>
       </w:pPr>
       <w:bookmarkStart w:name="_Toc19" w:id="19"/>
@@ -7610,7 +8250,7 @@
         <w:rPr>
           <w:rFonts w:ascii="Calibri" w:cs="Calibri" w:eastAsia="Calibri" w:hAnsi="Calibri"/>
         </w:rPr>
-        <w:t xml:space="preserve"> accuracy, so F1, recall and PR-AUC are more informative here. Second, the threshold is a business decision: spare-crew planning can accept more false alarms to catch more delays, while a passenger alert needs higher precision.</w:t>
+        <w:t xml:space="preserve"> accuracy, so F1, recall and PR-AUC are more informative. Second, the threshold is a business decision: spare-crew planning tolerates false alarms, while passenger alerts need precision.</w:t>
       </w:r>
     </w:p>
     <w:p>
@@ -7622,7 +8262,7 @@
         <w:rPr>
           <w:rFonts w:ascii="Calibri" w:cs="Calibri" w:eastAsia="Calibri" w:hAnsi="Calibri"/>
         </w:rPr>
-        <w:t xml:space="preserve">I consider the temporal test more relevant to practical use because it evaluates the models on later months excluded from training. ROC-AUC fell to </w:t>
+        <w:t xml:space="preserve">I consider the temporal test (Table 5, Figure 15) more relevant to practical use because it evaluates the models on later months excluded from training. ROC-AUC fell to </w:t>
       </w:r>
       <w:r>
         <w:rPr>
@@ -7912,7 +8552,7 @@
         <w:rPr>
           <w:rFonts w:ascii="Calibri" w:cs="Calibri" w:eastAsia="Calibri" w:hAnsi="Calibri"/>
         </w:rPr>
-        <w:t xml:space="preserve">The main things I learnt were about evaluation rather than algorithms. Accuracy was misleading on its own, since predicting "on time" for every flight beats every model on it. Leakage was harder to avoid than I expected: excluding post-flight columns was easy, but subtler issues, such as counting flights after removing cancellations or fitting encoders before cross-validation, only became clear on closer inspection. The temporal test also changed my view of which model is best. Practically, my first full run stopped after more than three hours, which taught me to checkpoint results, and a difference in how Spark 3.5 and 4.0 order feature metadata shifted my feature-importance labels until a chart that did not make sense was investigated.</w:t>
+        <w:t xml:space="preserve">The main things I learnt were about evaluation rather than algorithms. Accuracy was misleading on its own, since predicting "on time" for every flight beats every model on it. Leakage was harder to avoid than I expected: subtle issues, such as counting flights after removing cancellations or fitting encoders before cross-validation, only became clear on closer inspection. The temporal test changed my view of which model is best, and a stopped three-hour run and a Spark version difference in feature metadata taught me to checkpoint results and check outputs that look wrong.</w:t>
       </w:r>
     </w:p>
     <w:p>
@@ -7949,7 +8589,7 @@
         <w:rPr>
           <w:rFonts w:ascii="Calibri" w:cs="Calibri" w:eastAsia="Calibri" w:hAnsi="Calibri"/>
         </w:rPr>
-        <w:t xml:space="preserve"> flights from 2025 that excludes post-flight information. On the random test split, </w:t>
+        <w:t xml:space="preserve"> flights from 2025 that excludes post-flight information. On the random split, </w:t>
       </w:r>
       <w:r>
         <w:rPr>
@@ -7973,7 +8613,7 @@
         <w:rPr>
           <w:rFonts w:ascii="Calibri" w:cs="Calibri" w:eastAsia="Calibri" w:hAnsi="Calibri"/>
         </w:rPr>
-        <w:t xml:space="preserve">) and ROC-AUC, while on later, unseen months Random Forest had the higher F1 and GBT a slightly higher ROC-AUC, so the choice of model depends on how it will be used. Parquet, broadcast joins and in-Spark evaluation made a full year workable on free Colab.</w:t>
+        <w:t xml:space="preserve">) and ROC-AUC; on later, unseen months Random Forest had the higher F1, so the choice of model depends on how it will be used. Parquet, broadcast joins and in-Spark evaluation made a full year workable on free Colab.</w:t>
       </w:r>
     </w:p>
     <w:p>
@@ -8927,7 +9567,7 @@
                 <w:sz w:val="18"/>
                 <w:szCs w:val="18"/>
               </w:rPr>
-              <w:t xml:space="preserve">Exploratory analysis (Figures 1–3 and supporting tables)</w:t>
+              <w:t xml:space="preserve">Exploratory analysis (Figures 1–4 and supporting tables)</w:t>
             </w:r>
           </w:p>
         </w:tc>

</xml_diff>

<commit_message>
Add Gamma-formatted deck v4 (logo and slide 17 fixes); fill in name and student ID
Co-Authored-By: Claude Opus 5.5 <noreply@anthropic.com>
Claude-Session: https://claude.ai/code/session_013cmZjtFTpWtFMxYtK982h3
</commit_message>
<xml_diff>
--- a/bdmla-flight-delay/report/BDMLA_CW2_Part2_Flight_Delay_Report.docx
+++ b/bdmla-flight-delay/report/BDMLA_CW2_Part2_Flight_Delay_Report.docx
@@ -90,7 +90,7 @@
         <w:rPr>
           <w:rFonts w:ascii="Calibri" w:cs="Calibri" w:eastAsia="Calibri" w:hAnsi="Calibri"/>
         </w:rPr>
-        <w:t xml:space="preserve"> Kelvin Soh      </w:t>
+        <w:t xml:space="preserve"> Soh Chee Yong      </w:t>
       </w:r>
       <w:r>
         <w:rPr>
@@ -104,14 +104,7 @@
         <w:rPr>
           <w:rFonts w:ascii="Calibri" w:cs="Calibri" w:eastAsia="Calibri" w:hAnsi="Calibri"/>
         </w:rPr>
-        <w:t xml:space="preserve"> </w:t>
-      </w:r>
-      <w:r>
-        <w:rPr>
-          <w:rFonts w:ascii="Calibri" w:cs="Calibri" w:eastAsia="Calibri" w:hAnsi="Calibri"/>
-          <w:highlight w:val="yellow"/>
-        </w:rPr>
-        <w:t xml:space="preserve">[STUDENT_ID]</w:t>
+        <w:t xml:space="preserve"> UP2653853</w:t>
       </w:r>
     </w:p>
     <w:p>

</xml_diff>